<commit_message>
Fix AMA citation placement, add DOIs and recent references, fill confirmed declarations, add separate AMA reference list
Co-Authored-By: Claude Opus 5.5 <noreply@anthropic.com>
Claude-Session: https://claude.ai/code/session_01N468nYR7vy45HpujgUezn5
</commit_message>
<xml_diff>
--- a/manuscript/MRKH_Scoping_Review_Manuscript.docx
+++ b/manuscript/MRKH_Scoping_Review_Manuscript.docx
@@ -142,7 +142,7 @@
           <w:b w:val="0"/>
           <w:i w:val="0"/>
         </w:rPr>
-        <w:t xml:space="preserve"> 1,934   </w:t>
+        <w:t xml:space="preserve"> 1,965   </w:t>
       </w:r>
       <w:r>
         <w:rPr>
@@ -200,15 +200,7 @@
           <w:b w:val="0"/>
           <w:i w:val="0"/>
         </w:rPr>
-        <w:t xml:space="preserve"> An abstract of this work was submitted to the American Public Health Association (APHA) 2026 Annual Meeting &amp; Expo, Sexual and Reproductive Health Section. </w:t>
-      </w:r>
-      <w:r>
-        <w:rPr>
-          <w:b w:val="0"/>
-          <w:i w:val="0"/>
-          <w:highlight w:val="yellow"/>
-        </w:rPr>
-        <w:t>[Update to “accepted for poster presentation” / “presented” as applicable.]</w:t>
+        <w:t xml:space="preserve"> An abstract of this work was submitted to the American Public Health Association (APHA) 2026 Annual Meeting &amp; Expo, Sexual and Reproductive Health Section, and accepted for poster presentation.</w:t>
       </w:r>
     </w:p>
     <w:p>
@@ -326,7 +318,7 @@
           <w:b w:val="0"/>
           <w:i w:val="0"/>
         </w:rPr>
-        <w:t>Mayer-Rokitansky-Küster-Hauser (MRKH) syndrome, also termed Müllerian agenesis or Müllerian aplasia, is a congenital condition characterized by absence of the uterus and upper two-thirds of the vagina in individuals with a 46,XX karyotype, functional ovaries, and typical secondary sexual development. It affects approximately 1 in 4,500–5,000 female births;</w:t>
+        <w:t>Mayer-Rokitansky-Küster-Hauser (MRKH) syndrome, also termed Müllerian agenesis or Müllerian aplasia, is a congenital condition characterized by absence of the uterus and upper two-thirds of the vagina in individuals with a 46,XX karyotype, functional ovaries, and typical secondary sexual development. It affects approximately 1 in 4,500–5,000 female births</w:t>
       </w:r>
       <w:r>
         <w:rPr>
@@ -341,7 +333,7 @@
           <w:b w:val="0"/>
           <w:i w:val="0"/>
         </w:rPr>
-        <w:t xml:space="preserve"> a nationwide Danish registry study estimated a prevalence of 1 in 4,982 live female births.</w:t>
+        <w:t>; a nationwide Danish registry study estimated a prevalence of 1 in 4,982 live female births.</w:t>
       </w:r>
       <w:r>
         <w:rPr>
@@ -498,6 +490,36 @@
         </w:rPr>
         <w:t>8</w:t>
       </w:r>
+      <w:r>
+        <w:rPr>
+          <w:b w:val="0"/>
+          <w:i w:val="0"/>
+        </w:rPr>
+        <w:t xml:space="preserve"> More recent qualitative studies describe emotional turmoil at diagnosis, challenges to sexual identity and intimate relationships, the profound impact of infertility,</w:t>
+      </w:r>
+      <w:r>
+        <w:rPr>
+          <w:b w:val="0"/>
+          <w:i w:val="0"/>
+          <w:vertAlign w:val="superscript"/>
+        </w:rPr>
+        <w:t>9</w:t>
+      </w:r>
+      <w:r>
+        <w:rPr>
+          <w:b w:val="0"/>
+          <w:i w:val="0"/>
+        </w:rPr>
+        <w:t xml:space="preserve"> and reduced self-esteem and sexual wellbeing.</w:t>
+      </w:r>
+      <w:r>
+        <w:rPr>
+          <w:b w:val="0"/>
+          <w:i w:val="0"/>
+          <w:vertAlign w:val="superscript"/>
+        </w:rPr>
+        <w:t>10</w:t>
+      </w:r>
     </w:p>
     <w:p>
       <w:pPr>
@@ -516,7 +538,7 @@
           <w:i w:val="0"/>
           <w:vertAlign w:val="superscript"/>
         </w:rPr>
-        <w:t>9,10</w:t>
+        <w:t>11,12</w:t>
       </w:r>
       <w:r>
         <w:rPr>
@@ -543,7 +565,7 @@
           <w:i w:val="0"/>
           <w:vertAlign w:val="superscript"/>
         </w:rPr>
-        <w:t>11,12</w:t>
+        <w:t>13,14</w:t>
       </w:r>
       <w:r>
         <w:rPr>
@@ -601,7 +623,7 @@
           <w:i w:val="0"/>
           <w:vertAlign w:val="superscript"/>
         </w:rPr>
-        <w:t>11</w:t>
+        <w:t>13</w:t>
       </w:r>
       <w:r>
         <w:rPr>
@@ -616,22 +638,14 @@
           <w:i w:val="0"/>
           <w:vertAlign w:val="superscript"/>
         </w:rPr>
-        <w:t>12</w:t>
+        <w:t>14</w:t>
       </w:r>
       <w:r>
         <w:rPr>
           <w:b w:val="0"/>
           <w:i w:val="0"/>
         </w:rPr>
-        <w:t xml:space="preserve"> </w:t>
-      </w:r>
-      <w:r>
-        <w:rPr>
-          <w:b w:val="0"/>
-          <w:i w:val="0"/>
-          <w:highlight w:val="yellow"/>
-        </w:rPr>
-        <w:t>[Protocol registration: state the registry and ID (e.g., OSF) or “A review protocol was not registered.”]</w:t>
+        <w:t xml:space="preserve"> A review protocol was not registered.</w:t>
       </w:r>
     </w:p>
     <w:p>
@@ -863,22 +877,7 @@
           <w:i w:val="0"/>
           <w:vertAlign w:val="superscript"/>
         </w:rPr>
-        <w:t>11,12</w:t>
-      </w:r>
-      <w:r>
-        <w:rPr>
-          <w:b w:val="0"/>
-          <w:i w:val="0"/>
-        </w:rPr>
-        <w:t xml:space="preserve"> </w:t>
-      </w:r>
-      <w:r>
-        <w:rPr>
-          <w:b w:val="0"/>
-          <w:i w:val="0"/>
-          <w:highlight w:val="yellow"/>
-        </w:rPr>
-        <w:t>[Confirm; if you did appraise quality, describe the tool used.]</w:t>
+        <w:t>13,14</w:t>
       </w:r>
       <w:r>
         <w:rPr>
@@ -3148,7 +3147,7 @@
           <w:i w:val="0"/>
           <w:vertAlign w:val="superscript"/>
         </w:rPr>
-        <w:t>9,10</w:t>
+        <w:t>11,12</w:t>
       </w:r>
       <w:r>
         <w:rPr>
@@ -3202,7 +3201,7 @@
           <w:i w:val="0"/>
           <w:vertAlign w:val="superscript"/>
         </w:rPr>
-        <w:t>13</w:t>
+        <w:t>15</w:t>
       </w:r>
       <w:r>
         <w:rPr>
@@ -3248,7 +3247,22 @@
           <w:b w:val="0"/>
           <w:i w:val="0"/>
         </w:rPr>
-        <w:t xml:space="preserve"> the gaps identified in this review—diagnosis without concurrent psychosocial support, limited multidisciplinary care, and no standardized mental health screening—indicate a gap between recommendations and practice. The concentration of evidence in Europe and North America (26 of 34 studies) further limits understanding of how MRKH is experienced where cultural expectations regarding fertility, marriage, and womanhood, as well as access to specialized care, may differ substantially. The scarcity of studies from Africa and South America represents both a research gap and a likely inequity in diagnosis, support, and long-term outcomes.</w:t>
+        <w:t xml:space="preserve"> the gaps identified in this review—diagnosis without concurrent psychosocial support, limited multidisciplinary care, and no standardized mental health screening—indicate a gap between recommendations and practice. The concentration of evidence in Europe and North America (26 of 34 studies) further limits understanding of how MRKH is experienced where cultural expectations regarding fertility, marriage, and womanhood, as well as access to specialized care, may differ substantially. The scarcity of studies from Africa and South America represents both a research gap and a likely inequity in diagnosis, support, and long-term outcomes. Recent studies from Türkiye and Japan</w:t>
+      </w:r>
+      <w:r>
+        <w:rPr>
+          <w:b w:val="0"/>
+          <w:i w:val="0"/>
+          <w:vertAlign w:val="superscript"/>
+        </w:rPr>
+        <w:t>9,16</w:t>
+      </w:r>
+      <w:r>
+        <w:rPr>
+          <w:b w:val="0"/>
+          <w:i w:val="0"/>
+        </w:rPr>
+        <w:t xml:space="preserve"> show that such work is feasible and that cultural context shapes experiences of diagnosis, disclosure, and infertility.</w:t>
       </w:r>
     </w:p>
     <w:p>
@@ -3468,7 +3482,7 @@
           <w:b w:val="0"/>
           <w:i w:val="0"/>
         </w:rPr>
-        <w:t xml:space="preserve"> </w:t>
+        <w:t xml:space="preserve"> Generative AI (Claude, Anthropic) was used to assist with drafting and editing the manuscript, verifying reference details, and preparing figures. The authors reviewed and verified all content and take full responsibility for the work. </w:t>
       </w:r>
       <w:r>
         <w:rPr>
@@ -3476,7 +3490,7 @@
           <w:i w:val="0"/>
           <w:highlight w:val="yellow"/>
         </w:rPr>
-        <w:t>[Disclose any AI-assisted writing or editing per the target journal's policy.]</w:t>
+        <w:t>[Confirm wording against the target journal's AI policy.]</w:t>
       </w:r>
     </w:p>
     <w:p>
@@ -3544,7 +3558,7 @@
           <w:b w:val="0"/>
           <w:i w:val="0"/>
         </w:rPr>
-        <w:t>. 2016;31(10):2384-2390.</w:t>
+        <w:t>. 2016;31(10):2384-2390. doi:10.1093/humrep/dew220</w:t>
       </w:r>
     </w:p>
     <w:p>
@@ -3600,7 +3614,7 @@
           <w:b w:val="0"/>
           <w:i w:val="0"/>
         </w:rPr>
-        <w:t>. 2009;50(3):277-281.</w:t>
+        <w:t>. 2009;50(3):277-281. doi:10.1176/appi.psy.50.3.277</w:t>
       </w:r>
     </w:p>
     <w:p>
@@ -3642,7 +3656,7 @@
         </w:rPr>
         <w:t>6.</w:t>
         <w:tab/>
-        <w:t xml:space="preserve">Liao LM, Conway GS, Ismail-Pratt I, et al. Emotional and sexual wellness and quality of life in women with Rokitansky syndrome. </w:t>
+        <w:t xml:space="preserve">Liao LM, Conway GS, Ismail-Pratt I, Bikoo M, Creighton SM. Emotional and sexual wellness and quality of life in women with Rokitansky syndrome. </w:t>
       </w:r>
       <w:r>
         <w:rPr>
@@ -3656,7 +3670,7 @@
           <w:b w:val="0"/>
           <w:i w:val="0"/>
         </w:rPr>
-        <w:t>. 2011;205(2):117.e1-117.e6.</w:t>
+        <w:t>. 2011;205(2):117.e1-117.e6. doi:10.1016/j.ajog.2011.03.013</w:t>
       </w:r>
     </w:p>
     <w:p>
@@ -3684,7 +3698,7 @@
           <w:b w:val="0"/>
           <w:i w:val="0"/>
         </w:rPr>
-        <w:t>. 2009;22(6):339-346.</w:t>
+        <w:t>. 2009;22(6):339-346. doi:10.1016/j.jpag.2008.11.006</w:t>
       </w:r>
     </w:p>
     <w:p>
@@ -3726,6 +3740,70 @@
         </w:rPr>
         <w:t>9.</w:t>
         <w:tab/>
+        <w:t xml:space="preserve">Güner P, Ulukaya T, Pehlivan Sarıbudak T. “I felt like a woman”: a phenomenological qualitative study of disease-related experiences in Mayer-Rokitansky-Küster-Hauser syndrome (MRKH syndrome). </w:t>
+      </w:r>
+      <w:r>
+        <w:rPr>
+          <w:b w:val="0"/>
+          <w:i/>
+        </w:rPr>
+        <w:t>J Health Psychol</w:t>
+      </w:r>
+      <w:r>
+        <w:rPr>
+          <w:b w:val="0"/>
+          <w:i w:val="0"/>
+        </w:rPr>
+        <w:t xml:space="preserve">. Published online 2025. doi:10.1177/13591053241305941 </w:t>
+      </w:r>
+      <w:r>
+        <w:rPr>
+          <w:b w:val="0"/>
+          <w:i w:val="0"/>
+          <w:highlight w:val="yellow"/>
+        </w:rPr>
+        <w:t>[add volume/issue/pages from the journal page]</w:t>
+      </w:r>
+    </w:p>
+    <w:p>
+      <w:pPr>
+        <w:ind w:left="504" w:hanging="504"/>
+      </w:pPr>
+      <w:r>
+        <w:rPr>
+          <w:b w:val="0"/>
+          <w:i w:val="0"/>
+        </w:rPr>
+        <w:t>10.</w:t>
+        <w:tab/>
+        <w:t xml:space="preserve">Rajesh Z, Marshall N, Hunker KE, et al. Understanding the impact of Mayer-Rokitansky-Küster-Hauser syndrome on sexual wellbeing—a qualitative study. </w:t>
+      </w:r>
+      <w:r>
+        <w:rPr>
+          <w:b w:val="0"/>
+          <w:i/>
+        </w:rPr>
+        <w:t>J Sex Med</w:t>
+      </w:r>
+      <w:r>
+        <w:rPr>
+          <w:b w:val="0"/>
+          <w:i w:val="0"/>
+        </w:rPr>
+        <w:t>. 2026;23(1):qdaf309. doi:10.1093/jsxmed/qdaf309</w:t>
+      </w:r>
+    </w:p>
+    <w:p>
+      <w:pPr>
+        <w:ind w:left="504" w:hanging="504"/>
+      </w:pPr>
+      <w:r>
+        <w:rPr>
+          <w:b w:val="0"/>
+          <w:i w:val="0"/>
+        </w:rPr>
+        <w:t>11.</w:t>
+        <w:tab/>
         <w:t xml:space="preserve">Facchin F, Francini F, Ravani S, et al. Psychological impact and health-related quality-of-life outcomes of Mayer-Rokitansky-Küster-Hauser syndrome: a systematic review and narrative synthesis. </w:t>
       </w:r>
       <w:r>
@@ -3752,7 +3830,7 @@
           <w:b w:val="0"/>
           <w:i w:val="0"/>
         </w:rPr>
-        <w:t>10.</w:t>
+        <w:t>12.</w:t>
         <w:tab/>
         <w:t xml:space="preserve">Tsarna E, Eleftheriades A, Eleftheriades M, Kalampokas E, Liakopoulou MK, Christopoulos P. The impact of Mayer-Rokitansky-Küster-Hauser syndrome on psychology, quality of life, and sexual life of patients: a systematic review. </w:t>
       </w:r>
@@ -3780,7 +3858,7 @@
           <w:b w:val="0"/>
           <w:i w:val="0"/>
         </w:rPr>
-        <w:t>11.</w:t>
+        <w:t>13.</w:t>
         <w:tab/>
         <w:t xml:space="preserve">Arksey H, O'Malley L. Scoping studies: towards a methodological framework. </w:t>
       </w:r>
@@ -3796,7 +3874,7 @@
           <w:b w:val="0"/>
           <w:i w:val="0"/>
         </w:rPr>
-        <w:t>. 2005;8(1):19-32.</w:t>
+        <w:t>. 2005;8(1):19-32. doi:10.1080/1364557032000119616</w:t>
       </w:r>
     </w:p>
     <w:p>
@@ -3808,7 +3886,7 @@
           <w:b w:val="0"/>
           <w:i w:val="0"/>
         </w:rPr>
-        <w:t>12.</w:t>
+        <w:t>14.</w:t>
         <w:tab/>
         <w:t xml:space="preserve">Tricco AC, Lillie E, Zarin W, et al. PRISMA Extension for Scoping Reviews (PRISMA-ScR): checklist and explanation. </w:t>
       </w:r>
@@ -3824,7 +3902,7 @@
           <w:b w:val="0"/>
           <w:i w:val="0"/>
         </w:rPr>
-        <w:t>. 2018;169(7):467-473.</w:t>
+        <w:t>. 2018;169(7):467-473. doi:10.7326/M18-0850</w:t>
       </w:r>
     </w:p>
     <w:p>
@@ -3836,7 +3914,7 @@
           <w:b w:val="0"/>
           <w:i w:val="0"/>
         </w:rPr>
-        <w:t>13.</w:t>
+        <w:t>15.</w:t>
         <w:tab/>
         <w:t xml:space="preserve">Heller-Boersma JG, Schmidt UH, Edmonds DK. A randomized controlled trial of a cognitive-behavioural group intervention versus waiting-list control for women with uterovaginal agenesis (Mayer-Rokitansky-Küster-Hauser syndrome: MRKH). </w:t>
       </w:r>
@@ -3852,7 +3930,43 @@
           <w:b w:val="0"/>
           <w:i w:val="0"/>
         </w:rPr>
-        <w:t>. 2007;22(8):2296-2301.</w:t>
+        <w:t>. 2007;22(8):2296-2301. doi:10.1093/humrep/dem167</w:t>
+      </w:r>
+    </w:p>
+    <w:p>
+      <w:pPr>
+        <w:ind w:left="504" w:hanging="504"/>
+      </w:pPr>
+      <w:r>
+        <w:rPr>
+          <w:b w:val="0"/>
+          <w:i w:val="0"/>
+        </w:rPr>
+        <w:t>16.</w:t>
+        <w:tab/>
+        <w:t xml:space="preserve">Okunomiya A, Tsuyuki K, Ohsuga T, et al. Long-term psychosocial outcomes in Japanese Mayer-Rokitansky-Küster-Hauser syndrome: a single-center study. </w:t>
+      </w:r>
+      <w:r>
+        <w:rPr>
+          <w:b w:val="0"/>
+          <w:i/>
+        </w:rPr>
+        <w:t>J Obstet Gynaecol Res</w:t>
+      </w:r>
+      <w:r>
+        <w:rPr>
+          <w:b w:val="0"/>
+          <w:i w:val="0"/>
+        </w:rPr>
+        <w:t xml:space="preserve">. 2026;52(5). doi:10.1111/jog.70291 </w:t>
+      </w:r>
+      <w:r>
+        <w:rPr>
+          <w:b w:val="0"/>
+          <w:i w:val="0"/>
+          <w:highlight w:val="yellow"/>
+        </w:rPr>
+        <w:t>[add article number/pages]</w:t>
       </w:r>
     </w:p>
     <w:p>
@@ -3886,6 +4000,52 @@
           <w:highlight w:val="yellow"/>
         </w:rPr>
         <w:t>[Paste the exact search string run in each database, the platform/interface used, the limits applied, the date each search was run, and the number of records retrieved per database (these should total 516).]</w:t>
+      </w:r>
+    </w:p>
+    <w:p>
+      <w:r>
+        <w:rPr>
+          <w:b w:val="0"/>
+          <w:i w:val="0"/>
+          <w:highlight w:val="yellow"/>
+        </w:rPr>
+        <w:t>[Suggested PubMed/MEDLINE string for comparison. Replace it with the string you actually ran; do not report a search you did not run:]</w:t>
+      </w:r>
+    </w:p>
+    <w:p>
+      <w:r>
+        <w:rPr>
+          <w:b w:val="0"/>
+          <w:i w:val="0"/>
+          <w:sz w:val="20"/>
+        </w:rPr>
+        <w:t>("Mayer-Rokitansky-Kuster-Hauser"[tiab] OR "Mayer-Rokitansky-Küster-Hauser"[tiab] OR MRKH[tiab] OR Rokitansky[tiab] OR "Mullerian agenesis"[tiab] OR "Mullerian aplasia"[tiab] OR "vaginal agenesis"[tiab] OR "uterovaginal agenesis"[tiab] OR "Mullerian Ducts/abnormalities"[Mesh]) AND (depress</w:t>
+      </w:r>
+      <w:r>
+        <w:rPr>
+          <w:b w:val="0"/>
+          <w:i/>
+          <w:sz w:val="20"/>
+        </w:rPr>
+        <w:t>[tiab] OR anxiety[tiab] OR "mental health"[tiab] OR psycholog</w:t>
+      </w:r>
+      <w:r>
+        <w:rPr>
+          <w:b w:val="0"/>
+          <w:i w:val="0"/>
+          <w:sz w:val="20"/>
+        </w:rPr>
+        <w:t>[tiab] OR distress[tiab] OR "quality of life"[tiab] OR "body image"[tiab] OR "self-esteem"[tiab] OR coping[tiab] OR psychosocial[tiab] OR "Mental Health"[Mesh] OR "Adaptation, Psychological"[Mesh] OR "Quality of Life"[Mesh]) AND ("2019/01/01"[dp] : "2026/03/31"[dp])</w:t>
+      </w:r>
+    </w:p>
+    <w:p>
+      <w:r>
+        <w:rPr>
+          <w:b w:val="0"/>
+          <w:i w:val="0"/>
+          <w:highlight w:val="yellow"/>
+        </w:rPr>
+        <w:t>[Scopus: TITLE-ABS-KEY(...) with the same two concept blocks; PsycINFO and CINAHL: the same keywords plus each database's own subject headings (e.g., APA Thesaurus “Coping Behavior”; CINAHL Headings “Quality of Life”).]</w:t>
       </w:r>
     </w:p>
     <w:p>

</xml_diff>

<commit_message>
Report databases, search date, per-database counts and date-limit handling from search exports
Co-Authored-By: Claude Opus 5.5 <noreply@anthropic.com>
Claude-Session: https://claude.ai/code/session_01N468nYR7vy45HpujgUezn5
</commit_message>
<xml_diff>
--- a/manuscript/MRKH_Scoping_Review_Manuscript.docx
+++ b/manuscript/MRKH_Scoping_Review_Manuscript.docx
@@ -142,7 +142,7 @@
           <w:b w:val="0"/>
           <w:i w:val="0"/>
         </w:rPr>
-        <w:t xml:space="preserve"> 1,965   </w:t>
+        <w:t xml:space="preserve"> 2,090   </w:t>
       </w:r>
       <w:r>
         <w:rPr>
@@ -261,7 +261,7 @@
           <w:b w:val="0"/>
           <w:i w:val="0"/>
         </w:rPr>
-        <w:t xml:space="preserve"> Following Arksey and O'Malley's framework and the PRISMA Extension for Scoping Reviews (PRISMA-ScR), we searched PubMed/MEDLINE, Scopus, PsycINFO, and CINAHL for studies published between January 2019 and March 2026. Eligible studies were primary quantitative, qualitative, and mixed-methods research reporting psychological outcomes and/or coping mechanisms in MRKH populations.</w:t>
+        <w:t xml:space="preserve"> Following Arksey and O'Malley's framework and the PRISMA Extension for Scoping Reviews (PRISMA-ScR), we searched PubMed, Scopus, and (via EBSCOhost) MEDLINE, CINAHL, APA PsycInfo, and Women's Studies International for studies published between January 2019 and March 2026. Eligible studies were primary quantitative, qualitative, and mixed-methods research reporting psychological outcomes and/or coping mechanisms in MRKH populations.</w:t>
       </w:r>
     </w:p>
     <w:p>
@@ -630,7 +630,7 @@
           <w:b w:val="0"/>
           <w:i w:val="0"/>
         </w:rPr>
-        <w:t>—(1) identifying the research question; (2) identifying relevant studies; (3) selecting studies; (4) charting the data; and (5) collating, summarizing, and reporting the results—and is reported in accordance with the PRISMA Extension for Scoping Reviews (PRISMA-ScR; Appendix C).</w:t>
+        <w:t>—(1) identifying the research question; (2) identifying relevant studies; (3) selecting studies; (4) charting the data; and (5) collating, summarizing, and reporting the results—and is reported in accordance with the PRISMA Extension for Scoping Reviews (PRISMA-ScR; Appendix C),</w:t>
       </w:r>
       <w:r>
         <w:rPr>
@@ -639,6 +639,21 @@
           <w:vertAlign w:val="superscript"/>
         </w:rPr>
         <w:t>14</w:t>
+      </w:r>
+      <w:r>
+        <w:rPr>
+          <w:b w:val="0"/>
+          <w:i w:val="0"/>
+        </w:rPr>
+        <w:t xml:space="preserve"> informed by published guidance on the steps of conducting a scoping review.</w:t>
+      </w:r>
+      <w:r>
+        <w:rPr>
+          <w:b w:val="0"/>
+          <w:i w:val="0"/>
+          <w:vertAlign w:val="superscript"/>
+        </w:rPr>
+        <w:t>15</w:t>
       </w:r>
       <w:r>
         <w:rPr>
@@ -711,7 +726,7 @@
           <w:b w:val="0"/>
           <w:i w:val="0"/>
         </w:rPr>
-        <w:t xml:space="preserve"> was any healthcare or community setting in any country. We included primary quantitative, qualitative, and mixed-methods studies published between January 2019 and March 2026 that reported psychological outcomes and/or coping mechanisms among individuals with MRKH. Studies focused solely on anatomical, surgical, or fertility outcomes were excluded. </w:t>
+        <w:t xml:space="preserve"> was any healthcare or community setting in any country. We included primary quantitative, qualitative, and mixed-methods studies published between January 2019 and March 2026 that reported psychological outcomes and/or coping mechanisms among individuals with MRKH. Studies focused solely on anatomical, surgical, or fertility outcomes were excluded, as were records published before January 2019. </w:t>
       </w:r>
       <w:r>
         <w:rPr>
@@ -743,7 +758,7 @@
           <w:b w:val="0"/>
           <w:i w:val="0"/>
         </w:rPr>
-        <w:t xml:space="preserve">Four electronic databases were searched: PubMed/MEDLINE, Scopus, PsycINFO, and CINAHL, limited to January 2019 through March 2026. Search strategies combined controlled vocabulary and free-text terms for MRKH (e.g., “Mayer-Rokitansky-Küster-Hauser,” “MRKH,” “Müllerian agenesis,” “vaginal agenesis”) with terms for mental health and coping (e.g., “depression,” “anxiety,” “psychological distress,” “quality of life,” “body image,” “coping”). The full search strategy for each database is provided in Appendix A. </w:t>
+        <w:t xml:space="preserve">Searches were run and exported on March 29, 2026, in PubMed, Scopus, and EBSCOhost </w:t>
       </w:r>
       <w:r>
         <w:rPr>
@@ -751,7 +766,22 @@
           <w:i w:val="0"/>
           <w:highlight w:val="yellow"/>
         </w:rPr>
-        <w:t>[Date the final search was run: ____. Verify that the example terms above match the search you actually ran.]</w:t>
+        <w:t>[confirm the PubMed search was also run on this date]</w:t>
+      </w:r>
+      <w:r>
+        <w:rPr>
+          <w:b w:val="0"/>
+          <w:i w:val="0"/>
+        </w:rPr>
+        <w:t xml:space="preserve">. The EBSCOhost search covered MEDLINE Ultimate, CINAHL Ultimate, APA PsycInfo, and Women's Studies International, and APA PsycInfo was also exported separately (Appendix A). Date limits were not applied identically across interfaces: the Scopus search was limited to 2019–2026, the PubMed export covered 2021–2026 (MEDLINE records from 2019–2020 were captured through the EBSCOhost MEDLINE search), and EBSCOhost results were exported without a date limit. Records published before January 2019 were therefore removed during title and abstract screening. Search strategies combined controlled vocabulary and free-text terms for MRKH (e.g., “Mayer-Rokitansky-Küster-Hauser,” “MRKH,” “Müllerian agenesis,” “vaginal agenesis”) with terms for mental health and coping (e.g., “depression,” “anxiety,” “psychological distress,” “quality of life,” “body image,” “coping”). Records retrieved from each source are reported in Appendix A. </w:t>
+      </w:r>
+      <w:r>
+        <w:rPr>
+          <w:b w:val="0"/>
+          <w:i w:val="0"/>
+          <w:highlight w:val="yellow"/>
+        </w:rPr>
+        <w:t>[Verify that the example terms above match the search you ran; recover exact strings from your PubMed, Scopus, and EBSCOhost search histories if saved.]</w:t>
       </w:r>
     </w:p>
     <w:p>
@@ -3201,7 +3231,7 @@
           <w:i w:val="0"/>
           <w:vertAlign w:val="superscript"/>
         </w:rPr>
-        <w:t>15</w:t>
+        <w:t>16</w:t>
       </w:r>
       <w:r>
         <w:rPr>
@@ -3255,7 +3285,7 @@
           <w:i w:val="0"/>
           <w:vertAlign w:val="superscript"/>
         </w:rPr>
-        <w:t>9,16</w:t>
+        <w:t>9,17</w:t>
       </w:r>
       <w:r>
         <w:rPr>
@@ -3310,7 +3340,7 @@
           <w:b w:val="0"/>
           <w:i w:val="0"/>
         </w:rPr>
-        <w:t xml:space="preserve">Strengths of this review include the use of an established methodological framework, reporting according to PRISMA-ScR, a search of four major biomedical and psychological databases, and inclusion of quantitative, qualitative, and mixed-methods evidence. Several limitations should be noted. The review was limited to studies published from 2019 to 2026 and may therefore exclude earlier foundational research. Heterogeneity in study designs and outcome measures limits direct comparison across studies. Most studies came from high-income countries, limiting global generalizability, and some studies relied on self-reported mental health outcomes. Consistent with scoping review methodology, study quality was not formally appraised, and the counts reported here reflect how frequently outcomes were studied, not their prevalence. </w:t>
+        <w:t xml:space="preserve">Strengths of this review include the use of an established methodological framework, reporting according to PRISMA-ScR, a search of multiple biomedical, nursing, psychological, and women's studies databases, and inclusion of quantitative, qualitative, and mixed-methods evidence. Several limitations should be noted. The review was limited to studies published from 2019 to 2026 and may therefore exclude earlier foundational research. Heterogeneity in study designs and outcome measures limits direct comparison across studies. Most studies came from high-income countries, limiting global generalizability, and some studies relied on self-reported mental health outcomes. Consistent with scoping review methodology, study quality was not formally appraised, and the counts reported here reflect how frequently outcomes were studied, not their prevalence. Date limits were applied inconsistently across database interfaces at the search stage and were enforced during screening. </w:t>
       </w:r>
       <w:r>
         <w:rPr>
@@ -3916,6 +3946,34 @@
         </w:rPr>
         <w:t>15.</w:t>
         <w:tab/>
+        <w:t xml:space="preserve">Mak S, Thomas A. Steps for conducting a scoping review. </w:t>
+      </w:r>
+      <w:r>
+        <w:rPr>
+          <w:b w:val="0"/>
+          <w:i/>
+        </w:rPr>
+        <w:t>J Grad Med Educ</w:t>
+      </w:r>
+      <w:r>
+        <w:rPr>
+          <w:b w:val="0"/>
+          <w:i w:val="0"/>
+        </w:rPr>
+        <w:t>. 2022;14(5):565-567. doi:10.4300/JGME-D-22-00621.1</w:t>
+      </w:r>
+    </w:p>
+    <w:p>
+      <w:pPr>
+        <w:ind w:left="504" w:hanging="504"/>
+      </w:pPr>
+      <w:r>
+        <w:rPr>
+          <w:b w:val="0"/>
+          <w:i w:val="0"/>
+        </w:rPr>
+        <w:t>16.</w:t>
+        <w:tab/>
         <w:t xml:space="preserve">Heller-Boersma JG, Schmidt UH, Edmonds DK. A randomized controlled trial of a cognitive-behavioural group intervention versus waiting-list control for women with uterovaginal agenesis (Mayer-Rokitansky-Küster-Hauser syndrome: MRKH). </w:t>
       </w:r>
       <w:r>
@@ -3942,7 +4000,7 @@
           <w:b w:val="0"/>
           <w:i w:val="0"/>
         </w:rPr>
-        <w:t>16.</w:t>
+        <w:t>17.</w:t>
         <w:tab/>
         <w:t xml:space="preserve">Okunomiya A, Tsuyuki K, Ohsuga T, et al. Long-term psychosocial outcomes in Japanese Mayer-Rokitansky-Küster-Hauser syndrome: a single-center study. </w:t>
       </w:r>
@@ -3997,9 +4055,16 @@
         <w:rPr>
           <w:b w:val="0"/>
           <w:i w:val="0"/>
+        </w:rPr>
+        <w:t xml:space="preserve">Searches were exported on March 29, 2026. Record counts below are taken from the export files and total 516, matching Figure 1. </w:t>
+      </w:r>
+      <w:r>
+        <w:rPr>
+          <w:b w:val="0"/>
+          <w:i w:val="0"/>
           <w:highlight w:val="yellow"/>
         </w:rPr>
-        <w:t>[Paste the exact search string run in each database, the platform/interface used, the limits applied, the date each search was run, and the number of records retrieved per database (these should total 516).]</w:t>
+        <w:t>[Paste the exact search string for each database if it can be recovered from your search history.]</w:t>
       </w:r>
     </w:p>
     <w:p>
@@ -4077,15 +4142,15 @@
         <w:tblLook w:firstColumn="1" w:firstRow="1" w:lastColumn="0" w:lastRow="0" w:noHBand="0" w:noVBand="1" w:val="04A0"/>
       </w:tblPr>
       <w:tblGrid>
-        <w:gridCol w:w="2592"/>
-        <w:gridCol w:w="2304"/>
-        <w:gridCol w:w="2016"/>
-        <w:gridCol w:w="2304"/>
+        <w:gridCol w:w="4176"/>
+        <w:gridCol w:w="1584"/>
+        <w:gridCol w:w="1728"/>
+        <w:gridCol w:w="1728"/>
       </w:tblGrid>
       <w:tr>
         <w:tc>
           <w:tcPr>
-            <w:tcW w:type="dxa" w:w="2592"/>
+            <w:tcW w:type="dxa" w:w="4176"/>
             <w:shd w:val="clear" w:color="auto" w:fill="D9E2F3"/>
           </w:tcPr>
           <w:p>
@@ -4105,7 +4170,7 @@
         </w:tc>
         <w:tc>
           <w:tcPr>
-            <w:tcW w:type="dxa" w:w="2304"/>
+            <w:tcW w:type="dxa" w:w="1584"/>
             <w:shd w:val="clear" w:color="auto" w:fill="D9E2F3"/>
           </w:tcPr>
           <w:p>
@@ -4125,7 +4190,7 @@
         </w:tc>
         <w:tc>
           <w:tcPr>
-            <w:tcW w:type="dxa" w:w="2016"/>
+            <w:tcW w:type="dxa" w:w="1728"/>
             <w:shd w:val="clear" w:color="auto" w:fill="D9E2F3"/>
           </w:tcPr>
           <w:p>
@@ -4145,7 +4210,7 @@
         </w:tc>
         <w:tc>
           <w:tcPr>
-            <w:tcW w:type="dxa" w:w="2304"/>
+            <w:tcW w:type="dxa" w:w="1728"/>
             <w:shd w:val="clear" w:color="auto" w:fill="D9E2F3"/>
           </w:tcPr>
           <w:p>
@@ -4167,7 +4232,7 @@
       <w:tr>
         <w:tc>
           <w:tcPr>
-            <w:tcW w:type="dxa" w:w="2592"/>
+            <w:tcW w:type="dxa" w:w="4176"/>
           </w:tcPr>
           <w:p>
             <w:pPr>
@@ -4180,13 +4245,188 @@
                 <w:i w:val="0"/>
                 <w:sz w:val="20"/>
               </w:rPr>
-              <w:t>PubMed/MEDLINE</w:t>
+              <w:t>MEDLINE Ultimate; CINAHL Ultimate; Women's Studies International; APA PsycInfo (combined export: 145; 39; 15; 8)</w:t>
             </w:r>
           </w:p>
         </w:tc>
         <w:tc>
           <w:tcPr>
-            <w:tcW w:type="dxa" w:w="2304"/>
+            <w:tcW w:type="dxa" w:w="1584"/>
+          </w:tcPr>
+          <w:p>
+            <w:pPr>
+              <w:spacing w:line="240" w:lineRule="auto"/>
+            </w:pPr>
+            <w:r/>
+            <w:r>
+              <w:rPr>
+                <w:b w:val="0"/>
+                <w:i w:val="0"/>
+                <w:sz w:val="20"/>
+              </w:rPr>
+              <w:t>EBSCOhost</w:t>
+            </w:r>
+          </w:p>
+        </w:tc>
+        <w:tc>
+          <w:tcPr>
+            <w:tcW w:type="dxa" w:w="1728"/>
+          </w:tcPr>
+          <w:p>
+            <w:pPr>
+              <w:spacing w:line="240" w:lineRule="auto"/>
+            </w:pPr>
+            <w:r/>
+            <w:r>
+              <w:rPr>
+                <w:b w:val="0"/>
+                <w:i w:val="0"/>
+                <w:sz w:val="20"/>
+              </w:rPr>
+              <w:t>Mar 29, 2026</w:t>
+            </w:r>
+          </w:p>
+        </w:tc>
+        <w:tc>
+          <w:tcPr>
+            <w:tcW w:type="dxa" w:w="1728"/>
+          </w:tcPr>
+          <w:p>
+            <w:pPr>
+              <w:spacing w:line="240" w:lineRule="auto"/>
+            </w:pPr>
+            <w:r/>
+            <w:r>
+              <w:rPr>
+                <w:b w:val="0"/>
+                <w:i w:val="0"/>
+                <w:sz w:val="20"/>
+              </w:rPr>
+              <w:t>207</w:t>
+            </w:r>
+          </w:p>
+        </w:tc>
+      </w:tr>
+      <w:tr>
+        <w:tc>
+          <w:tcPr>
+            <w:tcW w:type="dxa" w:w="4176"/>
+          </w:tcPr>
+          <w:p>
+            <w:pPr>
+              <w:spacing w:line="240" w:lineRule="auto"/>
+            </w:pPr>
+            <w:r/>
+            <w:r>
+              <w:rPr>
+                <w:b w:val="0"/>
+                <w:i w:val="0"/>
+                <w:sz w:val="20"/>
+              </w:rPr>
+              <w:t>APA PsycInfo (separate export)</w:t>
+            </w:r>
+          </w:p>
+        </w:tc>
+        <w:tc>
+          <w:tcPr>
+            <w:tcW w:type="dxa" w:w="1584"/>
+          </w:tcPr>
+          <w:p>
+            <w:pPr>
+              <w:spacing w:line="240" w:lineRule="auto"/>
+            </w:pPr>
+            <w:r/>
+            <w:r>
+              <w:rPr>
+                <w:b w:val="0"/>
+                <w:i w:val="0"/>
+                <w:sz w:val="20"/>
+              </w:rPr>
+              <w:t>EBSCOhost</w:t>
+            </w:r>
+          </w:p>
+        </w:tc>
+        <w:tc>
+          <w:tcPr>
+            <w:tcW w:type="dxa" w:w="1728"/>
+          </w:tcPr>
+          <w:p>
+            <w:pPr>
+              <w:spacing w:line="240" w:lineRule="auto"/>
+            </w:pPr>
+            <w:r/>
+            <w:r>
+              <w:rPr>
+                <w:b w:val="0"/>
+                <w:i w:val="0"/>
+                <w:sz w:val="20"/>
+              </w:rPr>
+              <w:t>Mar 29, 2026</w:t>
+            </w:r>
+          </w:p>
+        </w:tc>
+        <w:tc>
+          <w:tcPr>
+            <w:tcW w:type="dxa" w:w="1728"/>
+          </w:tcPr>
+          <w:p>
+            <w:pPr>
+              <w:spacing w:line="240" w:lineRule="auto"/>
+            </w:pPr>
+            <w:r/>
+            <w:r>
+              <w:rPr>
+                <w:b w:val="0"/>
+                <w:i w:val="0"/>
+                <w:sz w:val="20"/>
+              </w:rPr>
+              <w:t>20</w:t>
+            </w:r>
+          </w:p>
+        </w:tc>
+      </w:tr>
+      <w:tr>
+        <w:tc>
+          <w:tcPr>
+            <w:tcW w:type="dxa" w:w="4176"/>
+          </w:tcPr>
+          <w:p>
+            <w:pPr>
+              <w:spacing w:line="240" w:lineRule="auto"/>
+            </w:pPr>
+            <w:r/>
+            <w:r>
+              <w:rPr>
+                <w:b w:val="0"/>
+                <w:i w:val="0"/>
+                <w:sz w:val="20"/>
+              </w:rPr>
+              <w:t>MEDLINE (publications 2021–2026)</w:t>
+            </w:r>
+          </w:p>
+        </w:tc>
+        <w:tc>
+          <w:tcPr>
+            <w:tcW w:type="dxa" w:w="1584"/>
+          </w:tcPr>
+          <w:p>
+            <w:pPr>
+              <w:spacing w:line="240" w:lineRule="auto"/>
+            </w:pPr>
+            <w:r/>
+            <w:r>
+              <w:rPr>
+                <w:b w:val="0"/>
+                <w:i w:val="0"/>
+                <w:sz w:val="20"/>
+              </w:rPr>
+              <w:t>PubMed</w:t>
+            </w:r>
+          </w:p>
+        </w:tc>
+        <w:tc>
+          <w:tcPr>
+            <w:tcW w:type="dxa" w:w="1728"/>
           </w:tcPr>
           <w:p>
             <w:pPr>
@@ -4200,13 +4440,13 @@
                 <w:sz w:val="20"/>
                 <w:highlight w:val="yellow"/>
               </w:rPr>
-              <w:t>[ ]</w:t>
+              <w:t>[Mar 29, 2026?]</w:t>
             </w:r>
           </w:p>
         </w:tc>
         <w:tc>
           <w:tcPr>
-            <w:tcW w:type="dxa" w:w="2016"/>
+            <w:tcW w:type="dxa" w:w="1728"/>
           </w:tcPr>
           <w:p>
             <w:pPr>
@@ -4218,15 +4458,16 @@
                 <w:b w:val="0"/>
                 <w:i w:val="0"/>
                 <w:sz w:val="20"/>
-                <w:highlight w:val="yellow"/>
               </w:rPr>
-              <w:t>[ ]</w:t>
+              <w:t>146</w:t>
             </w:r>
           </w:p>
         </w:tc>
-        <w:tc>
-          <w:tcPr>
-            <w:tcW w:type="dxa" w:w="2304"/>
+      </w:tr>
+      <w:tr>
+        <w:tc>
+          <w:tcPr>
+            <w:tcW w:type="dxa" w:w="4176"/>
           </w:tcPr>
           <w:p>
             <w:pPr>
@@ -4238,17 +4479,14 @@
                 <w:b w:val="0"/>
                 <w:i w:val="0"/>
                 <w:sz w:val="20"/>
-                <w:highlight w:val="yellow"/>
               </w:rPr>
-              <w:t>[ ]</w:t>
+              <w:t>Scopus (publications 2019–2026)</w:t>
             </w:r>
           </w:p>
         </w:tc>
-      </w:tr>
-      <w:tr>
-        <w:tc>
-          <w:tcPr>
-            <w:tcW w:type="dxa" w:w="2592"/>
+        <w:tc>
+          <w:tcPr>
+            <w:tcW w:type="dxa" w:w="1584"/>
           </w:tcPr>
           <w:p>
             <w:pPr>
@@ -4267,69 +4505,7 @@
         </w:tc>
         <w:tc>
           <w:tcPr>
-            <w:tcW w:type="dxa" w:w="2304"/>
-          </w:tcPr>
-          <w:p>
-            <w:pPr>
-              <w:spacing w:line="240" w:lineRule="auto"/>
-            </w:pPr>
-            <w:r/>
-            <w:r>
-              <w:rPr>
-                <w:b w:val="0"/>
-                <w:i w:val="0"/>
-                <w:sz w:val="20"/>
-                <w:highlight w:val="yellow"/>
-              </w:rPr>
-              <w:t>[ ]</w:t>
-            </w:r>
-          </w:p>
-        </w:tc>
-        <w:tc>
-          <w:tcPr>
-            <w:tcW w:type="dxa" w:w="2016"/>
-          </w:tcPr>
-          <w:p>
-            <w:pPr>
-              <w:spacing w:line="240" w:lineRule="auto"/>
-            </w:pPr>
-            <w:r/>
-            <w:r>
-              <w:rPr>
-                <w:b w:val="0"/>
-                <w:i w:val="0"/>
-                <w:sz w:val="20"/>
-                <w:highlight w:val="yellow"/>
-              </w:rPr>
-              <w:t>[ ]</w:t>
-            </w:r>
-          </w:p>
-        </w:tc>
-        <w:tc>
-          <w:tcPr>
-            <w:tcW w:type="dxa" w:w="2304"/>
-          </w:tcPr>
-          <w:p>
-            <w:pPr>
-              <w:spacing w:line="240" w:lineRule="auto"/>
-            </w:pPr>
-            <w:r/>
-            <w:r>
-              <w:rPr>
-                <w:b w:val="0"/>
-                <w:i w:val="0"/>
-                <w:sz w:val="20"/>
-                <w:highlight w:val="yellow"/>
-              </w:rPr>
-              <w:t>[ ]</w:t>
-            </w:r>
-          </w:p>
-        </w:tc>
-      </w:tr>
-      <w:tr>
-        <w:tc>
-          <w:tcPr>
-            <w:tcW w:type="dxa" w:w="2592"/>
+            <w:tcW w:type="dxa" w:w="1728"/>
           </w:tcPr>
           <w:p>
             <w:pPr>
@@ -4342,75 +4518,13 @@
                 <w:i w:val="0"/>
                 <w:sz w:val="20"/>
               </w:rPr>
-              <w:t>PsycINFO</w:t>
+              <w:t>Mar 29, 2026</w:t>
             </w:r>
           </w:p>
         </w:tc>
         <w:tc>
           <w:tcPr>
-            <w:tcW w:type="dxa" w:w="2304"/>
-          </w:tcPr>
-          <w:p>
-            <w:pPr>
-              <w:spacing w:line="240" w:lineRule="auto"/>
-            </w:pPr>
-            <w:r/>
-            <w:r>
-              <w:rPr>
-                <w:b w:val="0"/>
-                <w:i w:val="0"/>
-                <w:sz w:val="20"/>
-                <w:highlight w:val="yellow"/>
-              </w:rPr>
-              <w:t>[ ]</w:t>
-            </w:r>
-          </w:p>
-        </w:tc>
-        <w:tc>
-          <w:tcPr>
-            <w:tcW w:type="dxa" w:w="2016"/>
-          </w:tcPr>
-          <w:p>
-            <w:pPr>
-              <w:spacing w:line="240" w:lineRule="auto"/>
-            </w:pPr>
-            <w:r/>
-            <w:r>
-              <w:rPr>
-                <w:b w:val="0"/>
-                <w:i w:val="0"/>
-                <w:sz w:val="20"/>
-                <w:highlight w:val="yellow"/>
-              </w:rPr>
-              <w:t>[ ]</w:t>
-            </w:r>
-          </w:p>
-        </w:tc>
-        <w:tc>
-          <w:tcPr>
-            <w:tcW w:type="dxa" w:w="2304"/>
-          </w:tcPr>
-          <w:p>
-            <w:pPr>
-              <w:spacing w:line="240" w:lineRule="auto"/>
-            </w:pPr>
-            <w:r/>
-            <w:r>
-              <w:rPr>
-                <w:b w:val="0"/>
-                <w:i w:val="0"/>
-                <w:sz w:val="20"/>
-                <w:highlight w:val="yellow"/>
-              </w:rPr>
-              <w:t>[ ]</w:t>
-            </w:r>
-          </w:p>
-        </w:tc>
-      </w:tr>
-      <w:tr>
-        <w:tc>
-          <w:tcPr>
-            <w:tcW w:type="dxa" w:w="2592"/>
+            <w:tcW w:type="dxa" w:w="1728"/>
           </w:tcPr>
           <w:p>
             <w:pPr>
@@ -4423,67 +4537,7 @@
                 <w:i w:val="0"/>
                 <w:sz w:val="20"/>
               </w:rPr>
-              <w:t>CINAHL</w:t>
-            </w:r>
-          </w:p>
-        </w:tc>
-        <w:tc>
-          <w:tcPr>
-            <w:tcW w:type="dxa" w:w="2304"/>
-          </w:tcPr>
-          <w:p>
-            <w:pPr>
-              <w:spacing w:line="240" w:lineRule="auto"/>
-            </w:pPr>
-            <w:r/>
-            <w:r>
-              <w:rPr>
-                <w:b w:val="0"/>
-                <w:i w:val="0"/>
-                <w:sz w:val="20"/>
-                <w:highlight w:val="yellow"/>
-              </w:rPr>
-              <w:t>[ ]</w:t>
-            </w:r>
-          </w:p>
-        </w:tc>
-        <w:tc>
-          <w:tcPr>
-            <w:tcW w:type="dxa" w:w="2016"/>
-          </w:tcPr>
-          <w:p>
-            <w:pPr>
-              <w:spacing w:line="240" w:lineRule="auto"/>
-            </w:pPr>
-            <w:r/>
-            <w:r>
-              <w:rPr>
-                <w:b w:val="0"/>
-                <w:i w:val="0"/>
-                <w:sz w:val="20"/>
-                <w:highlight w:val="yellow"/>
-              </w:rPr>
-              <w:t>[ ]</w:t>
-            </w:r>
-          </w:p>
-        </w:tc>
-        <w:tc>
-          <w:tcPr>
-            <w:tcW w:type="dxa" w:w="2304"/>
-          </w:tcPr>
-          <w:p>
-            <w:pPr>
-              <w:spacing w:line="240" w:lineRule="auto"/>
-            </w:pPr>
-            <w:r/>
-            <w:r>
-              <w:rPr>
-                <w:b w:val="0"/>
-                <w:i w:val="0"/>
-                <w:sz w:val="20"/>
-                <w:highlight w:val="yellow"/>
-              </w:rPr>
-              <w:t>[ ]</w:t>
+              <w:t>143</w:t>
             </w:r>
           </w:p>
         </w:tc>
@@ -4491,7 +4545,7 @@
       <w:tr>
         <w:tc>
           <w:tcPr>
-            <w:tcW w:type="dxa" w:w="2592"/>
+            <w:tcW w:type="dxa" w:w="4176"/>
           </w:tcPr>
           <w:p>
             <w:pPr>
@@ -4510,29 +4564,29 @@
         </w:tc>
         <w:tc>
           <w:tcPr>
-            <w:tcW w:type="dxa" w:w="2304"/>
-          </w:tcPr>
-          <w:p>
-            <w:pPr>
-              <w:spacing w:line="240" w:lineRule="auto"/>
-            </w:pPr>
-            <w:r/>
-          </w:p>
-        </w:tc>
-        <w:tc>
-          <w:tcPr>
-            <w:tcW w:type="dxa" w:w="2016"/>
-          </w:tcPr>
-          <w:p>
-            <w:pPr>
-              <w:spacing w:line="240" w:lineRule="auto"/>
-            </w:pPr>
-            <w:r/>
-          </w:p>
-        </w:tc>
-        <w:tc>
-          <w:tcPr>
-            <w:tcW w:type="dxa" w:w="2304"/>
+            <w:tcW w:type="dxa" w:w="1584"/>
+          </w:tcPr>
+          <w:p>
+            <w:pPr>
+              <w:spacing w:line="240" w:lineRule="auto"/>
+            </w:pPr>
+            <w:r/>
+          </w:p>
+        </w:tc>
+        <w:tc>
+          <w:tcPr>
+            <w:tcW w:type="dxa" w:w="1728"/>
+          </w:tcPr>
+          <w:p>
+            <w:pPr>
+              <w:spacing w:line="240" w:lineRule="auto"/>
+            </w:pPr>
+            <w:r/>
+          </w:p>
+        </w:tc>
+        <w:tc>
+          <w:tcPr>
+            <w:tcW w:type="dxa" w:w="1728"/>
           </w:tcPr>
           <w:p>
             <w:pPr>
@@ -4551,6 +4605,19 @@
         </w:tc>
       </w:tr>
     </w:tbl>
+    <w:p>
+      <w:pPr>
+        <w:spacing w:line="240" w:lineRule="auto" w:after="240"/>
+      </w:pPr>
+      <w:r>
+        <w:rPr>
+          <w:b w:val="0"/>
+          <w:i w:val="0"/>
+          <w:sz w:val="20"/>
+        </w:rPr>
+        <w:t>Records published before 2019 (n = 100, all from the EBSCOhost exports) were excluded at title and abstract screening and are counted among the 327 exclusions.</w:t>
+      </w:r>
+    </w:p>
     <w:p>
       <w:pPr>
         <w:pStyle w:val="Heading1"/>

</xml_diff>

<commit_message>
Resolve eligibility of 12 records (39 included) and rebuild poster on Liberty VPHA template
Co-Authored-By: Claude Opus 5.5 <noreply@anthropic.com>
Claude-Session: https://claude.ai/code/session_01N468nYR7vy45HpujgUezn5
</commit_message>
<xml_diff>
--- a/manuscript/MRKH_Scoping_Review_Manuscript.docx
+++ b/manuscript/MRKH_Scoping_Review_Manuscript.docx
@@ -142,7 +142,7 @@
           <w:b w:val="0"/>
           <w:i w:val="0"/>
         </w:rPr>
-        <w:t xml:space="preserve"> 2,343   </w:t>
+        <w:t xml:space="preserve"> 2,463   </w:t>
       </w:r>
       <w:r>
         <w:rPr>
@@ -277,7 +277,7 @@
           <w:b w:val="0"/>
           <w:i w:val="0"/>
         </w:rPr>
-        <w:t xml:space="preserve"> Of 516 records identified (324 after deduplication), 34 studies were provisionally included. Psychosexual and relational challenges were the most frequently reported outcomes (n = 24; 71%), followed by reduced quality of life, body image, and self-esteem (n = 18; 53%), broader psychological distress (n = 18; 53%), and depression and anxiety (n = 10; 29%). Coping mechanisms were documented in 14 studies, mostly peer support and self-management, and healthcare system gaps in 9. Studies came mainly from Europe (n = 14) and Asia (n = 14).</w:t>
+        <w:t xml:space="preserve"> Of 516 records identified (324 after deduplication), 39 studies were provisionally included. Psychosexual and relational challenges were the most frequently reported outcomes (n = 25; 64%), followed by reduced quality of life, body image, and self-esteem (n = 20; 51%), broader psychological distress (n = 22; 56%), and depression and anxiety (n = 12; 31%). Coping mechanisms were documented in 14 studies, mostly peer support and self-management, and healthcare system gaps in 10. Studies came mainly from Europe (n = 17) and Asia (n = 14).</w:t>
       </w:r>
     </w:p>
     <w:p>
@@ -820,7 +820,22 @@
           <w:b w:val="0"/>
           <w:i w:val="0"/>
         </w:rPr>
-        <w:t>. Records that could not be classified from the title and abstract were retained for full-text review. The screening workbook, with a decision and reason for every record, is available as supplementary material.</w:t>
+        <w:t xml:space="preserve">. Records that could not be classified from the exported title and abstract were assessed for eligibility using the published abstract; studies with mixed samples were included only if results were reported separately for participants with MRKH or at least 80% of participants had MRKH. </w:t>
+      </w:r>
+      <w:r>
+        <w:rPr>
+          <w:b w:val="0"/>
+          <w:i w:val="0"/>
+          <w:highlight w:val="yellow"/>
+        </w:rPr>
+        <w:t>[Full-text verification of all included studies is pending.]</w:t>
+      </w:r>
+      <w:r>
+        <w:rPr>
+          <w:b w:val="0"/>
+          <w:i w:val="0"/>
+        </w:rPr>
+        <w:t xml:space="preserve"> The screening workbook, with a decision and reason for every record, is available as supplementary material.</w:t>
       </w:r>
     </w:p>
     <w:p>
@@ -934,7 +949,7 @@
           <w:b w:val="0"/>
           <w:i w:val="0"/>
         </w:rPr>
-        <w:t>The searches identified 516 records. After removal of 192 duplicates, 324 records were screened and 278 were excluded: published before 2019 (n = 89); case report / surgical case series (n = 75); not primary research (n = 48); surgical/functional outcomes only (n = 38); wrong population / topic (n = 28). Of the 46 records retained, 34 were provisionally included and 12 require full text to decide eligibility (Figure 1).</w:t>
+        <w:t>The searches identified 516 records. After removal of 192 duplicates, 324 records were screened and 278 were excluded: published before 2019 (n = 89); case report / surgical case series (n = 75); not primary research (n = 48); surgical/functional outcomes only (n = 38); wrong population / topic (n = 28). Of the 46 records assessed for eligibility, 7 were excluded (mixed sample, mrkh not separate, n = 5; no psychological outcome, n = 2), and 39 studies were provisionally included (Figure 1).</w:t>
       </w:r>
     </w:p>
     <w:p>
@@ -995,7 +1010,7 @@
           <w:i w:val="0"/>
           <w:sz w:val="20"/>
         </w:rPr>
-        <w:t xml:space="preserve"> PRISMA-ScR flow diagram of study selection. Counts are provisional pending reviewer verification and full-text assessment.</w:t>
+        <w:t xml:space="preserve"> PRISMA-ScR flow diagram of study selection. Counts are provisional pending reviewer verification and full-text confirmation.</w:t>
       </w:r>
     </w:p>
     <w:p>
@@ -1019,7 +1034,7 @@
           <w:b w:val="0"/>
           <w:i w:val="0"/>
         </w:rPr>
-        <w:t>The 34 included studies were published between 2019 and 2026 and comprised 18 quantitative studies (52.9%), 12 qualitative studies (35.3%), and 3 mixed-methods studies (8.8%); the design of 1 study could not be determined from its abstract (Table 1; Figure 2). Quantitative designs included cross-sectional surveys, case-control comparisons, cohort and pre–post studies, and 1 randomized controlled trial.</w:t>
+        <w:t>The 39 included studies were published between 2019 and 2026 and comprised 20 quantitative studies (51.3%), 15 qualitative studies (38.5%), and 3 mixed-methods studies (7.7%); the design of 1 study could not be determined from its abstract (Table 1; Figure 2). Quantitative designs included cross-sectional surveys, case-control comparisons, cohort and pre–post studies, and 1 randomized controlled trial.</w:t>
       </w:r>
       <w:r>
         <w:rPr>
@@ -1034,7 +1049,7 @@
           <w:b w:val="0"/>
           <w:i w:val="0"/>
         </w:rPr>
-        <w:t xml:space="preserve"> Studies came from Europe (n = 14) and Asia (n = 14) in equal numbers, followed by North America (n = 3) and Africa (n = 1); 2 studies recruited internationally, and none came from South America or Oceania (Figure 3). China contributed the most studies (n = 6). Sample sizes, where reported, ranged from 7 to 616 participants. Two Chinese reports appear to draw on the same sample of 141 patients.</w:t>
+        <w:t xml:space="preserve"> Most studies came from Europe (n = 17) and Asia (n = 14), followed by North America (n = 3), Africa (n = 2), and Oceania (n = 1); 2 studies recruited internationally, and none came from South America (Figure 3). China contributed the most studies (n = 6). Sample sizes, where reported, ranged from 5 to 616 participants. Two Chinese reports appear to draw on the same sample of 141 patients.</w:t>
       </w:r>
       <w:r>
         <w:rPr>
@@ -1225,7 +1240,7 @@
                 <w:i w:val="0"/>
                 <w:sz w:val="20"/>
               </w:rPr>
-              <w:t>18</w:t>
+              <w:t>20</w:t>
             </w:r>
           </w:p>
         </w:tc>
@@ -1244,7 +1259,7 @@
                 <w:i w:val="0"/>
                 <w:sz w:val="20"/>
               </w:rPr>
-              <w:t>52.9%</w:t>
+              <w:t>51.3%</w:t>
             </w:r>
           </w:p>
         </w:tc>
@@ -1284,7 +1299,7 @@
                 <w:i w:val="0"/>
                 <w:sz w:val="20"/>
               </w:rPr>
-              <w:t>12</w:t>
+              <w:t>15</w:t>
             </w:r>
           </w:p>
         </w:tc>
@@ -1303,7 +1318,7 @@
                 <w:i w:val="0"/>
                 <w:sz w:val="20"/>
               </w:rPr>
-              <w:t>35.3%</w:t>
+              <w:t>38.5%</w:t>
             </w:r>
           </w:p>
         </w:tc>
@@ -1362,7 +1377,7 @@
                 <w:i w:val="0"/>
                 <w:sz w:val="20"/>
               </w:rPr>
-              <w:t>8.8%</w:t>
+              <w:t>7.7%</w:t>
             </w:r>
           </w:p>
         </w:tc>
@@ -1421,7 +1436,7 @@
                 <w:i w:val="0"/>
                 <w:sz w:val="20"/>
               </w:rPr>
-              <w:t>2.9%</w:t>
+              <w:t>2.6%</w:t>
             </w:r>
           </w:p>
         </w:tc>
@@ -1504,7 +1519,7 @@
                 <w:i w:val="0"/>
                 <w:sz w:val="20"/>
               </w:rPr>
-              <w:t>14</w:t>
+              <w:t>17</w:t>
             </w:r>
           </w:p>
         </w:tc>
@@ -1523,7 +1538,7 @@
                 <w:i w:val="0"/>
                 <w:sz w:val="20"/>
               </w:rPr>
-              <w:t>41.2%</w:t>
+              <w:t>43.6%</w:t>
             </w:r>
           </w:p>
         </w:tc>
@@ -1582,7 +1597,7 @@
                 <w:i w:val="0"/>
                 <w:sz w:val="20"/>
               </w:rPr>
-              <w:t>41.2%</w:t>
+              <w:t>35.9%</w:t>
             </w:r>
           </w:p>
         </w:tc>
@@ -1641,7 +1656,7 @@
                 <w:i w:val="0"/>
                 <w:sz w:val="20"/>
               </w:rPr>
-              <w:t>8.8%</w:t>
+              <w:t>7.7%</w:t>
             </w:r>
           </w:p>
         </w:tc>
@@ -1662,7 +1677,7 @@
                 <w:i w:val="0"/>
                 <w:sz w:val="20"/>
               </w:rPr>
-              <w:t>Multinational</w:t>
+              <w:t>Africa</w:t>
             </w:r>
           </w:p>
         </w:tc>
@@ -1700,7 +1715,7 @@
                 <w:i w:val="0"/>
                 <w:sz w:val="20"/>
               </w:rPr>
-              <w:t>5.9%</w:t>
+              <w:t>5.1%</w:t>
             </w:r>
           </w:p>
         </w:tc>
@@ -1721,7 +1736,7 @@
                 <w:i w:val="0"/>
                 <w:sz w:val="20"/>
               </w:rPr>
-              <w:t>Africa</w:t>
+              <w:t>Multinational</w:t>
             </w:r>
           </w:p>
         </w:tc>
@@ -1740,6 +1755,65 @@
                 <w:i w:val="0"/>
                 <w:sz w:val="20"/>
               </w:rPr>
+              <w:t>2</w:t>
+            </w:r>
+          </w:p>
+        </w:tc>
+        <w:tc>
+          <w:tcPr>
+            <w:tcW w:type="dxa" w:w="1440"/>
+          </w:tcPr>
+          <w:p>
+            <w:pPr>
+              <w:spacing w:line="240" w:lineRule="auto"/>
+            </w:pPr>
+            <w:r/>
+            <w:r>
+              <w:rPr>
+                <w:b w:val="0"/>
+                <w:i w:val="0"/>
+                <w:sz w:val="20"/>
+              </w:rPr>
+              <w:t>5.1%</w:t>
+            </w:r>
+          </w:p>
+        </w:tc>
+      </w:tr>
+      <w:tr>
+        <w:tc>
+          <w:tcPr>
+            <w:tcW w:type="dxa" w:w="5184"/>
+          </w:tcPr>
+          <w:p>
+            <w:pPr>
+              <w:spacing w:line="240" w:lineRule="auto"/>
+            </w:pPr>
+            <w:r/>
+            <w:r>
+              <w:rPr>
+                <w:b w:val="0"/>
+                <w:i w:val="0"/>
+                <w:sz w:val="20"/>
+              </w:rPr>
+              <w:t>Oceania</w:t>
+            </w:r>
+          </w:p>
+        </w:tc>
+        <w:tc>
+          <w:tcPr>
+            <w:tcW w:type="dxa" w:w="1152"/>
+          </w:tcPr>
+          <w:p>
+            <w:pPr>
+              <w:spacing w:line="240" w:lineRule="auto"/>
+            </w:pPr>
+            <w:r/>
+            <w:r>
+              <w:rPr>
+                <w:b w:val="0"/>
+                <w:i w:val="0"/>
+                <w:sz w:val="20"/>
+              </w:rPr>
               <w:t>1</w:t>
             </w:r>
           </w:p>
@@ -1759,7 +1833,7 @@
                 <w:i w:val="0"/>
                 <w:sz w:val="20"/>
               </w:rPr>
-              <w:t>2.9%</w:t>
+              <w:t>2.6%</w:t>
             </w:r>
           </w:p>
         </w:tc>
@@ -1980,7 +2054,7 @@
           <w:b w:val="0"/>
           <w:i w:val="0"/>
         </w:rPr>
-        <w:t>Psychosexual and relational challenges were the most frequently reported domain (24 of 34 studies; 70.6%), followed by quality of life, body image, and self-esteem (18; 52.9%), broader psychological distress (18; 52.9%), and depression and anxiety (10; 29.4%) (Table 2; Figure 4).</w:t>
+        <w:t>Psychosexual and relational challenges were the most frequently reported domain (25 of 39 studies; 64.1%), followed by quality of life, body image, and self-esteem (20; 51.3%), broader psychological distress (22; 56.4%), and depression and anxiety (12; 30.8%) (Table 2; Figure 4).</w:t>
       </w:r>
     </w:p>
     <w:p>
@@ -2183,6 +2257,36 @@
         </w:rPr>
         <w:t>35</w:t>
       </w:r>
+      <w:r>
+        <w:rPr>
+          <w:b w:val="0"/>
+          <w:i w:val="0"/>
+        </w:rPr>
+        <w:t xml:space="preserve"> A French study of 40 women described binge eating with weight gain after diagnosis in about 10%,</w:t>
+      </w:r>
+      <w:r>
+        <w:rPr>
+          <w:b w:val="0"/>
+          <w:i w:val="0"/>
+          <w:vertAlign w:val="superscript"/>
+        </w:rPr>
+        <w:t>36</w:t>
+      </w:r>
+      <w:r>
+        <w:rPr>
+          <w:b w:val="0"/>
+          <w:i w:val="0"/>
+        </w:rPr>
+        <w:t xml:space="preserve"> and uterus transplant recipients described changes in self-perception, body, and sexuality.</w:t>
+      </w:r>
+      <w:r>
+        <w:rPr>
+          <w:b w:val="0"/>
+          <w:i w:val="0"/>
+          <w:vertAlign w:val="superscript"/>
+        </w:rPr>
+        <w:t>37</w:t>
+      </w:r>
     </w:p>
     <w:p>
       <w:pPr>
@@ -2238,7 +2342,7 @@
           <w:i w:val="0"/>
           <w:vertAlign w:val="superscript"/>
         </w:rPr>
-        <w:t>36</w:t>
+        <w:t>38</w:t>
       </w:r>
       <w:r>
         <w:rPr>
@@ -2253,7 +2357,7 @@
           <w:i w:val="0"/>
           <w:vertAlign w:val="superscript"/>
         </w:rPr>
-        <w:t>37</w:t>
+        <w:t>39</w:t>
       </w:r>
       <w:r>
         <w:rPr>
@@ -2268,7 +2372,7 @@
           <w:i w:val="0"/>
           <w:vertAlign w:val="superscript"/>
         </w:rPr>
-        <w:t>38</w:t>
+        <w:t>40</w:t>
       </w:r>
       <w:r>
         <w:rPr>
@@ -2283,7 +2387,37 @@
           <w:i w:val="0"/>
           <w:vertAlign w:val="superscript"/>
         </w:rPr>
-        <w:t>39,40</w:t>
+        <w:t>41,42</w:t>
+      </w:r>
+      <w:r>
+        <w:rPr>
+          <w:b w:val="0"/>
+          <w:i w:val="0"/>
+        </w:rPr>
+        <w:t xml:space="preserve"> Among other uterus transplant candidates, however, MMPI-2 profiles showed elevated depression scales,</w:t>
+      </w:r>
+      <w:r>
+        <w:rPr>
+          <w:b w:val="0"/>
+          <w:i w:val="0"/>
+          <w:vertAlign w:val="superscript"/>
+        </w:rPr>
+        <w:t>43</w:t>
+      </w:r>
+      <w:r>
+        <w:rPr>
+          <w:b w:val="0"/>
+          <w:i w:val="0"/>
+        </w:rPr>
+        <w:t xml:space="preserve"> and women with congenital uterine absence more often reported severe depression and anxiety symptoms than women with acquired uterine absence.</w:t>
+      </w:r>
+      <w:r>
+        <w:rPr>
+          <w:b w:val="0"/>
+          <w:i w:val="0"/>
+          <w:vertAlign w:val="superscript"/>
+        </w:rPr>
+        <w:t>44</w:t>
       </w:r>
     </w:p>
     <w:p>
@@ -2435,7 +2569,7 @@
                 <w:i w:val="0"/>
                 <w:sz w:val="20"/>
               </w:rPr>
-              <w:t>24 (70.6%)</w:t>
+              <w:t>25 (64.1%)</w:t>
             </w:r>
           </w:p>
         </w:tc>
@@ -2494,7 +2628,7 @@
                 <w:i w:val="0"/>
                 <w:sz w:val="20"/>
               </w:rPr>
-              <w:t>18 (52.9%)</w:t>
+              <w:t>20 (51.3%)</w:t>
             </w:r>
           </w:p>
         </w:tc>
@@ -2553,7 +2687,7 @@
                 <w:i w:val="0"/>
                 <w:sz w:val="20"/>
               </w:rPr>
-              <w:t>18 (52.9%)</w:t>
+              <w:t>22 (56.4%)</w:t>
             </w:r>
           </w:p>
         </w:tc>
@@ -2612,7 +2746,7 @@
                 <w:i w:val="0"/>
                 <w:sz w:val="20"/>
               </w:rPr>
-              <w:t>10 (29.4%)</w:t>
+              <w:t>12 (30.8%)</w:t>
             </w:r>
           </w:p>
         </w:tc>
@@ -2713,7 +2847,7 @@
           <w:b w:val="0"/>
           <w:i w:val="0"/>
         </w:rPr>
-        <w:t>Coping mechanisms were documented in 14 studies (41.2%; Table 3). Peer, family, and social support was most common,</w:t>
+        <w:t>Coping mechanisms were documented in 14 studies (35.9%; Table 3). Peer, family, and social support was most common,</w:t>
       </w:r>
       <w:r>
         <w:rPr>
@@ -2721,7 +2855,7 @@
           <w:i w:val="0"/>
           <w:vertAlign w:val="superscript"/>
         </w:rPr>
-        <w:t>23,26,28,34,41,42</w:t>
+        <w:t>23,26,28,34,45,46</w:t>
       </w:r>
       <w:r>
         <w:rPr>
@@ -2736,7 +2870,7 @@
           <w:i w:val="0"/>
           <w:vertAlign w:val="superscript"/>
         </w:rPr>
-        <w:t>23,33,41,43</w:t>
+        <w:t>23,33,45,47</w:t>
       </w:r>
       <w:r>
         <w:rPr>
@@ -2751,7 +2885,7 @@
           <w:i w:val="0"/>
           <w:vertAlign w:val="superscript"/>
         </w:rPr>
-        <w:t>41</w:t>
+        <w:t>45</w:t>
       </w:r>
       <w:r>
         <w:rPr>
@@ -2781,7 +2915,7 @@
           <w:i w:val="0"/>
           <w:vertAlign w:val="superscript"/>
         </w:rPr>
-        <w:t>16,27,44</w:t>
+        <w:t>16,27,48</w:t>
       </w:r>
     </w:p>
     <w:p>
@@ -3327,7 +3461,7 @@
           <w:b w:val="0"/>
           <w:i w:val="0"/>
         </w:rPr>
-        <w:t>Healthcare system gaps were reported in 9 studies (26.5%; Table 4). Participants described providers with limited knowledge of MRKH and the need to advocate for themselves,</w:t>
+        <w:t>Healthcare system gaps were reported in 10 studies (25.6%; Table 4). Participants described providers with limited knowledge of MRKH and the need to advocate for themselves,</w:t>
       </w:r>
       <w:r>
         <w:rPr>
@@ -3335,7 +3469,7 @@
           <w:i w:val="0"/>
           <w:vertAlign w:val="superscript"/>
         </w:rPr>
-        <w:t>33,45</w:t>
+        <w:t>33,49</w:t>
       </w:r>
       <w:r>
         <w:rPr>
@@ -3350,7 +3484,22 @@
           <w:i w:val="0"/>
           <w:vertAlign w:val="superscript"/>
         </w:rPr>
-        <w:t>23,35,42</w:t>
+        <w:t>23,35,46</w:t>
+      </w:r>
+      <w:r>
+        <w:rPr>
+          <w:b w:val="0"/>
+          <w:i w:val="0"/>
+        </w:rPr>
+        <w:t xml:space="preserve"> confusion after medical encounters in several African countries,</w:t>
+      </w:r>
+      <w:r>
+        <w:rPr>
+          <w:b w:val="0"/>
+          <w:i w:val="0"/>
+          <w:vertAlign w:val="superscript"/>
+        </w:rPr>
+        <w:t>50</w:t>
       </w:r>
       <w:r>
         <w:rPr>
@@ -3365,7 +3514,7 @@
           <w:i w:val="0"/>
           <w:vertAlign w:val="superscript"/>
         </w:rPr>
-        <w:t>42,43,46</w:t>
+        <w:t>46,47,51</w:t>
       </w:r>
       <w:r>
         <w:rPr>
@@ -3380,7 +3529,7 @@
           <w:i w:val="0"/>
           <w:vertAlign w:val="superscript"/>
         </w:rPr>
-        <w:t>47</w:t>
+        <w:t>52</w:t>
       </w:r>
     </w:p>
     <w:p>
@@ -3691,7 +3840,7 @@
           <w:b w:val="0"/>
           <w:i w:val="0"/>
         </w:rPr>
-        <w:t>This scoping review mapped 34 studies published between 2019 and 2026 on the mental health and psychosocial outcomes of individuals with MRKH syndrome. Psychosexual and relational challenges were the most frequently reported outcome, reported in about seven of every ten studies, while quality of life, body image, self-esteem, and broader psychological distress were each reported in about half. Depression and anxiety were measured less often, and results were mixed. Coping was documented in about four in ten studies and relied largely on peer support and self-management, and about one in four studies described healthcare system gaps.</w:t>
+        <w:t>This scoping review mapped 39 studies published between 2019 and 2026 on the mental health and psychosocial outcomes of individuals with MRKH syndrome. Psychosexual and relational challenges were the most frequently reported outcome, reported in about two of every three studies, while broader psychological distress and quality of life, body image, and self-esteem were each reported in about half. Depression and anxiety were measured less often, and results were mixed. Coping was documented in more than one in three studies and relied largely on peer support and self-management, and about one in four studies described healthcare system gaps.</w:t>
       </w:r>
     </w:p>
     <w:p>
@@ -3810,7 +3959,7 @@
           <w:i w:val="0"/>
           <w:vertAlign w:val="superscript"/>
         </w:rPr>
-        <w:t>48</w:t>
+        <w:t>53</w:t>
       </w:r>
       <w:r>
         <w:rPr>
@@ -3825,7 +3974,7 @@
           <w:i w:val="0"/>
           <w:vertAlign w:val="superscript"/>
         </w:rPr>
-        <w:t>16,44</w:t>
+        <w:t>16,48</w:t>
       </w:r>
       <w:r>
         <w:rPr>
@@ -3871,7 +4020,7 @@
           <w:b w:val="0"/>
           <w:i w:val="0"/>
         </w:rPr>
-        <w:t xml:space="preserve"> participants described providers unfamiliar with the condition, insensitive communication, and scarce psychological and fertility counseling, indicating a gap between recommendations and practice. The evidence base is more geographically diverse than earlier literature—Asia contributed as many studies as Europe—yet only 1 study came from Africa and none from South America, where expectations regarding fertility, marriage, and womanhood and access to specialized care may differ substantially. Studies from Türkiye, Vietnam, and Japan illustrate how cultural context shapes experiences of diagnosis, disclosure, and infertility.</w:t>
+        <w:t xml:space="preserve"> participants described providers unfamiliar with the condition, insensitive communication, and scarce psychological and fertility counseling, indicating a gap between recommendations and practice. The evidence base is more geographically diverse than earlier literature—Asia contributed nearly as many studies as Europe—yet only 2 studies came from Africa and none from South America, where expectations regarding fertility, marriage, and womanhood and access to specialized care may differ substantially. Studies from Türkiye, Vietnam, and Japan illustrate how cultural context shapes experiences of diagnosis, disclosure, and infertility.</w:t>
       </w:r>
       <w:r>
         <w:rPr>
@@ -3879,7 +4028,7 @@
           <w:i w:val="0"/>
           <w:vertAlign w:val="superscript"/>
         </w:rPr>
-        <w:t>9,43,49</w:t>
+        <w:t>9,47,54</w:t>
       </w:r>
     </w:p>
     <w:p>
@@ -3927,7 +4076,7 @@
           <w:b w:val="0"/>
           <w:i w:val="0"/>
         </w:rPr>
-        <w:t xml:space="preserve">Strengths include an established methodological framework, PRISMA-ScR reporting, a search of biomedical, nursing, psychological, and women's studies databases, and inclusion of quantitative, qualitative, and mixed-methods evidence. The most important limitation is that the original screening records were lost and selection was repeated from the original exports with AI-assisted screening and abstract-level data charting; results are therefore provisional until reviewer verification and full-text assessment of the 46 eligible records are complete. In addition, the review was limited to 2019–2026, date limits were applied inconsistently across database interfaces and enforced at screening, designs and measures were heterogeneous, and some studies may share samples. Consistent with scoping methodology, study quality was not appraised, and counts reflect how often outcomes were studied, not their prevalence. </w:t>
+        <w:t xml:space="preserve">Strengths include an established methodological framework, PRISMA-ScR reporting, a search of biomedical, nursing, psychological, and women's studies databases, and inclusion of quantitative, qualitative, and mixed-methods evidence. The most important limitation is that the original screening records were lost and selection was repeated from the original exports with AI-assisted screening and abstract-level data charting; results are therefore provisional until reviewer verification and full-text confirmation of the 39 included studies are complete. In addition, the review was limited to 2019–2026, date limits were applied inconsistently across database interfaces and enforced at screening, designs and measures were heterogeneous, and some studies may share samples. Consistent with scoping methodology, study quality was not appraised, and counts reflect how often outcomes were studied, not their prevalence. </w:t>
       </w:r>
       <w:r>
         <w:rPr>
@@ -5113,21 +5262,21 @@
         </w:rPr>
         <w:t>36.</w:t>
         <w:tab/>
-        <w:t xml:space="preserve">Khairudin KB, Nik Mhd Nor NS, Childs JF, et al. Prevalence of anxiety and depression in women with Mayer-Rokitansky-Kϋster-Hauser (MRKH) syndrome in Malaysia. </w:t>
+        <w:t xml:space="preserve">Gueniche K, Vibert S, Guinard M, Polak M, Le ’Study Group’ MRKH. Quand le féminin est mis à mal … À propos d’une prise de poids significative chez des jeunes femmes en post-annonce diagnostique d’une agénésie utéro-vaginale. </w:t>
       </w:r>
       <w:r>
         <w:rPr>
           <w:b w:val="0"/>
           <w:i/>
         </w:rPr>
-        <w:t>J Pediatr Adolesc Gynecol</w:t>
-      </w:r>
-      <w:r>
-        <w:rPr>
-          <w:b w:val="0"/>
-          <w:i w:val="0"/>
-        </w:rPr>
-        <w:t>. 2026;39(2):215-220. doi:10.1016/j.jpag.2025.11.005</w:t>
+        <w:t>L'Évolution Psychiatrique</w:t>
+      </w:r>
+      <w:r>
+        <w:rPr>
+          <w:b w:val="0"/>
+          <w:i w:val="0"/>
+        </w:rPr>
+        <w:t>. 2020;85(4):607-618. doi:10.1016/j.evopsy.2020.05.001</w:t>
       </w:r>
     </w:p>
     <w:p>
@@ -5141,21 +5290,21 @@
         </w:rPr>
         <w:t>37.</w:t>
         <w:tab/>
-        <w:t xml:space="preserve">Lei XH, Wang X, Shao SY, Hua KQ, Zhang Y. Self-esteem, depression, anxiety and sexual function in Mayer-Rokitansky-Küster-Hauser syndrome with neovagina: A case series. </w:t>
+        <w:t xml:space="preserve">Järvholm S, Enskog A, Hammarling C, Dahm-Kähler P, Brännström M. Uterus transplantation: Joys and frustrations of becoming a 'complete' woman-a qualitative study regarding self-image in the 5-year period after transplantation. </w:t>
       </w:r>
       <w:r>
         <w:rPr>
           <w:b w:val="0"/>
           <w:i/>
         </w:rPr>
-        <w:t>Eur J Obstet Gynecol Reprod Biol</w:t>
-      </w:r>
-      <w:r>
-        <w:rPr>
-          <w:b w:val="0"/>
-          <w:i w:val="0"/>
-        </w:rPr>
-        <w:t>. 2024;298:85-90. doi:10.1016/j.ejogrb.2024.04.027</w:t>
+        <w:t>Human Reproduction</w:t>
+      </w:r>
+      <w:r>
+        <w:rPr>
+          <w:b w:val="0"/>
+          <w:i w:val="0"/>
+        </w:rPr>
+        <w:t>. 2020;35(8):1855-1863. doi:10.1093/humrep/deaa143</w:t>
       </w:r>
     </w:p>
     <w:p>
@@ -5169,21 +5318,21 @@
         </w:rPr>
         <w:t>38.</w:t>
         <w:tab/>
-        <w:t xml:space="preserve">Sorouri Khorashad B, Kaabi O, Gardner MD, et al. Psychiatric comorbidities in women with complete androgen insensitivity syndrome or Müllerian duct aplasia/Agenesis. </w:t>
+        <w:t xml:space="preserve">Khairudin KB, Nik Mhd Nor NS, Childs JF, et al. Prevalence of anxiety and depression in women with Mayer-Rokitansky-Kϋster-Hauser (MRKH) syndrome in Malaysia. </w:t>
       </w:r>
       <w:r>
         <w:rPr>
           <w:b w:val="0"/>
           <w:i/>
         </w:rPr>
-        <w:t>J Clin Endocrinol Metab</w:t>
-      </w:r>
-      <w:r>
-        <w:rPr>
-          <w:b w:val="0"/>
-          <w:i w:val="0"/>
-        </w:rPr>
-        <w:t>. 2025;110(7):1906-1914. doi:10.1210/clinem/dgae720</w:t>
+        <w:t>J Pediatr Adolesc Gynecol</w:t>
+      </w:r>
+      <w:r>
+        <w:rPr>
+          <w:b w:val="0"/>
+          <w:i w:val="0"/>
+        </w:rPr>
+        <w:t>. 2026;39(2):215-220. doi:10.1016/j.jpag.2025.11.005</w:t>
       </w:r>
     </w:p>
     <w:p>
@@ -5197,21 +5346,21 @@
         </w:rPr>
         <w:t>39.</w:t>
         <w:tab/>
-        <w:t xml:space="preserve">Karpel L, Nicaise M, Carbonnel M, et al. Psychological evaluation of candidates for the uterus transplantation French trial. </w:t>
+        <w:t xml:space="preserve">Lei XH, Wang X, Shao SY, Hua KQ, Zhang Y. Self-esteem, depression, anxiety and sexual function in Mayer-Rokitansky-Küster-Hauser syndrome with neovagina: A case series. </w:t>
       </w:r>
       <w:r>
         <w:rPr>
           <w:b w:val="0"/>
           <w:i/>
         </w:rPr>
-        <w:t>Acta Obstet Gynecol Scand</w:t>
-      </w:r>
-      <w:r>
-        <w:rPr>
-          <w:b w:val="0"/>
-          <w:i w:val="0"/>
-        </w:rPr>
-        <w:t>. 2025;104(3):522-527. doi:10.1111/aogs.15004</w:t>
+        <w:t>Eur J Obstet Gynecol Reprod Biol</w:t>
+      </w:r>
+      <w:r>
+        <w:rPr>
+          <w:b w:val="0"/>
+          <w:i w:val="0"/>
+        </w:rPr>
+        <w:t>. 2024;298:85-90. doi:10.1016/j.ejogrb.2024.04.027</w:t>
       </w:r>
     </w:p>
     <w:p>
@@ -5225,21 +5374,21 @@
         </w:rPr>
         <w:t>40.</w:t>
         <w:tab/>
-        <w:t xml:space="preserve">Jha S, Singh S. Sexual and psychosocial outcome after neovaginoplasty using Interceed in females with Mayer-Rokitansky-Küster-Hauser syndrome: A case-control study. </w:t>
+        <w:t xml:space="preserve">Sorouri Khorashad B, Kaabi O, Gardner MD, et al. Psychiatric comorbidities in women with complete androgen insensitivity syndrome or Müllerian duct aplasia/Agenesis. </w:t>
       </w:r>
       <w:r>
         <w:rPr>
           <w:b w:val="0"/>
           <w:i/>
         </w:rPr>
-        <w:t>J Obstet Gynaecol Can</w:t>
-      </w:r>
-      <w:r>
-        <w:rPr>
-          <w:b w:val="0"/>
-          <w:i w:val="0"/>
-        </w:rPr>
-        <w:t>. 2022;44(8):926-930. doi:10.1016/j.jogc.2022.03.018</w:t>
+        <w:t>J Clin Endocrinol Metab</w:t>
+      </w:r>
+      <w:r>
+        <w:rPr>
+          <w:b w:val="0"/>
+          <w:i w:val="0"/>
+        </w:rPr>
+        <w:t>. 2025;110(7):1906-1914. doi:10.1210/clinem/dgae720</w:t>
       </w:r>
     </w:p>
     <w:p>
@@ -5253,21 +5402,21 @@
         </w:rPr>
         <w:t>41.</w:t>
         <w:tab/>
-        <w:t xml:space="preserve">Güner P, Ulukaya T. From avoidance to empowerment: Coping strategies in women with Müllerian agenesis (MRKH) after McIndoe reconstruction: A descriptive phenomenological study. </w:t>
+        <w:t xml:space="preserve">Karpel L, Nicaise M, Carbonnel M, et al. Psychological evaluation of candidates for the uterus transplantation French trial. </w:t>
       </w:r>
       <w:r>
         <w:rPr>
           <w:b w:val="0"/>
           <w:i/>
         </w:rPr>
-        <w:t>J Pediatr Adolesc Gynecol</w:t>
-      </w:r>
-      <w:r>
-        <w:rPr>
-          <w:b w:val="0"/>
-          <w:i w:val="0"/>
-        </w:rPr>
-        <w:t>. 2026;39(1):101-108. doi:10.1016/j.jpag.2025.10.013</w:t>
+        <w:t>Acta Obstet Gynecol Scand</w:t>
+      </w:r>
+      <w:r>
+        <w:rPr>
+          <w:b w:val="0"/>
+          <w:i w:val="0"/>
+        </w:rPr>
+        <w:t>. 2025;104(3):522-527. doi:10.1111/aogs.15004</w:t>
       </w:r>
     </w:p>
     <w:p>
@@ -5281,21 +5430,21 @@
         </w:rPr>
         <w:t>42.</w:t>
         <w:tab/>
-        <w:t xml:space="preserve">Hatim H, Zainuddin AA, Anizah A, et al. The missing uterus, the missed diagnosis, and the missing care. Mayer-Rokitansky-Küster-Hauser syndrome in the lives of women in Malaysia. </w:t>
+        <w:t xml:space="preserve">Jha S, Singh S. Sexual and psychosocial outcome after neovaginoplasty using Interceed in females with Mayer-Rokitansky-Küster-Hauser syndrome: A case-control study. </w:t>
       </w:r>
       <w:r>
         <w:rPr>
           <w:b w:val="0"/>
           <w:i/>
         </w:rPr>
-        <w:t>J Pediatr Adolesc Gynecol</w:t>
-      </w:r>
-      <w:r>
-        <w:rPr>
-          <w:b w:val="0"/>
-          <w:i w:val="0"/>
-        </w:rPr>
-        <w:t>. 2021;34(2):161-167. doi:10.1016/j.jpag.2020.11.009</w:t>
+        <w:t>J Obstet Gynaecol Can</w:t>
+      </w:r>
+      <w:r>
+        <w:rPr>
+          <w:b w:val="0"/>
+          <w:i w:val="0"/>
+        </w:rPr>
+        <w:t>. 2022;44(8):926-930. doi:10.1016/j.jogc.2022.03.018</w:t>
       </w:r>
     </w:p>
     <w:p>
@@ -5309,21 +5458,21 @@
         </w:rPr>
         <w:t>43.</w:t>
         <w:tab/>
-        <w:t xml:space="preserve">Le TTQ, Le NTH, Vu TA, Nguyen HH, Vuong LN. Perception of having children through surrogacy in individuals with MRKH in Vietnam: a qualitative study. </w:t>
+        <w:t xml:space="preserve">Scollo P, Pecorino B, La Spina S, Veroux P, Giaquinta A, Scibilia G. Psychological and personality assessment in patients candidates for Uterus Transplantation from deceased donor: preliminary results. </w:t>
       </w:r>
       <w:r>
         <w:rPr>
           <w:b w:val="0"/>
           <w:i/>
         </w:rPr>
-        <w:t>Front Psychol</w:t>
-      </w:r>
-      <w:r>
-        <w:rPr>
-          <w:b w:val="0"/>
-          <w:i w:val="0"/>
-        </w:rPr>
-        <w:t>. 2024;15:1372405. doi:10.3389/fpsyg.2024.1372405</w:t>
+        <w:t>Italian Journal of Gynaecology and Obstetrics</w:t>
+      </w:r>
+      <w:r>
+        <w:rPr>
+          <w:b w:val="0"/>
+          <w:i w:val="0"/>
+        </w:rPr>
+        <w:t>. 2020;32(4):287-292. doi:10.36129/jog.32.04.08</w:t>
       </w:r>
     </w:p>
     <w:p>
@@ -5337,21 +5486,21 @@
         </w:rPr>
         <w:t>44.</w:t>
         <w:tab/>
-        <w:t xml:space="preserve">Shao S, Wang X, Lei X, Hua K, Zhang Y. Psychological intervention in women with Mayer-Rokitansky-Küster-Hauser syndrome after artificial vaginoplasty: a prospective study. </w:t>
+        <w:t xml:space="preserve">Pittman J, Gerstl B, Walch A, Lotz M, Deans R, Morrison N. Psychological well-being of women with uterine infertility before considering uterus transplantation as a treatment option. </w:t>
       </w:r>
       <w:r>
         <w:rPr>
           <w:b w:val="0"/>
           <w:i/>
         </w:rPr>
-        <w:t>Int Urogynecol J</w:t>
-      </w:r>
-      <w:r>
-        <w:rPr>
-          <w:b w:val="0"/>
-          <w:i w:val="0"/>
-        </w:rPr>
-        <w:t>. 2022;33(3):723-729. doi:10.1007/s00192-022-05075-y</w:t>
+        <w:t>Aust N Z J Obstet Gynaecol</w:t>
+      </w:r>
+      <w:r>
+        <w:rPr>
+          <w:b w:val="0"/>
+          <w:i w:val="0"/>
+        </w:rPr>
+        <w:t>. 2025;65(2):263-268. doi:10.1111/ajo.13895</w:t>
       </w:r>
     </w:p>
     <w:p>
@@ -5365,7 +5514,7 @@
         </w:rPr>
         <w:t>45.</w:t>
         <w:tab/>
-        <w:t xml:space="preserve">Marshall N, Rajesh Z, Hunker K, et al. "Don't give up, advocate for yourself": A pilot study examining healthcare experiences of people with Mayer Rokitansky Küster Hauser syndrome. </w:t>
+        <w:t xml:space="preserve">Güner P, Ulukaya T. From avoidance to empowerment: Coping strategies in women with Müllerian agenesis (MRKH) after McIndoe reconstruction: A descriptive phenomenological study. </w:t>
       </w:r>
       <w:r>
         <w:rPr>
@@ -5379,7 +5528,7 @@
           <w:b w:val="0"/>
           <w:i w:val="0"/>
         </w:rPr>
-        <w:t>. 2025;38(2):167-173. doi:10.1016/j.jpag.2024.12.001</w:t>
+        <w:t>. 2026;39(1):101-108. doi:10.1016/j.jpag.2025.10.013</w:t>
       </w:r>
     </w:p>
     <w:p>
@@ -5393,21 +5542,21 @@
         </w:rPr>
         <w:t>46.</w:t>
         <w:tab/>
-        <w:t xml:space="preserve">Di Mattei VE, Taranto P, Perego G, et al. Illness experience and (unmet) needs of women with Mayer-Rokitansky-Küster-Hauser Syndrome (MRKH): a qualitative analysis of an online forum. </w:t>
+        <w:t xml:space="preserve">Hatim H, Zainuddin AA, Anizah A, et al. The missing uterus, the missed diagnosis, and the missing care. Mayer-Rokitansky-Küster-Hauser syndrome in the lives of women in Malaysia. </w:t>
       </w:r>
       <w:r>
         <w:rPr>
           <w:b w:val="0"/>
           <w:i/>
         </w:rPr>
-        <w:t>Psychol Health</w:t>
-      </w:r>
-      <w:r>
-        <w:rPr>
-          <w:b w:val="0"/>
-          <w:i w:val="0"/>
-        </w:rPr>
-        <w:t>. 2026;41(1):53-75. doi:10.1080/08870446.2024.2390647</w:t>
+        <w:t>J Pediatr Adolesc Gynecol</w:t>
+      </w:r>
+      <w:r>
+        <w:rPr>
+          <w:b w:val="0"/>
+          <w:i w:val="0"/>
+        </w:rPr>
+        <w:t>. 2021;34(2):161-167. doi:10.1016/j.jpag.2020.11.009</w:t>
       </w:r>
     </w:p>
     <w:p>
@@ -5421,21 +5570,21 @@
         </w:rPr>
         <w:t>47.</w:t>
         <w:tab/>
-        <w:t xml:space="preserve">Pennesi CM, Berkeley J, Lossie AC, Quint EH, Zieman KD, Carroll S. International experiences with vaginal lengthening treatment among individuals with Müllerian agenesis: A mixed-methods study. </w:t>
+        <w:t xml:space="preserve">Le TTQ, Le NTH, Vu TA, Nguyen HH, Vuong LN. Perception of having children through surrogacy in individuals with MRKH in Vietnam: a qualitative study. </w:t>
       </w:r>
       <w:r>
         <w:rPr>
           <w:b w:val="0"/>
           <w:i/>
         </w:rPr>
-        <w:t>J Pediatr Adolesc Gynecol</w:t>
-      </w:r>
-      <w:r>
-        <w:rPr>
-          <w:b w:val="0"/>
-          <w:i w:val="0"/>
-        </w:rPr>
-        <w:t>. 2023;36(5):476-483. doi:10.1016/j.jpag.2023.05.004</w:t>
+        <w:t>Front Psychol</w:t>
+      </w:r>
+      <w:r>
+        <w:rPr>
+          <w:b w:val="0"/>
+          <w:i w:val="0"/>
+        </w:rPr>
+        <w:t>. 2024;15:1372405. doi:10.3389/fpsyg.2024.1372405</w:t>
       </w:r>
     </w:p>
     <w:p>
@@ -5449,21 +5598,21 @@
         </w:rPr>
         <w:t>48.</w:t>
         <w:tab/>
-        <w:t xml:space="preserve">Heller-Boersma JG, Schmidt UH, Edmonds DK. A randomized controlled trial of a cognitive-behavioural group intervention versus waiting-list control for women with uterovaginal agenesis (Mayer-Rokitansky-Küster-Hauser syndrome: MRKH). </w:t>
+        <w:t xml:space="preserve">Shao S, Wang X, Lei X, Hua K, Zhang Y. Psychological intervention in women with Mayer-Rokitansky-Küster-Hauser syndrome after artificial vaginoplasty: a prospective study. </w:t>
       </w:r>
       <w:r>
         <w:rPr>
           <w:b w:val="0"/>
           <w:i/>
         </w:rPr>
-        <w:t>Hum Reprod</w:t>
-      </w:r>
-      <w:r>
-        <w:rPr>
-          <w:b w:val="0"/>
-          <w:i w:val="0"/>
-        </w:rPr>
-        <w:t>. 2007;22(8):2296-2301. doi:10.1093/humrep/dem167</w:t>
+        <w:t>Int Urogynecol J</w:t>
+      </w:r>
+      <w:r>
+        <w:rPr>
+          <w:b w:val="0"/>
+          <w:i w:val="0"/>
+        </w:rPr>
+        <w:t>. 2022;33(3):723-729. doi:10.1007/s00192-022-05075-y</w:t>
       </w:r>
     </w:p>
     <w:p>
@@ -5476,6 +5625,146 @@
           <w:i w:val="0"/>
         </w:rPr>
         <w:t>49.</w:t>
+        <w:tab/>
+        <w:t xml:space="preserve">Marshall N, Rajesh Z, Hunker K, et al. "Don't give up, advocate for yourself": A pilot study examining healthcare experiences of people with Mayer Rokitansky Küster Hauser syndrome. </w:t>
+      </w:r>
+      <w:r>
+        <w:rPr>
+          <w:b w:val="0"/>
+          <w:i/>
+        </w:rPr>
+        <w:t>J Pediatr Adolesc Gynecol</w:t>
+      </w:r>
+      <w:r>
+        <w:rPr>
+          <w:b w:val="0"/>
+          <w:i w:val="0"/>
+        </w:rPr>
+        <w:t>. 2025;38(2):167-173. doi:10.1016/j.jpag.2024.12.001</w:t>
+      </w:r>
+    </w:p>
+    <w:p>
+      <w:pPr>
+        <w:ind w:left="504" w:hanging="504"/>
+      </w:pPr>
+      <w:r>
+        <w:rPr>
+          <w:b w:val="0"/>
+          <w:i w:val="0"/>
+        </w:rPr>
+        <w:t>50.</w:t>
+        <w:tab/>
+        <w:t xml:space="preserve">Ngoumou R.-D.. How does the experience of the medical encounter with Mayer-Rokitansky-Küster-Hauser (MRKH) Syndrome impact women in Africa?. </w:t>
+      </w:r>
+      <w:r>
+        <w:rPr>
+          <w:b w:val="0"/>
+          <w:i/>
+        </w:rPr>
+        <w:t>Pan African Medical Journal</w:t>
+      </w:r>
+      <w:r>
+        <w:rPr>
+          <w:b w:val="0"/>
+          <w:i w:val="0"/>
+        </w:rPr>
+        <w:t>. 2022;42:314. doi:10.11604/pamj.2022.42.314.32830</w:t>
+      </w:r>
+    </w:p>
+    <w:p>
+      <w:pPr>
+        <w:ind w:left="504" w:hanging="504"/>
+      </w:pPr>
+      <w:r>
+        <w:rPr>
+          <w:b w:val="0"/>
+          <w:i w:val="0"/>
+        </w:rPr>
+        <w:t>51.</w:t>
+        <w:tab/>
+        <w:t xml:space="preserve">Di Mattei VE, Taranto P, Perego G, et al. Illness experience and (unmet) needs of women with Mayer-Rokitansky-Küster-Hauser Syndrome (MRKH): a qualitative analysis of an online forum. </w:t>
+      </w:r>
+      <w:r>
+        <w:rPr>
+          <w:b w:val="0"/>
+          <w:i/>
+        </w:rPr>
+        <w:t>Psychol Health</w:t>
+      </w:r>
+      <w:r>
+        <w:rPr>
+          <w:b w:val="0"/>
+          <w:i w:val="0"/>
+        </w:rPr>
+        <w:t>. 2026;41(1):53-75. doi:10.1080/08870446.2024.2390647</w:t>
+      </w:r>
+    </w:p>
+    <w:p>
+      <w:pPr>
+        <w:ind w:left="504" w:hanging="504"/>
+      </w:pPr>
+      <w:r>
+        <w:rPr>
+          <w:b w:val="0"/>
+          <w:i w:val="0"/>
+        </w:rPr>
+        <w:t>52.</w:t>
+        <w:tab/>
+        <w:t xml:space="preserve">Pennesi CM, Berkeley J, Lossie AC, Quint EH, Zieman KD, Carroll S. International experiences with vaginal lengthening treatment among individuals with Müllerian agenesis: A mixed-methods study. </w:t>
+      </w:r>
+      <w:r>
+        <w:rPr>
+          <w:b w:val="0"/>
+          <w:i/>
+        </w:rPr>
+        <w:t>J Pediatr Adolesc Gynecol</w:t>
+      </w:r>
+      <w:r>
+        <w:rPr>
+          <w:b w:val="0"/>
+          <w:i w:val="0"/>
+        </w:rPr>
+        <w:t>. 2023;36(5):476-483. doi:10.1016/j.jpag.2023.05.004</w:t>
+      </w:r>
+    </w:p>
+    <w:p>
+      <w:pPr>
+        <w:ind w:left="504" w:hanging="504"/>
+      </w:pPr>
+      <w:r>
+        <w:rPr>
+          <w:b w:val="0"/>
+          <w:i w:val="0"/>
+        </w:rPr>
+        <w:t>53.</w:t>
+        <w:tab/>
+        <w:t xml:space="preserve">Heller-Boersma JG, Schmidt UH, Edmonds DK. A randomized controlled trial of a cognitive-behavioural group intervention versus waiting-list control for women with uterovaginal agenesis (Mayer-Rokitansky-Küster-Hauser syndrome: MRKH). </w:t>
+      </w:r>
+      <w:r>
+        <w:rPr>
+          <w:b w:val="0"/>
+          <w:i/>
+        </w:rPr>
+        <w:t>Hum Reprod</w:t>
+      </w:r>
+      <w:r>
+        <w:rPr>
+          <w:b w:val="0"/>
+          <w:i w:val="0"/>
+        </w:rPr>
+        <w:t>. 2007;22(8):2296-2301. doi:10.1093/humrep/dem167</w:t>
+      </w:r>
+    </w:p>
+    <w:p>
+      <w:pPr>
+        <w:ind w:left="504" w:hanging="504"/>
+      </w:pPr>
+      <w:r>
+        <w:rPr>
+          <w:b w:val="0"/>
+          <w:i w:val="0"/>
+        </w:rPr>
+        <w:t>54.</w:t>
         <w:tab/>
         <w:t xml:space="preserve">Okunomiya A, Tsuyuki K, Ohsuga T, et al. Long-term psychosocial outcomes in Japanese Mayer-Rokitansky-Küster-Hauser syndrome: a single-center study. </w:t>
       </w:r>
@@ -6917,7 +7206,7 @@
                 <w:sz w:val="16"/>
                 <w:vertAlign w:val="superscript"/>
               </w:rPr>
-              <w:t>46</w:t>
+              <w:t>51</w:t>
             </w:r>
           </w:p>
         </w:tc>
@@ -7158,7 +7447,7 @@
                 <w:i w:val="0"/>
                 <w:sz w:val="16"/>
               </w:rPr>
-              <w:t>Güner 2025</w:t>
+              <w:t>Gueniche 2020</w:t>
             </w:r>
             <w:r>
               <w:rPr>
@@ -7167,7 +7456,7 @@
                 <w:sz w:val="16"/>
                 <w:vertAlign w:val="superscript"/>
               </w:rPr>
-              <w:t>9</w:t>
+              <w:t>36</w:t>
             </w:r>
           </w:p>
         </w:tc>
@@ -7186,7 +7475,7 @@
                 <w:i w:val="0"/>
                 <w:sz w:val="16"/>
               </w:rPr>
-              <w:t>Türkiye</w:t>
+              <w:t>France</w:t>
             </w:r>
           </w:p>
         </w:tc>
@@ -7205,7 +7494,7 @@
                 <w:i w:val="0"/>
                 <w:sz w:val="16"/>
               </w:rPr>
-              <w:t>Phenomenological interviews</w:t>
+              <w:t>Clinical interviews and projective tests</w:t>
             </w:r>
           </w:p>
         </w:tc>
@@ -7224,7 +7513,7 @@
                 <w:i w:val="0"/>
                 <w:sz w:val="16"/>
               </w:rPr>
-              <w:t>10</w:t>
+              <w:t>40</w:t>
             </w:r>
           </w:p>
         </w:tc>
@@ -7243,7 +7532,7 @@
                 <w:i w:val="0"/>
                 <w:sz w:val="16"/>
               </w:rPr>
-              <w:t>S P</w:t>
+              <w:t>P</w:t>
             </w:r>
           </w:p>
         </w:tc>
@@ -7283,7 +7572,7 @@
                 <w:i w:val="0"/>
                 <w:sz w:val="16"/>
               </w:rPr>
-              <w:t>Güner 2026</w:t>
+              <w:t>Güner 2025</w:t>
             </w:r>
             <w:r>
               <w:rPr>
@@ -7292,7 +7581,7 @@
                 <w:sz w:val="16"/>
                 <w:vertAlign w:val="superscript"/>
               </w:rPr>
-              <w:t>41</w:t>
+              <w:t>9</w:t>
             </w:r>
           </w:p>
         </w:tc>
@@ -7330,7 +7619,7 @@
                 <w:i w:val="0"/>
                 <w:sz w:val="16"/>
               </w:rPr>
-              <w:t>Descriptive phenomenological interviews</w:t>
+              <w:t>Phenomenological interviews</w:t>
             </w:r>
           </w:p>
         </w:tc>
@@ -7368,7 +7657,7 @@
                 <w:i w:val="0"/>
                 <w:sz w:val="16"/>
               </w:rPr>
-              <w:t>S P C</w:t>
+              <w:t>S P</w:t>
             </w:r>
           </w:p>
         </w:tc>
@@ -7387,7 +7676,7 @@
                 <w:i w:val="0"/>
                 <w:sz w:val="16"/>
               </w:rPr>
-              <w:t>Avoidance / concealment (maladaptive); Identity reconstruction / positive reappraisal; Spiritual coping; Peer, family &amp; social support</w:t>
+              <w:t>—</w:t>
             </w:r>
           </w:p>
         </w:tc>
@@ -7408,7 +7697,7 @@
                 <w:i w:val="0"/>
                 <w:sz w:val="16"/>
               </w:rPr>
-              <w:t>Hatim 2021</w:t>
+              <w:t>Güner 2026</w:t>
             </w:r>
             <w:r>
               <w:rPr>
@@ -7417,7 +7706,7 @@
                 <w:sz w:val="16"/>
                 <w:vertAlign w:val="superscript"/>
               </w:rPr>
-              <w:t>42</w:t>
+              <w:t>45</w:t>
             </w:r>
           </w:p>
         </w:tc>
@@ -7436,7 +7725,7 @@
                 <w:i w:val="0"/>
                 <w:sz w:val="16"/>
               </w:rPr>
-              <w:t>Malaysia</w:t>
+              <w:t>Türkiye</w:t>
             </w:r>
           </w:p>
         </w:tc>
@@ -7455,7 +7744,7 @@
                 <w:i w:val="0"/>
                 <w:sz w:val="16"/>
               </w:rPr>
-              <w:t>Qualitative with quantitative component</w:t>
+              <w:t>Descriptive phenomenological interviews</w:t>
             </w:r>
           </w:p>
         </w:tc>
@@ -7474,7 +7763,7 @@
                 <w:i w:val="0"/>
                 <w:sz w:val="16"/>
               </w:rPr>
-              <w:t>12</w:t>
+              <w:t>10</w:t>
             </w:r>
           </w:p>
         </w:tc>
@@ -7493,7 +7782,7 @@
                 <w:i w:val="0"/>
                 <w:sz w:val="16"/>
               </w:rPr>
-              <w:t>S P C H</w:t>
+              <w:t>S P C</w:t>
             </w:r>
           </w:p>
         </w:tc>
@@ -7512,7 +7801,7 @@
                 <w:i w:val="0"/>
                 <w:sz w:val="16"/>
               </w:rPr>
-              <w:t>Peer, family &amp; social support</w:t>
+              <w:t>Avoidance / concealment (maladaptive); Identity reconstruction / positive reappraisal; Spiritual coping; Peer, family &amp; social support</w:t>
             </w:r>
           </w:p>
         </w:tc>
@@ -7533,7 +7822,7 @@
                 <w:i w:val="0"/>
                 <w:sz w:val="16"/>
               </w:rPr>
-              <w:t>Jensen 2024</w:t>
+              <w:t>Hatim 2021</w:t>
             </w:r>
             <w:r>
               <w:rPr>
@@ -7542,7 +7831,7 @@
                 <w:sz w:val="16"/>
                 <w:vertAlign w:val="superscript"/>
               </w:rPr>
-              <w:t>34</w:t>
+              <w:t>46</w:t>
             </w:r>
           </w:p>
         </w:tc>
@@ -7561,7 +7850,7 @@
                 <w:i w:val="0"/>
                 <w:sz w:val="16"/>
               </w:rPr>
-              <w:t>Denmark</w:t>
+              <w:t>Malaysia</w:t>
             </w:r>
           </w:p>
         </w:tc>
@@ -7580,7 +7869,7 @@
                 <w:i w:val="0"/>
                 <w:sz w:val="16"/>
               </w:rPr>
-              <w:t>Semi-structured interviews (life course)</w:t>
+              <w:t>Qualitative with quantitative component</w:t>
             </w:r>
           </w:p>
         </w:tc>
@@ -7599,7 +7888,7 @@
                 <w:i w:val="0"/>
                 <w:sz w:val="16"/>
               </w:rPr>
-              <w:t>18</w:t>
+              <w:t>12</w:t>
             </w:r>
           </w:p>
         </w:tc>
@@ -7667,7 +7956,7 @@
                 <w:sz w:val="16"/>
                 <w:vertAlign w:val="superscript"/>
               </w:rPr>
-              <w:t>21</w:t>
+              <w:t>34</w:t>
             </w:r>
           </w:p>
         </w:tc>
@@ -7705,7 +7994,7 @@
                 <w:i w:val="0"/>
                 <w:sz w:val="16"/>
               </w:rPr>
-              <w:t>Semi-structured interviews</w:t>
+              <w:t>Semi-structured interviews (life course)</w:t>
             </w:r>
           </w:p>
         </w:tc>
@@ -7743,7 +8032,7 @@
                 <w:i w:val="0"/>
                 <w:sz w:val="16"/>
               </w:rPr>
-              <w:t>Q S P</w:t>
+              <w:t>S P C H</w:t>
             </w:r>
           </w:p>
         </w:tc>
@@ -7762,7 +8051,7 @@
                 <w:i w:val="0"/>
                 <w:sz w:val="16"/>
               </w:rPr>
-              <w:t>—</w:t>
+              <w:t>Peer, family &amp; social support</w:t>
             </w:r>
           </w:p>
         </w:tc>
@@ -7783,7 +8072,7 @@
                 <w:i w:val="0"/>
                 <w:sz w:val="16"/>
               </w:rPr>
-              <w:t>Jha 2022</w:t>
+              <w:t>Jensen 2024</w:t>
             </w:r>
             <w:r>
               <w:rPr>
@@ -7792,7 +8081,7 @@
                 <w:sz w:val="16"/>
                 <w:vertAlign w:val="superscript"/>
               </w:rPr>
-              <w:t>40</w:t>
+              <w:t>21</w:t>
             </w:r>
           </w:p>
         </w:tc>
@@ -7811,7 +8100,7 @@
                 <w:i w:val="0"/>
                 <w:sz w:val="16"/>
               </w:rPr>
-              <w:t>India</w:t>
+              <w:t>Denmark</w:t>
             </w:r>
           </w:p>
         </w:tc>
@@ -7830,7 +8119,7 @@
                 <w:i w:val="0"/>
                 <w:sz w:val="16"/>
               </w:rPr>
-              <w:t>Case-control</w:t>
+              <w:t>Semi-structured interviews</w:t>
             </w:r>
           </w:p>
         </w:tc>
@@ -7849,7 +8138,7 @@
                 <w:i w:val="0"/>
                 <w:sz w:val="16"/>
               </w:rPr>
-              <w:t>NR</w:t>
+              <w:t>18</w:t>
             </w:r>
           </w:p>
         </w:tc>
@@ -7868,7 +8157,7 @@
                 <w:i w:val="0"/>
                 <w:sz w:val="16"/>
               </w:rPr>
-              <w:t>D Q S</w:t>
+              <w:t>Q S P</w:t>
             </w:r>
           </w:p>
         </w:tc>
@@ -7908,7 +8197,7 @@
                 <w:i w:val="0"/>
                 <w:sz w:val="16"/>
               </w:rPr>
-              <w:t>Kang 2020</w:t>
+              <w:t>Jha 2022</w:t>
             </w:r>
             <w:r>
               <w:rPr>
@@ -7917,7 +8206,7 @@
                 <w:sz w:val="16"/>
                 <w:vertAlign w:val="superscript"/>
               </w:rPr>
-              <w:t>30</w:t>
+              <w:t>42</w:t>
             </w:r>
           </w:p>
         </w:tc>
@@ -7936,7 +8225,7 @@
                 <w:i w:val="0"/>
                 <w:sz w:val="16"/>
               </w:rPr>
-              <w:t>China</w:t>
+              <w:t>India</w:t>
             </w:r>
           </w:p>
         </w:tc>
@@ -7955,7 +8244,7 @@
                 <w:i w:val="0"/>
                 <w:sz w:val="16"/>
               </w:rPr>
-              <w:t>Cross-sectional</w:t>
+              <w:t>Case-control</w:t>
             </w:r>
           </w:p>
         </w:tc>
@@ -7974,7 +8263,7 @@
                 <w:i w:val="0"/>
                 <w:sz w:val="16"/>
               </w:rPr>
-              <w:t>133</w:t>
+              <w:t>NR</w:t>
             </w:r>
           </w:p>
         </w:tc>
@@ -7993,7 +8282,7 @@
                 <w:i w:val="0"/>
                 <w:sz w:val="16"/>
               </w:rPr>
-              <w:t>Q S</w:t>
+              <w:t>D Q S</w:t>
             </w:r>
           </w:p>
         </w:tc>
@@ -8033,7 +8322,7 @@
                 <w:i w:val="0"/>
                 <w:sz w:val="16"/>
               </w:rPr>
-              <w:t>Karpel 2025</w:t>
+              <w:t>Järvholm 2020</w:t>
             </w:r>
             <w:r>
               <w:rPr>
@@ -8042,7 +8331,7 @@
                 <w:sz w:val="16"/>
                 <w:vertAlign w:val="superscript"/>
               </w:rPr>
-              <w:t>39</w:t>
+              <w:t>37</w:t>
             </w:r>
           </w:p>
         </w:tc>
@@ -8061,7 +8350,7 @@
                 <w:i w:val="0"/>
                 <w:sz w:val="16"/>
               </w:rPr>
-              <w:t>France</w:t>
+              <w:t>Sweden</w:t>
             </w:r>
           </w:p>
         </w:tc>
@@ -8080,7 +8369,7 @@
                 <w:i w:val="0"/>
                 <w:sz w:val="16"/>
               </w:rPr>
-              <w:t>Cross-sectional (uterus transplant candidates)</w:t>
+              <w:t>Interviews after uterus transplantation</w:t>
             </w:r>
           </w:p>
         </w:tc>
@@ -8099,7 +8388,7 @@
                 <w:i w:val="0"/>
                 <w:sz w:val="16"/>
               </w:rPr>
-              <w:t>16 (incl. partners, donors)</w:t>
+              <w:t>7 (6 MRKH)</w:t>
             </w:r>
           </w:p>
         </w:tc>
@@ -8118,7 +8407,7 @@
                 <w:i w:val="0"/>
                 <w:sz w:val="16"/>
               </w:rPr>
-              <w:t>D Q S P</w:t>
+              <w:t>Q S P</w:t>
             </w:r>
           </w:p>
         </w:tc>
@@ -8158,7 +8447,7 @@
                 <w:i w:val="0"/>
                 <w:sz w:val="16"/>
               </w:rPr>
-              <w:t>Khairudin 2026</w:t>
+              <w:t>Kang 2020</w:t>
             </w:r>
             <w:r>
               <w:rPr>
@@ -8167,7 +8456,7 @@
                 <w:sz w:val="16"/>
                 <w:vertAlign w:val="superscript"/>
               </w:rPr>
-              <w:t>36</w:t>
+              <w:t>30</w:t>
             </w:r>
           </w:p>
         </w:tc>
@@ -8186,7 +8475,7 @@
                 <w:i w:val="0"/>
                 <w:sz w:val="16"/>
               </w:rPr>
-              <w:t>Malaysia</w:t>
+              <w:t>China</w:t>
             </w:r>
           </w:p>
         </w:tc>
@@ -8224,7 +8513,7 @@
                 <w:i w:val="0"/>
                 <w:sz w:val="16"/>
               </w:rPr>
-              <w:t>77</w:t>
+              <w:t>133</w:t>
             </w:r>
           </w:p>
         </w:tc>
@@ -8243,7 +8532,7 @@
                 <w:i w:val="0"/>
                 <w:sz w:val="16"/>
               </w:rPr>
-              <w:t>D</w:t>
+              <w:t>Q S</w:t>
             </w:r>
           </w:p>
         </w:tc>
@@ -8283,7 +8572,7 @@
                 <w:i w:val="0"/>
                 <w:sz w:val="16"/>
               </w:rPr>
-              <w:t>Le 2024</w:t>
+              <w:t>Karpel 2025</w:t>
             </w:r>
             <w:r>
               <w:rPr>
@@ -8292,7 +8581,7 @@
                 <w:sz w:val="16"/>
                 <w:vertAlign w:val="superscript"/>
               </w:rPr>
-              <w:t>43</w:t>
+              <w:t>41</w:t>
             </w:r>
           </w:p>
         </w:tc>
@@ -8311,7 +8600,7 @@
                 <w:i w:val="0"/>
                 <w:sz w:val="16"/>
               </w:rPr>
-              <w:t>Vietnam</w:t>
+              <w:t>France</w:t>
             </w:r>
           </w:p>
         </w:tc>
@@ -8330,7 +8619,7 @@
                 <w:i w:val="0"/>
                 <w:sz w:val="16"/>
               </w:rPr>
-              <w:t>In-depth interviews</w:t>
+              <w:t>Cross-sectional (uterus transplant candidates)</w:t>
             </w:r>
           </w:p>
         </w:tc>
@@ -8349,7 +8638,7 @@
                 <w:i w:val="0"/>
                 <w:sz w:val="16"/>
               </w:rPr>
-              <w:t>20</w:t>
+              <w:t>16 (incl. partners, donors)</w:t>
             </w:r>
           </w:p>
         </w:tc>
@@ -8368,7 +8657,7 @@
                 <w:i w:val="0"/>
                 <w:sz w:val="16"/>
               </w:rPr>
-              <w:t>C H</w:t>
+              <w:t>D Q S P</w:t>
             </w:r>
           </w:p>
         </w:tc>
@@ -8387,7 +8676,7 @@
                 <w:i w:val="0"/>
                 <w:sz w:val="16"/>
               </w:rPr>
-              <w:t>Avoidance / concealment (maladaptive); Spiritual coping</w:t>
+              <w:t>—</w:t>
             </w:r>
           </w:p>
         </w:tc>
@@ -8408,7 +8697,7 @@
                 <w:i w:val="0"/>
                 <w:sz w:val="16"/>
               </w:rPr>
-              <w:t>Lei 2024</w:t>
+              <w:t>Khairudin 2026</w:t>
             </w:r>
             <w:r>
               <w:rPr>
@@ -8417,7 +8706,7 @@
                 <w:sz w:val="16"/>
                 <w:vertAlign w:val="superscript"/>
               </w:rPr>
-              <w:t>37</w:t>
+              <w:t>38</w:t>
             </w:r>
           </w:p>
         </w:tc>
@@ -8436,7 +8725,7 @@
                 <w:i w:val="0"/>
                 <w:sz w:val="16"/>
               </w:rPr>
-              <w:t>China</w:t>
+              <w:t>Malaysia</w:t>
             </w:r>
           </w:p>
         </w:tc>
@@ -8455,7 +8744,7 @@
                 <w:i w:val="0"/>
                 <w:sz w:val="16"/>
               </w:rPr>
-              <w:t>Longitudinal case series (2 survey rounds)</w:t>
+              <w:t>Cross-sectional</w:t>
             </w:r>
           </w:p>
         </w:tc>
@@ -8474,7 +8763,7 @@
                 <w:i w:val="0"/>
                 <w:sz w:val="16"/>
               </w:rPr>
-              <w:t>53</w:t>
+              <w:t>77</w:t>
             </w:r>
           </w:p>
         </w:tc>
@@ -8493,7 +8782,7 @@
                 <w:i w:val="0"/>
                 <w:sz w:val="16"/>
               </w:rPr>
-              <w:t>D Q S</w:t>
+              <w:t>D</w:t>
             </w:r>
           </w:p>
         </w:tc>
@@ -8533,7 +8822,7 @@
                 <w:i w:val="0"/>
                 <w:sz w:val="16"/>
               </w:rPr>
-              <w:t>Lou 2024</w:t>
+              <w:t>Le 2024</w:t>
             </w:r>
             <w:r>
               <w:rPr>
@@ -8542,7 +8831,7 @@
                 <w:sz w:val="16"/>
                 <w:vertAlign w:val="superscript"/>
               </w:rPr>
-              <w:t>35</w:t>
+              <w:t>47</w:t>
             </w:r>
           </w:p>
         </w:tc>
@@ -8561,7 +8850,7 @@
                 <w:i w:val="0"/>
                 <w:sz w:val="16"/>
               </w:rPr>
-              <w:t>Denmark</w:t>
+              <w:t>Vietnam</w:t>
             </w:r>
           </w:p>
         </w:tc>
@@ -8580,7 +8869,7 @@
                 <w:i w:val="0"/>
                 <w:sz w:val="16"/>
               </w:rPr>
-              <w:t>Interview study</w:t>
+              <w:t>In-depth interviews</w:t>
             </w:r>
           </w:p>
         </w:tc>
@@ -8599,7 +8888,7 @@
                 <w:i w:val="0"/>
                 <w:sz w:val="16"/>
               </w:rPr>
-              <w:t>NR</w:t>
+              <w:t>20</w:t>
             </w:r>
           </w:p>
         </w:tc>
@@ -8618,7 +8907,7 @@
                 <w:i w:val="0"/>
                 <w:sz w:val="16"/>
               </w:rPr>
-              <w:t>P H</w:t>
+              <w:t>C H</w:t>
             </w:r>
           </w:p>
         </w:tc>
@@ -8637,7 +8926,7 @@
                 <w:i w:val="0"/>
                 <w:sz w:val="16"/>
               </w:rPr>
-              <w:t>—</w:t>
+              <w:t>Avoidance / concealment (maladaptive); Spiritual coping</w:t>
             </w:r>
           </w:p>
         </w:tc>
@@ -8658,7 +8947,7 @@
                 <w:i w:val="0"/>
                 <w:sz w:val="16"/>
               </w:rPr>
-              <w:t>Magdoud 2024</w:t>
+              <w:t>Lei 2024</w:t>
             </w:r>
             <w:r>
               <w:rPr>
@@ -8667,7 +8956,7 @@
                 <w:sz w:val="16"/>
                 <w:vertAlign w:val="superscript"/>
               </w:rPr>
-              <w:t>25</w:t>
+              <w:t>39</w:t>
             </w:r>
           </w:p>
         </w:tc>
@@ -8686,7 +8975,7 @@
                 <w:i w:val="0"/>
                 <w:sz w:val="16"/>
               </w:rPr>
-              <w:t>Tunisia</w:t>
+              <w:t>China</w:t>
             </w:r>
           </w:p>
         </w:tc>
@@ -8705,7 +8994,7 @@
                 <w:i w:val="0"/>
                 <w:sz w:val="16"/>
               </w:rPr>
-              <w:t>Retrospective comparative (with controls)</w:t>
+              <w:t>Longitudinal case series (2 survey rounds)</w:t>
             </w:r>
           </w:p>
         </w:tc>
@@ -8724,7 +9013,7 @@
                 <w:i w:val="0"/>
                 <w:sz w:val="16"/>
               </w:rPr>
-              <w:t>30</w:t>
+              <w:t>53</w:t>
             </w:r>
           </w:p>
         </w:tc>
@@ -8743,7 +9032,7 @@
                 <w:i w:val="0"/>
                 <w:sz w:val="16"/>
               </w:rPr>
-              <w:t>Q S</w:t>
+              <w:t>D Q S</w:t>
             </w:r>
           </w:p>
         </w:tc>
@@ -8783,7 +9072,7 @@
                 <w:i w:val="0"/>
                 <w:sz w:val="16"/>
               </w:rPr>
-              <w:t>Mao 2024</w:t>
+              <w:t>Lou 2024</w:t>
             </w:r>
             <w:r>
               <w:rPr>
@@ -8792,7 +9081,7 @@
                 <w:sz w:val="16"/>
                 <w:vertAlign w:val="superscript"/>
               </w:rPr>
-              <w:t>32</w:t>
+              <w:t>35</w:t>
             </w:r>
           </w:p>
         </w:tc>
@@ -8811,7 +9100,7 @@
                 <w:i w:val="0"/>
                 <w:sz w:val="16"/>
               </w:rPr>
-              <w:t>China</w:t>
+              <w:t>Denmark</w:t>
             </w:r>
           </w:p>
         </w:tc>
@@ -8830,7 +9119,7 @@
                 <w:i w:val="0"/>
                 <w:sz w:val="16"/>
               </w:rPr>
-              <w:t>Retrospective (with controls)</w:t>
+              <w:t>Interview study</w:t>
             </w:r>
           </w:p>
         </w:tc>
@@ -8849,7 +9138,7 @@
                 <w:i w:val="0"/>
                 <w:sz w:val="16"/>
               </w:rPr>
-              <w:t>42 (+30 controls)</w:t>
+              <w:t>NR</w:t>
             </w:r>
           </w:p>
         </w:tc>
@@ -8868,7 +9157,7 @@
                 <w:i w:val="0"/>
                 <w:sz w:val="16"/>
               </w:rPr>
-              <w:t>Q S</w:t>
+              <w:t>P H</w:t>
             </w:r>
           </w:p>
         </w:tc>
@@ -8908,7 +9197,7 @@
                 <w:i w:val="0"/>
                 <w:sz w:val="16"/>
               </w:rPr>
-              <w:t>Marshall 2025</w:t>
+              <w:t>Magdoud 2024</w:t>
             </w:r>
             <w:r>
               <w:rPr>
@@ -8917,7 +9206,7 @@
                 <w:sz w:val="16"/>
                 <w:vertAlign w:val="superscript"/>
               </w:rPr>
-              <w:t>45</w:t>
+              <w:t>25</w:t>
             </w:r>
           </w:p>
         </w:tc>
@@ -8936,7 +9225,7 @@
                 <w:i w:val="0"/>
                 <w:sz w:val="16"/>
               </w:rPr>
-              <w:t>United States/Canada</w:t>
+              <w:t>Tunisia</w:t>
             </w:r>
           </w:p>
         </w:tc>
@@ -8955,7 +9244,7 @@
                 <w:i w:val="0"/>
                 <w:sz w:val="16"/>
               </w:rPr>
-              <w:t>Semi-structured interviews</w:t>
+              <w:t>Retrospective comparative (with controls)</w:t>
             </w:r>
           </w:p>
         </w:tc>
@@ -8974,7 +9263,7 @@
                 <w:i w:val="0"/>
                 <w:sz w:val="16"/>
               </w:rPr>
-              <w:t>NR</w:t>
+              <w:t>30</w:t>
             </w:r>
           </w:p>
         </w:tc>
@@ -8993,7 +9282,7 @@
                 <w:i w:val="0"/>
                 <w:sz w:val="16"/>
               </w:rPr>
-              <w:t>C H</w:t>
+              <w:t>Q S</w:t>
             </w:r>
           </w:p>
         </w:tc>
@@ -9012,7 +9301,7 @@
                 <w:i w:val="0"/>
                 <w:sz w:val="16"/>
               </w:rPr>
-              <w:t>Self-advocacy</w:t>
+              <w:t>—</w:t>
             </w:r>
           </w:p>
         </w:tc>
@@ -9033,7 +9322,7 @@
                 <w:i w:val="0"/>
                 <w:sz w:val="16"/>
               </w:rPr>
-              <w:t>Pennesi 2023</w:t>
+              <w:t>Mao 2024</w:t>
             </w:r>
             <w:r>
               <w:rPr>
@@ -9042,7 +9331,7 @@
                 <w:sz w:val="16"/>
                 <w:vertAlign w:val="superscript"/>
               </w:rPr>
-              <w:t>47</w:t>
+              <w:t>32</w:t>
             </w:r>
           </w:p>
         </w:tc>
@@ -9061,7 +9350,7 @@
                 <w:i w:val="0"/>
                 <w:sz w:val="16"/>
               </w:rPr>
-              <w:t>Multinational (40 countries)</w:t>
+              <w:t>China</w:t>
             </w:r>
           </w:p>
         </w:tc>
@@ -9080,7 +9369,7 @@
                 <w:i w:val="0"/>
                 <w:sz w:val="16"/>
               </w:rPr>
-              <w:t>Cross-sectional mixed-methods survey</w:t>
+              <w:t>Retrospective (with controls)</w:t>
             </w:r>
           </w:p>
         </w:tc>
@@ -9099,7 +9388,7 @@
                 <w:i w:val="0"/>
                 <w:sz w:val="16"/>
               </w:rPr>
-              <w:t>616</w:t>
+              <w:t>42 (+30 controls)</w:t>
             </w:r>
           </w:p>
         </w:tc>
@@ -9118,7 +9407,7 @@
                 <w:i w:val="0"/>
                 <w:sz w:val="16"/>
               </w:rPr>
-              <w:t>S P H</w:t>
+              <w:t>Q S</w:t>
             </w:r>
           </w:p>
         </w:tc>
@@ -9158,7 +9447,7 @@
                 <w:i w:val="0"/>
                 <w:sz w:val="16"/>
               </w:rPr>
-              <w:t>Rajesh 2026</w:t>
+              <w:t>Marshall 2025</w:t>
             </w:r>
             <w:r>
               <w:rPr>
@@ -9167,7 +9456,7 @@
                 <w:sz w:val="16"/>
                 <w:vertAlign w:val="superscript"/>
               </w:rPr>
-              <w:t>10</w:t>
+              <w:t>49</w:t>
             </w:r>
           </w:p>
         </w:tc>
@@ -9186,7 +9475,7 @@
                 <w:i w:val="0"/>
                 <w:sz w:val="16"/>
               </w:rPr>
-              <w:t>Canada</w:t>
+              <w:t>United States/Canada</w:t>
             </w:r>
           </w:p>
         </w:tc>
@@ -9224,7 +9513,7 @@
                 <w:i w:val="0"/>
                 <w:sz w:val="16"/>
               </w:rPr>
-              <w:t>12</w:t>
+              <w:t>NR</w:t>
             </w:r>
           </w:p>
         </w:tc>
@@ -9243,7 +9532,7 @@
                 <w:i w:val="0"/>
                 <w:sz w:val="16"/>
               </w:rPr>
-              <w:t>Q S C</w:t>
+              <w:t>C H</w:t>
             </w:r>
           </w:p>
         </w:tc>
@@ -9262,7 +9551,7 @@
                 <w:i w:val="0"/>
                 <w:sz w:val="16"/>
               </w:rPr>
-              <w:t>Identity reconstruction / positive reappraisal</w:t>
+              <w:t>Self-advocacy</w:t>
             </w:r>
           </w:p>
         </w:tc>
@@ -9283,7 +9572,7 @@
                 <w:i w:val="0"/>
                 <w:sz w:val="16"/>
               </w:rPr>
-              <w:t>Rall 2021</w:t>
+              <w:t>Ngoumou 2022</w:t>
             </w:r>
             <w:r>
               <w:rPr>
@@ -9292,7 +9581,7 @@
                 <w:sz w:val="16"/>
                 <w:vertAlign w:val="superscript"/>
               </w:rPr>
-              <w:t>26</w:t>
+              <w:t>50</w:t>
             </w:r>
           </w:p>
         </w:tc>
@@ -9311,7 +9600,7 @@
                 <w:i w:val="0"/>
                 <w:sz w:val="16"/>
               </w:rPr>
-              <w:t>Germany</w:t>
+              <w:t>Cameroon, Côte d'Ivoire, Senegal</w:t>
             </w:r>
           </w:p>
         </w:tc>
@@ -9330,7 +9619,7 @@
                 <w:i w:val="0"/>
                 <w:sz w:val="16"/>
               </w:rPr>
-              <w:t>Prospective cohort (pre/post surgery)</w:t>
+              <w:t>In-depth interviews</w:t>
             </w:r>
           </w:p>
         </w:tc>
@@ -9349,7 +9638,7 @@
                 <w:i w:val="0"/>
                 <w:sz w:val="16"/>
               </w:rPr>
-              <w:t>82</w:t>
+              <w:t>5</w:t>
             </w:r>
           </w:p>
         </w:tc>
@@ -9368,7 +9657,7 @@
                 <w:i w:val="0"/>
                 <w:sz w:val="16"/>
               </w:rPr>
-              <w:t>Q S P C</w:t>
+              <w:t>P H</w:t>
             </w:r>
           </w:p>
         </w:tc>
@@ -9387,7 +9676,7 @@
                 <w:i w:val="0"/>
                 <w:sz w:val="16"/>
               </w:rPr>
-              <w:t>Peer, family &amp; social support</w:t>
+              <w:t>—</w:t>
             </w:r>
           </w:p>
         </w:tc>
@@ -9408,7 +9697,7 @@
                 <w:i w:val="0"/>
                 <w:sz w:val="16"/>
               </w:rPr>
-              <w:t>Sabatucci 2019</w:t>
+              <w:t>Pennesi 2023</w:t>
             </w:r>
             <w:r>
               <w:rPr>
@@ -9417,7 +9706,7 @@
                 <w:sz w:val="16"/>
                 <w:vertAlign w:val="superscript"/>
               </w:rPr>
-              <w:t>31</w:t>
+              <w:t>52</w:t>
             </w:r>
           </w:p>
         </w:tc>
@@ -9436,7 +9725,7 @@
                 <w:i w:val="0"/>
                 <w:sz w:val="16"/>
               </w:rPr>
-              <w:t>Italy</w:t>
+              <w:t>Multinational (40 countries)</w:t>
             </w:r>
           </w:p>
         </w:tc>
@@ -9455,7 +9744,7 @@
                 <w:i w:val="0"/>
                 <w:sz w:val="16"/>
               </w:rPr>
-              <w:t>Descriptive longitudinal</w:t>
+              <w:t>Cross-sectional mixed-methods survey</w:t>
             </w:r>
           </w:p>
         </w:tc>
@@ -9474,7 +9763,7 @@
                 <w:i w:val="0"/>
                 <w:sz w:val="16"/>
               </w:rPr>
-              <w:t>39</w:t>
+              <w:t>616</w:t>
             </w:r>
           </w:p>
         </w:tc>
@@ -9493,7 +9782,7 @@
                 <w:i w:val="0"/>
                 <w:sz w:val="16"/>
               </w:rPr>
-              <w:t>Q S</w:t>
+              <w:t>S P H</w:t>
             </w:r>
           </w:p>
         </w:tc>
@@ -9533,7 +9822,7 @@
                 <w:i w:val="0"/>
                 <w:sz w:val="16"/>
               </w:rPr>
-              <w:t>Schäffeler 2022</w:t>
+              <w:t>Pittman 2025</w:t>
             </w:r>
             <w:r>
               <w:rPr>
@@ -9542,7 +9831,7 @@
                 <w:sz w:val="16"/>
                 <w:vertAlign w:val="superscript"/>
               </w:rPr>
-              <w:t>27</w:t>
+              <w:t>44</w:t>
             </w:r>
           </w:p>
         </w:tc>
@@ -9561,7 +9850,7 @@
                 <w:i w:val="0"/>
                 <w:sz w:val="16"/>
               </w:rPr>
-              <w:t>Germany</w:t>
+              <w:t>Australia</w:t>
             </w:r>
           </w:p>
         </w:tc>
@@ -9580,7 +9869,7 @@
                 <w:i w:val="0"/>
                 <w:sz w:val="16"/>
               </w:rPr>
-              <w:t>Quasi-experimental pre/post</w:t>
+              <w:t>Cross-sectional survey (congenital vs acquired uterine factor infertility)</w:t>
             </w:r>
           </w:p>
         </w:tc>
@@ -9599,7 +9888,7 @@
                 <w:i w:val="0"/>
                 <w:sz w:val="16"/>
               </w:rPr>
-              <w:t>53</w:t>
+              <w:t>39</w:t>
             </w:r>
           </w:p>
         </w:tc>
@@ -9618,7 +9907,7 @@
                 <w:i w:val="0"/>
                 <w:sz w:val="16"/>
               </w:rPr>
-              <w:t>D Q S P C</w:t>
+              <w:t>D Q</w:t>
             </w:r>
           </w:p>
         </w:tc>
@@ -9637,7 +9926,7 @@
                 <w:i w:val="0"/>
                 <w:sz w:val="16"/>
               </w:rPr>
-              <w:t>Psychological counseling/intervention</w:t>
+              <w:t>—</w:t>
             </w:r>
           </w:p>
         </w:tc>
@@ -9658,7 +9947,7 @@
                 <w:i w:val="0"/>
                 <w:sz w:val="16"/>
               </w:rPr>
-              <w:t>Shao 2022</w:t>
+              <w:t>Rajesh 2026</w:t>
             </w:r>
             <w:r>
               <w:rPr>
@@ -9667,7 +9956,7 @@
                 <w:sz w:val="16"/>
                 <w:vertAlign w:val="superscript"/>
               </w:rPr>
-              <w:t>44</w:t>
+              <w:t>10</w:t>
             </w:r>
           </w:p>
         </w:tc>
@@ -9686,7 +9975,7 @@
                 <w:i w:val="0"/>
                 <w:sz w:val="16"/>
               </w:rPr>
-              <w:t>China</w:t>
+              <w:t>Canada</w:t>
             </w:r>
           </w:p>
         </w:tc>
@@ -9705,7 +9994,7 @@
                 <w:i w:val="0"/>
                 <w:sz w:val="16"/>
               </w:rPr>
-              <w:t>Prospective pre/post intervention</w:t>
+              <w:t>Semi-structured interviews</w:t>
             </w:r>
           </w:p>
         </w:tc>
@@ -9724,7 +10013,7 @@
                 <w:i w:val="0"/>
                 <w:sz w:val="16"/>
               </w:rPr>
-              <w:t>30</w:t>
+              <w:t>12</w:t>
             </w:r>
           </w:p>
         </w:tc>
@@ -9743,7 +10032,7 @@
                 <w:i w:val="0"/>
                 <w:sz w:val="16"/>
               </w:rPr>
-              <w:t>D C</w:t>
+              <w:t>Q S C</w:t>
             </w:r>
           </w:p>
         </w:tc>
@@ -9762,7 +10051,7 @@
                 <w:i w:val="0"/>
                 <w:sz w:val="16"/>
               </w:rPr>
-              <w:t>Psychological counseling/intervention</w:t>
+              <w:t>Identity reconstruction / positive reappraisal</w:t>
             </w:r>
           </w:p>
         </w:tc>
@@ -9783,7 +10072,7 @@
                 <w:i w:val="0"/>
                 <w:sz w:val="16"/>
               </w:rPr>
-              <w:t>Song 2020</w:t>
+              <w:t>Rall 2021</w:t>
             </w:r>
             <w:r>
               <w:rPr>
@@ -9792,7 +10081,7 @@
                 <w:sz w:val="16"/>
                 <w:vertAlign w:val="superscript"/>
               </w:rPr>
-              <w:t>17</w:t>
+              <w:t>26</w:t>
             </w:r>
           </w:p>
         </w:tc>
@@ -9811,7 +10100,7 @@
                 <w:i w:val="0"/>
                 <w:sz w:val="16"/>
               </w:rPr>
-              <w:t>China</w:t>
+              <w:t>Germany</w:t>
             </w:r>
           </w:p>
         </w:tc>
@@ -9830,7 +10119,7 @@
                 <w:i w:val="0"/>
                 <w:sz w:val="16"/>
               </w:rPr>
-              <w:t>Cross-sectional (with controls)</w:t>
+              <w:t>Prospective cohort (pre/post surgery)</w:t>
             </w:r>
           </w:p>
         </w:tc>
@@ -9849,7 +10138,7 @@
                 <w:i w:val="0"/>
                 <w:sz w:val="16"/>
               </w:rPr>
-              <w:t>141 (+178 controls)</w:t>
+              <w:t>82</w:t>
             </w:r>
           </w:p>
         </w:tc>
@@ -9868,7 +10157,7 @@
                 <w:i w:val="0"/>
                 <w:sz w:val="16"/>
               </w:rPr>
-              <w:t>D</w:t>
+              <w:t>Q S P C</w:t>
             </w:r>
           </w:p>
         </w:tc>
@@ -9887,7 +10176,7 @@
                 <w:i w:val="0"/>
                 <w:sz w:val="16"/>
               </w:rPr>
-              <w:t>—</w:t>
+              <w:t>Peer, family &amp; social support</w:t>
             </w:r>
           </w:p>
         </w:tc>
@@ -9908,7 +10197,7 @@
                 <w:i w:val="0"/>
                 <w:sz w:val="16"/>
               </w:rPr>
-              <w:t>Sorouri Khorashad 2025</w:t>
+              <w:t>Sabatucci 2019</w:t>
             </w:r>
             <w:r>
               <w:rPr>
@@ -9917,7 +10206,632 @@
                 <w:sz w:val="16"/>
                 <w:vertAlign w:val="superscript"/>
               </w:rPr>
-              <w:t>38</w:t>
+              <w:t>31</w:t>
+            </w:r>
+          </w:p>
+        </w:tc>
+        <w:tc>
+          <w:tcPr>
+            <w:tcW w:type="dxa" w:w="1296"/>
+          </w:tcPr>
+          <w:p>
+            <w:pPr>
+              <w:spacing w:line="240" w:lineRule="auto"/>
+            </w:pPr>
+            <w:r/>
+            <w:r>
+              <w:rPr>
+                <w:b w:val="0"/>
+                <w:i w:val="0"/>
+                <w:sz w:val="16"/>
+              </w:rPr>
+              <w:t>Italy</w:t>
+            </w:r>
+          </w:p>
+        </w:tc>
+        <w:tc>
+          <w:tcPr>
+            <w:tcW w:type="dxa" w:w="2160"/>
+          </w:tcPr>
+          <w:p>
+            <w:pPr>
+              <w:spacing w:line="240" w:lineRule="auto"/>
+            </w:pPr>
+            <w:r/>
+            <w:r>
+              <w:rPr>
+                <w:b w:val="0"/>
+                <w:i w:val="0"/>
+                <w:sz w:val="16"/>
+              </w:rPr>
+              <w:t>Descriptive longitudinal</w:t>
+            </w:r>
+          </w:p>
+        </w:tc>
+        <w:tc>
+          <w:tcPr>
+            <w:tcW w:type="dxa" w:w="1152"/>
+          </w:tcPr>
+          <w:p>
+            <w:pPr>
+              <w:spacing w:line="240" w:lineRule="auto"/>
+            </w:pPr>
+            <w:r/>
+            <w:r>
+              <w:rPr>
+                <w:b w:val="0"/>
+                <w:i w:val="0"/>
+                <w:sz w:val="16"/>
+              </w:rPr>
+              <w:t>39</w:t>
+            </w:r>
+          </w:p>
+        </w:tc>
+        <w:tc>
+          <w:tcPr>
+            <w:tcW w:type="dxa" w:w="1008"/>
+          </w:tcPr>
+          <w:p>
+            <w:pPr>
+              <w:spacing w:line="240" w:lineRule="auto"/>
+            </w:pPr>
+            <w:r/>
+            <w:r>
+              <w:rPr>
+                <w:b w:val="0"/>
+                <w:i w:val="0"/>
+                <w:sz w:val="16"/>
+              </w:rPr>
+              <w:t>Q S</w:t>
+            </w:r>
+          </w:p>
+        </w:tc>
+        <w:tc>
+          <w:tcPr>
+            <w:tcW w:type="dxa" w:w="2160"/>
+          </w:tcPr>
+          <w:p>
+            <w:pPr>
+              <w:spacing w:line="240" w:lineRule="auto"/>
+            </w:pPr>
+            <w:r/>
+            <w:r>
+              <w:rPr>
+                <w:b w:val="0"/>
+                <w:i w:val="0"/>
+                <w:sz w:val="16"/>
+              </w:rPr>
+              <w:t>—</w:t>
+            </w:r>
+          </w:p>
+        </w:tc>
+      </w:tr>
+      <w:tr>
+        <w:tc>
+          <w:tcPr>
+            <w:tcW w:type="dxa" w:w="1584"/>
+          </w:tcPr>
+          <w:p>
+            <w:pPr>
+              <w:spacing w:line="240" w:lineRule="auto"/>
+            </w:pPr>
+            <w:r/>
+            <w:r>
+              <w:rPr>
+                <w:b w:val="0"/>
+                <w:i w:val="0"/>
+                <w:sz w:val="16"/>
+              </w:rPr>
+              <w:t>Schäffeler 2022</w:t>
+            </w:r>
+            <w:r>
+              <w:rPr>
+                <w:b w:val="0"/>
+                <w:i w:val="0"/>
+                <w:sz w:val="16"/>
+                <w:vertAlign w:val="superscript"/>
+              </w:rPr>
+              <w:t>27</w:t>
+            </w:r>
+          </w:p>
+        </w:tc>
+        <w:tc>
+          <w:tcPr>
+            <w:tcW w:type="dxa" w:w="1296"/>
+          </w:tcPr>
+          <w:p>
+            <w:pPr>
+              <w:spacing w:line="240" w:lineRule="auto"/>
+            </w:pPr>
+            <w:r/>
+            <w:r>
+              <w:rPr>
+                <w:b w:val="0"/>
+                <w:i w:val="0"/>
+                <w:sz w:val="16"/>
+              </w:rPr>
+              <w:t>Germany</w:t>
+            </w:r>
+          </w:p>
+        </w:tc>
+        <w:tc>
+          <w:tcPr>
+            <w:tcW w:type="dxa" w:w="2160"/>
+          </w:tcPr>
+          <w:p>
+            <w:pPr>
+              <w:spacing w:line="240" w:lineRule="auto"/>
+            </w:pPr>
+            <w:r/>
+            <w:r>
+              <w:rPr>
+                <w:b w:val="0"/>
+                <w:i w:val="0"/>
+                <w:sz w:val="16"/>
+              </w:rPr>
+              <w:t>Quasi-experimental pre/post</w:t>
+            </w:r>
+          </w:p>
+        </w:tc>
+        <w:tc>
+          <w:tcPr>
+            <w:tcW w:type="dxa" w:w="1152"/>
+          </w:tcPr>
+          <w:p>
+            <w:pPr>
+              <w:spacing w:line="240" w:lineRule="auto"/>
+            </w:pPr>
+            <w:r/>
+            <w:r>
+              <w:rPr>
+                <w:b w:val="0"/>
+                <w:i w:val="0"/>
+                <w:sz w:val="16"/>
+              </w:rPr>
+              <w:t>53</w:t>
+            </w:r>
+          </w:p>
+        </w:tc>
+        <w:tc>
+          <w:tcPr>
+            <w:tcW w:type="dxa" w:w="1008"/>
+          </w:tcPr>
+          <w:p>
+            <w:pPr>
+              <w:spacing w:line="240" w:lineRule="auto"/>
+            </w:pPr>
+            <w:r/>
+            <w:r>
+              <w:rPr>
+                <w:b w:val="0"/>
+                <w:i w:val="0"/>
+                <w:sz w:val="16"/>
+              </w:rPr>
+              <w:t>D Q S P C</w:t>
+            </w:r>
+          </w:p>
+        </w:tc>
+        <w:tc>
+          <w:tcPr>
+            <w:tcW w:type="dxa" w:w="2160"/>
+          </w:tcPr>
+          <w:p>
+            <w:pPr>
+              <w:spacing w:line="240" w:lineRule="auto"/>
+            </w:pPr>
+            <w:r/>
+            <w:r>
+              <w:rPr>
+                <w:b w:val="0"/>
+                <w:i w:val="0"/>
+                <w:sz w:val="16"/>
+              </w:rPr>
+              <w:t>Psychological counseling/intervention</w:t>
+            </w:r>
+          </w:p>
+        </w:tc>
+      </w:tr>
+      <w:tr>
+        <w:tc>
+          <w:tcPr>
+            <w:tcW w:type="dxa" w:w="1584"/>
+          </w:tcPr>
+          <w:p>
+            <w:pPr>
+              <w:spacing w:line="240" w:lineRule="auto"/>
+            </w:pPr>
+            <w:r/>
+            <w:r>
+              <w:rPr>
+                <w:b w:val="0"/>
+                <w:i w:val="0"/>
+                <w:sz w:val="16"/>
+              </w:rPr>
+              <w:t>Scollo 2020</w:t>
+            </w:r>
+            <w:r>
+              <w:rPr>
+                <w:b w:val="0"/>
+                <w:i w:val="0"/>
+                <w:sz w:val="16"/>
+                <w:vertAlign w:val="superscript"/>
+              </w:rPr>
+              <w:t>43</w:t>
+            </w:r>
+          </w:p>
+        </w:tc>
+        <w:tc>
+          <w:tcPr>
+            <w:tcW w:type="dxa" w:w="1296"/>
+          </w:tcPr>
+          <w:p>
+            <w:pPr>
+              <w:spacing w:line="240" w:lineRule="auto"/>
+            </w:pPr>
+            <w:r/>
+            <w:r>
+              <w:rPr>
+                <w:b w:val="0"/>
+                <w:i w:val="0"/>
+                <w:sz w:val="16"/>
+              </w:rPr>
+              <w:t>Italy</w:t>
+            </w:r>
+          </w:p>
+        </w:tc>
+        <w:tc>
+          <w:tcPr>
+            <w:tcW w:type="dxa" w:w="2160"/>
+          </w:tcPr>
+          <w:p>
+            <w:pPr>
+              <w:spacing w:line="240" w:lineRule="auto"/>
+            </w:pPr>
+            <w:r/>
+            <w:r>
+              <w:rPr>
+                <w:b w:val="0"/>
+                <w:i w:val="0"/>
+                <w:sz w:val="16"/>
+              </w:rPr>
+              <w:t>Cross-sectional (MMPI-2; uterus transplant candidates)</w:t>
+            </w:r>
+          </w:p>
+        </w:tc>
+        <w:tc>
+          <w:tcPr>
+            <w:tcW w:type="dxa" w:w="1152"/>
+          </w:tcPr>
+          <w:p>
+            <w:pPr>
+              <w:spacing w:line="240" w:lineRule="auto"/>
+            </w:pPr>
+            <w:r/>
+            <w:r>
+              <w:rPr>
+                <w:b w:val="0"/>
+                <w:i w:val="0"/>
+                <w:sz w:val="16"/>
+              </w:rPr>
+              <w:t>19 (18 MRKH)</w:t>
+            </w:r>
+          </w:p>
+        </w:tc>
+        <w:tc>
+          <w:tcPr>
+            <w:tcW w:type="dxa" w:w="1008"/>
+          </w:tcPr>
+          <w:p>
+            <w:pPr>
+              <w:spacing w:line="240" w:lineRule="auto"/>
+            </w:pPr>
+            <w:r/>
+            <w:r>
+              <w:rPr>
+                <w:b w:val="0"/>
+                <w:i w:val="0"/>
+                <w:sz w:val="16"/>
+              </w:rPr>
+              <w:t>D P</w:t>
+            </w:r>
+          </w:p>
+        </w:tc>
+        <w:tc>
+          <w:tcPr>
+            <w:tcW w:type="dxa" w:w="2160"/>
+          </w:tcPr>
+          <w:p>
+            <w:pPr>
+              <w:spacing w:line="240" w:lineRule="auto"/>
+            </w:pPr>
+            <w:r/>
+            <w:r>
+              <w:rPr>
+                <w:b w:val="0"/>
+                <w:i w:val="0"/>
+                <w:sz w:val="16"/>
+              </w:rPr>
+              <w:t>—</w:t>
+            </w:r>
+          </w:p>
+        </w:tc>
+      </w:tr>
+      <w:tr>
+        <w:tc>
+          <w:tcPr>
+            <w:tcW w:type="dxa" w:w="1584"/>
+          </w:tcPr>
+          <w:p>
+            <w:pPr>
+              <w:spacing w:line="240" w:lineRule="auto"/>
+            </w:pPr>
+            <w:r/>
+            <w:r>
+              <w:rPr>
+                <w:b w:val="0"/>
+                <w:i w:val="0"/>
+                <w:sz w:val="16"/>
+              </w:rPr>
+              <w:t>Shao 2022</w:t>
+            </w:r>
+            <w:r>
+              <w:rPr>
+                <w:b w:val="0"/>
+                <w:i w:val="0"/>
+                <w:sz w:val="16"/>
+                <w:vertAlign w:val="superscript"/>
+              </w:rPr>
+              <w:t>48</w:t>
+            </w:r>
+          </w:p>
+        </w:tc>
+        <w:tc>
+          <w:tcPr>
+            <w:tcW w:type="dxa" w:w="1296"/>
+          </w:tcPr>
+          <w:p>
+            <w:pPr>
+              <w:spacing w:line="240" w:lineRule="auto"/>
+            </w:pPr>
+            <w:r/>
+            <w:r>
+              <w:rPr>
+                <w:b w:val="0"/>
+                <w:i w:val="0"/>
+                <w:sz w:val="16"/>
+              </w:rPr>
+              <w:t>China</w:t>
+            </w:r>
+          </w:p>
+        </w:tc>
+        <w:tc>
+          <w:tcPr>
+            <w:tcW w:type="dxa" w:w="2160"/>
+          </w:tcPr>
+          <w:p>
+            <w:pPr>
+              <w:spacing w:line="240" w:lineRule="auto"/>
+            </w:pPr>
+            <w:r/>
+            <w:r>
+              <w:rPr>
+                <w:b w:val="0"/>
+                <w:i w:val="0"/>
+                <w:sz w:val="16"/>
+              </w:rPr>
+              <w:t>Prospective pre/post intervention</w:t>
+            </w:r>
+          </w:p>
+        </w:tc>
+        <w:tc>
+          <w:tcPr>
+            <w:tcW w:type="dxa" w:w="1152"/>
+          </w:tcPr>
+          <w:p>
+            <w:pPr>
+              <w:spacing w:line="240" w:lineRule="auto"/>
+            </w:pPr>
+            <w:r/>
+            <w:r>
+              <w:rPr>
+                <w:b w:val="0"/>
+                <w:i w:val="0"/>
+                <w:sz w:val="16"/>
+              </w:rPr>
+              <w:t>30</w:t>
+            </w:r>
+          </w:p>
+        </w:tc>
+        <w:tc>
+          <w:tcPr>
+            <w:tcW w:type="dxa" w:w="1008"/>
+          </w:tcPr>
+          <w:p>
+            <w:pPr>
+              <w:spacing w:line="240" w:lineRule="auto"/>
+            </w:pPr>
+            <w:r/>
+            <w:r>
+              <w:rPr>
+                <w:b w:val="0"/>
+                <w:i w:val="0"/>
+                <w:sz w:val="16"/>
+              </w:rPr>
+              <w:t>D C</w:t>
+            </w:r>
+          </w:p>
+        </w:tc>
+        <w:tc>
+          <w:tcPr>
+            <w:tcW w:type="dxa" w:w="2160"/>
+          </w:tcPr>
+          <w:p>
+            <w:pPr>
+              <w:spacing w:line="240" w:lineRule="auto"/>
+            </w:pPr>
+            <w:r/>
+            <w:r>
+              <w:rPr>
+                <w:b w:val="0"/>
+                <w:i w:val="0"/>
+                <w:sz w:val="16"/>
+              </w:rPr>
+              <w:t>Psychological counseling/intervention</w:t>
+            </w:r>
+          </w:p>
+        </w:tc>
+      </w:tr>
+      <w:tr>
+        <w:tc>
+          <w:tcPr>
+            <w:tcW w:type="dxa" w:w="1584"/>
+          </w:tcPr>
+          <w:p>
+            <w:pPr>
+              <w:spacing w:line="240" w:lineRule="auto"/>
+            </w:pPr>
+            <w:r/>
+            <w:r>
+              <w:rPr>
+                <w:b w:val="0"/>
+                <w:i w:val="0"/>
+                <w:sz w:val="16"/>
+              </w:rPr>
+              <w:t>Song 2020</w:t>
+            </w:r>
+            <w:r>
+              <w:rPr>
+                <w:b w:val="0"/>
+                <w:i w:val="0"/>
+                <w:sz w:val="16"/>
+                <w:vertAlign w:val="superscript"/>
+              </w:rPr>
+              <w:t>17</w:t>
+            </w:r>
+          </w:p>
+        </w:tc>
+        <w:tc>
+          <w:tcPr>
+            <w:tcW w:type="dxa" w:w="1296"/>
+          </w:tcPr>
+          <w:p>
+            <w:pPr>
+              <w:spacing w:line="240" w:lineRule="auto"/>
+            </w:pPr>
+            <w:r/>
+            <w:r>
+              <w:rPr>
+                <w:b w:val="0"/>
+                <w:i w:val="0"/>
+                <w:sz w:val="16"/>
+              </w:rPr>
+              <w:t>China</w:t>
+            </w:r>
+          </w:p>
+        </w:tc>
+        <w:tc>
+          <w:tcPr>
+            <w:tcW w:type="dxa" w:w="2160"/>
+          </w:tcPr>
+          <w:p>
+            <w:pPr>
+              <w:spacing w:line="240" w:lineRule="auto"/>
+            </w:pPr>
+            <w:r/>
+            <w:r>
+              <w:rPr>
+                <w:b w:val="0"/>
+                <w:i w:val="0"/>
+                <w:sz w:val="16"/>
+              </w:rPr>
+              <w:t>Cross-sectional (with controls)</w:t>
+            </w:r>
+          </w:p>
+        </w:tc>
+        <w:tc>
+          <w:tcPr>
+            <w:tcW w:type="dxa" w:w="1152"/>
+          </w:tcPr>
+          <w:p>
+            <w:pPr>
+              <w:spacing w:line="240" w:lineRule="auto"/>
+            </w:pPr>
+            <w:r/>
+            <w:r>
+              <w:rPr>
+                <w:b w:val="0"/>
+                <w:i w:val="0"/>
+                <w:sz w:val="16"/>
+              </w:rPr>
+              <w:t>141 (+178 controls)</w:t>
+            </w:r>
+          </w:p>
+        </w:tc>
+        <w:tc>
+          <w:tcPr>
+            <w:tcW w:type="dxa" w:w="1008"/>
+          </w:tcPr>
+          <w:p>
+            <w:pPr>
+              <w:spacing w:line="240" w:lineRule="auto"/>
+            </w:pPr>
+            <w:r/>
+            <w:r>
+              <w:rPr>
+                <w:b w:val="0"/>
+                <w:i w:val="0"/>
+                <w:sz w:val="16"/>
+              </w:rPr>
+              <w:t>D</w:t>
+            </w:r>
+          </w:p>
+        </w:tc>
+        <w:tc>
+          <w:tcPr>
+            <w:tcW w:type="dxa" w:w="2160"/>
+          </w:tcPr>
+          <w:p>
+            <w:pPr>
+              <w:spacing w:line="240" w:lineRule="auto"/>
+            </w:pPr>
+            <w:r/>
+            <w:r>
+              <w:rPr>
+                <w:b w:val="0"/>
+                <w:i w:val="0"/>
+                <w:sz w:val="16"/>
+              </w:rPr>
+              <w:t>—</w:t>
+            </w:r>
+          </w:p>
+        </w:tc>
+      </w:tr>
+      <w:tr>
+        <w:tc>
+          <w:tcPr>
+            <w:tcW w:type="dxa" w:w="1584"/>
+          </w:tcPr>
+          <w:p>
+            <w:pPr>
+              <w:spacing w:line="240" w:lineRule="auto"/>
+            </w:pPr>
+            <w:r/>
+            <w:r>
+              <w:rPr>
+                <w:b w:val="0"/>
+                <w:i w:val="0"/>
+                <w:sz w:val="16"/>
+              </w:rPr>
+              <w:t>Sorouri Khorashad 2025</w:t>
+            </w:r>
+            <w:r>
+              <w:rPr>
+                <w:b w:val="0"/>
+                <w:i w:val="0"/>
+                <w:sz w:val="16"/>
+                <w:vertAlign w:val="superscript"/>
+              </w:rPr>
+              <w:t>40</w:t>
             </w:r>
           </w:p>
         </w:tc>

</xml_diff>

<commit_message>
Reconcile with March 2026 screening tracker: English-only criterion, 36 studies
Co-Authored-By: Claude Opus 5.5 <noreply@anthropic.com>
Claude-Session: https://claude.ai/code/session_01N468nYR7vy45HpujgUezn5
</commit_message>
<xml_diff>
--- a/manuscript/MRKH_Scoping_Review_Manuscript.docx
+++ b/manuscript/MRKH_Scoping_Review_Manuscript.docx
@@ -277,7 +277,7 @@
           <w:b w:val="0"/>
           <w:i w:val="0"/>
         </w:rPr>
-        <w:t xml:space="preserve"> Of 516 records identified (324 after deduplication), 39 studies were provisionally included. Psychosexual and relational challenges were the most frequently reported outcomes (n = 25; 64%), followed by reduced quality of life, body image, and self-esteem (n = 20; 51%), broader psychological distress (n = 22; 56%), and depression and anxiety (n = 12; 31%). Coping mechanisms were documented in 14 studies, mostly peer support and self-management, and healthcare system gaps in 10. Studies came mainly from Europe (n = 17) and Asia (n = 14).</w:t>
+        <w:t xml:space="preserve"> Of 516 records identified (324 after deduplication), 36 studies were provisionally included. Psychosexual and relational challenges were the most frequently reported outcomes (n = 23; 64%), followed by reduced quality of life, body image, and self-esteem (n = 17; 47%), broader psychological distress (n = 20; 56%), and depression and anxiety (n = 11; 31%). Coping mechanisms were documented in 14 studies, mostly peer support and self-management, and healthcare system gaps in 10. Studies came mainly from Europe (n = 15) and Asia (n = 14).</w:t>
       </w:r>
     </w:p>
     <w:p>
@@ -726,15 +726,7 @@
           <w:b w:val="0"/>
           <w:i w:val="0"/>
         </w:rPr>
-        <w:t xml:space="preserve"> was any healthcare or community setting in any country. We included primary quantitative, qualitative, and mixed-methods studies published between January 2019 and March 2026 that reported psychological outcomes and/or coping mechanisms among individuals with MRKH. Studies focused solely on anatomical, surgical, or fertility outcomes were excluded, as were records published before January 2019. </w:t>
-      </w:r>
-      <w:r>
-        <w:rPr>
-          <w:b w:val="0"/>
-          <w:i w:val="0"/>
-          <w:highlight w:val="yellow"/>
-        </w:rPr>
-        <w:t>[Confirm any additional criteria applied, e.g., language (English only?), peer-reviewed publications only, and exclusion of reviews, case reports, editorials, and conference abstracts.]</w:t>
+        <w:t xml:space="preserve"> was any healthcare or community setting in any country. We included primary quantitative, qualitative, and mixed-methods studies published between January 2019 and March 2026 that reported psychological outcomes and/or coping mechanisms among individuals with MRKH. Studies focused solely on anatomical, surgical, or fertility outcomes were excluded, as were records published before January 2019 and records not published in English (the English-only criterion recorded in the review's March 2026 screening tracker). Reviews, commentaries, editorials, and case reports were excluded as not primary research.</w:t>
       </w:r>
     </w:p>
     <w:p>
@@ -949,7 +941,7 @@
           <w:b w:val="0"/>
           <w:i w:val="0"/>
         </w:rPr>
-        <w:t>The searches identified 516 records. After removal of 192 duplicates, 324 records were screened and 278 were excluded: published before 2019 (n = 89); case report / surgical case series (n = 75); not primary research (n = 48); surgical/functional outcomes only (n = 38); wrong population / topic (n = 28). Of the 46 records assessed for eligibility, 7 were excluded (mixed sample, mrkh not separate, n = 5; no psychological outcome, n = 2), and 39 studies were provisionally included (Figure 1).</w:t>
+        <w:t>The searches identified 516 records. After removal of 192 duplicates, 324 records were screened and 282 were excluded: published before 2019 (n = 89); case report / surgical case series (n = 75); not primary research (n = 48); surgical/functional outcomes only (n = 38); wrong population / topic (n = 28); not in english (n = 4). Of the 42 records assessed for eligibility, 6 were excluded (mixed sample, mrkh not separate, n = 4; no psychological outcome, n = 2), and 36 studies were provisionally included (Figure 1).</w:t>
       </w:r>
     </w:p>
     <w:p>
@@ -1034,7 +1026,7 @@
           <w:b w:val="0"/>
           <w:i w:val="0"/>
         </w:rPr>
-        <w:t>The 39 included studies were published between 2019 and 2026 and comprised 20 quantitative studies (51.3%), 15 qualitative studies (38.5%), and 3 mixed-methods studies (7.7%); the design of 1 study could not be determined from its abstract (Table 1; Figure 2). Quantitative designs included cross-sectional surveys, case-control comparisons, cohort and pre–post studies, and 1 randomized controlled trial.</w:t>
+        <w:t>The 36 included studies were published between 2019 and 2026 and comprised 18 quantitative studies (50.0%), 15 qualitative studies (41.7%), and 2 mixed-methods studies (5.6%); the design of 1 study could not be determined from its abstract (Table 1; Figure 2). Quantitative designs included cross-sectional surveys, case-control comparisons, cohort and pre–post studies, and 1 randomized controlled trial.</w:t>
       </w:r>
       <w:r>
         <w:rPr>
@@ -1049,7 +1041,7 @@
           <w:b w:val="0"/>
           <w:i w:val="0"/>
         </w:rPr>
-        <w:t xml:space="preserve"> Most studies came from Europe (n = 17) and Asia (n = 14), followed by North America (n = 3), Africa (n = 2), and Oceania (n = 1); 2 studies recruited internationally, and none came from South America (Figure 3). China contributed the most studies (n = 6). Sample sizes, where reported, ranged from 5 to 616 participants. Two Chinese reports appear to draw on the same sample of 141 patients.</w:t>
+        <w:t xml:space="preserve"> Most studies came from Europe (n = 15) and Asia (n = 14), followed by North America (n = 3), Africa (n = 1), and Oceania (n = 1); 2 studies recruited internationally, and none came from South America (Figure 3). China contributed the most studies (n = 6). Sample sizes, where reported, ranged from 5 to 616 participants. Two Chinese reports appear to draw on the same sample of 141 patients.</w:t>
       </w:r>
       <w:r>
         <w:rPr>
@@ -1084,7 +1076,7 @@
           <w:b w:val="0"/>
           <w:i w:val="0"/>
         </w:rPr>
-        <w:t xml:space="preserve"> Study design and geographic distribution of included studies (N = 34)</w:t>
+        <w:t xml:space="preserve"> Study design and geographic distribution of included studies (N = 36)</w:t>
       </w:r>
     </w:p>
     <w:tbl>
@@ -1240,7 +1232,7 @@
                 <w:i w:val="0"/>
                 <w:sz w:val="20"/>
               </w:rPr>
-              <w:t>20</w:t>
+              <w:t>18</w:t>
             </w:r>
           </w:p>
         </w:tc>
@@ -1259,7 +1251,7 @@
                 <w:i w:val="0"/>
                 <w:sz w:val="20"/>
               </w:rPr>
-              <w:t>51.3%</w:t>
+              <w:t>50.0%</w:t>
             </w:r>
           </w:p>
         </w:tc>
@@ -1318,7 +1310,7 @@
                 <w:i w:val="0"/>
                 <w:sz w:val="20"/>
               </w:rPr>
-              <w:t>38.5%</w:t>
+              <w:t>41.7%</w:t>
             </w:r>
           </w:p>
         </w:tc>
@@ -1358,7 +1350,7 @@
                 <w:i w:val="0"/>
                 <w:sz w:val="20"/>
               </w:rPr>
-              <w:t>3</w:t>
+              <w:t>2</w:t>
             </w:r>
           </w:p>
         </w:tc>
@@ -1377,7 +1369,7 @@
                 <w:i w:val="0"/>
                 <w:sz w:val="20"/>
               </w:rPr>
-              <w:t>7.7%</w:t>
+              <w:t>5.6%</w:t>
             </w:r>
           </w:p>
         </w:tc>
@@ -1436,7 +1428,7 @@
                 <w:i w:val="0"/>
                 <w:sz w:val="20"/>
               </w:rPr>
-              <w:t>2.6%</w:t>
+              <w:t>2.8%</w:t>
             </w:r>
           </w:p>
         </w:tc>
@@ -1519,7 +1511,7 @@
                 <w:i w:val="0"/>
                 <w:sz w:val="20"/>
               </w:rPr>
-              <w:t>17</w:t>
+              <w:t>15</w:t>
             </w:r>
           </w:p>
         </w:tc>
@@ -1538,7 +1530,7 @@
                 <w:i w:val="0"/>
                 <w:sz w:val="20"/>
               </w:rPr>
-              <w:t>43.6%</w:t>
+              <w:t>41.7%</w:t>
             </w:r>
           </w:p>
         </w:tc>
@@ -1597,7 +1589,7 @@
                 <w:i w:val="0"/>
                 <w:sz w:val="20"/>
               </w:rPr>
-              <w:t>35.9%</w:t>
+              <w:t>38.9%</w:t>
             </w:r>
           </w:p>
         </w:tc>
@@ -1656,7 +1648,7 @@
                 <w:i w:val="0"/>
                 <w:sz w:val="20"/>
               </w:rPr>
-              <w:t>7.7%</w:t>
+              <w:t>8.3%</w:t>
             </w:r>
           </w:p>
         </w:tc>
@@ -1677,7 +1669,7 @@
                 <w:i w:val="0"/>
                 <w:sz w:val="20"/>
               </w:rPr>
-              <w:t>Africa</w:t>
+              <w:t>Multinational</w:t>
             </w:r>
           </w:p>
         </w:tc>
@@ -1715,7 +1707,7 @@
                 <w:i w:val="0"/>
                 <w:sz w:val="20"/>
               </w:rPr>
-              <w:t>5.1%</w:t>
+              <w:t>5.6%</w:t>
             </w:r>
           </w:p>
         </w:tc>
@@ -1736,7 +1728,7 @@
                 <w:i w:val="0"/>
                 <w:sz w:val="20"/>
               </w:rPr>
-              <w:t>Multinational</w:t>
+              <w:t>Africa</w:t>
             </w:r>
           </w:p>
         </w:tc>
@@ -1755,7 +1747,7 @@
                 <w:i w:val="0"/>
                 <w:sz w:val="20"/>
               </w:rPr>
-              <w:t>2</w:t>
+              <w:t>1</w:t>
             </w:r>
           </w:p>
         </w:tc>
@@ -1774,7 +1766,7 @@
                 <w:i w:val="0"/>
                 <w:sz w:val="20"/>
               </w:rPr>
-              <w:t>5.1%</w:t>
+              <w:t>2.8%</w:t>
             </w:r>
           </w:p>
         </w:tc>
@@ -1833,7 +1825,7 @@
                 <w:i w:val="0"/>
                 <w:sz w:val="20"/>
               </w:rPr>
-              <w:t>2.6%</w:t>
+              <w:t>2.8%</w:t>
             </w:r>
           </w:p>
         </w:tc>
@@ -1908,7 +1900,7 @@
           <w:i w:val="0"/>
           <w:sz w:val="20"/>
         </w:rPr>
-        <w:t>Percentages are of all included studies (N = 34) and may not total 100% because of rounding. Classifications are provisional (abstract-level).</w:t>
+        <w:t>Percentages are of all included studies (N = 36) and may not total 100% because of rounding. Classifications are provisional (abstract-level).</w:t>
       </w:r>
     </w:p>
     <w:p>
@@ -1969,7 +1961,7 @@
           <w:i w:val="0"/>
           <w:sz w:val="20"/>
         </w:rPr>
-        <w:t xml:space="preserve"> Distribution of included studies by design (N = 34).</w:t>
+        <w:t xml:space="preserve"> Distribution of included studies by design (N = 36).</w:t>
       </w:r>
     </w:p>
     <w:p>
@@ -2030,7 +2022,7 @@
           <w:i w:val="0"/>
           <w:sz w:val="20"/>
         </w:rPr>
-        <w:t xml:space="preserve"> Geographic distribution of included studies by region (N = 34). Darker shading indicates more studies; 2 multinational studies are not mapped.</w:t>
+        <w:t xml:space="preserve"> Geographic distribution of included studies by region (N = 36). Darker shading indicates more studies; 2 multinational studies are not mapped.</w:t>
       </w:r>
     </w:p>
     <w:p>
@@ -2054,7 +2046,7 @@
           <w:b w:val="0"/>
           <w:i w:val="0"/>
         </w:rPr>
-        <w:t>Psychosexual and relational challenges were the most frequently reported domain (25 of 39 studies; 64.1%), followed by quality of life, body image, and self-esteem (20; 51.3%), broader psychological distress (22; 56.4%), and depression and anxiety (12; 30.8%) (Table 2; Figure 4).</w:t>
+        <w:t>Psychosexual and relational challenges were the most frequently reported domain (23 of 36 studies; 63.9%), followed by quality of life, body image, and self-esteem (17; 47.2%), broader psychological distress (20; 55.6%), and depression and anxiety (11; 30.6%) (Table 2; Figure 4).</w:t>
       </w:r>
     </w:p>
     <w:p>
@@ -2118,7 +2110,7 @@
           <w:b w:val="0"/>
           <w:i w:val="0"/>
         </w:rPr>
-        <w:t xml:space="preserve"> A French psychodynamic study described how the neovagina shaped sexual identity and body image.</w:t>
+        <w:t xml:space="preserve"> Adults with differences of sex development, including MRKH, described balancing concealment and disclosure of their condition.</w:t>
       </w:r>
       <w:r>
         <w:rPr>
@@ -2145,7 +2137,7 @@
           <w:b w:val="0"/>
           <w:i w:val="0"/>
         </w:rPr>
-        <w:t xml:space="preserve"> Several studies found impaired psychological or mental health–related quality of life,</w:t>
+        <w:t xml:space="preserve"> A prospective study found impaired mental health–related quality of life despite normal body image,</w:t>
       </w:r>
       <w:r>
         <w:rPr>
@@ -2153,7 +2145,7 @@
           <w:i w:val="0"/>
           <w:vertAlign w:val="superscript"/>
         </w:rPr>
-        <w:t>25–27</w:t>
+        <w:t>25</w:t>
       </w:r>
       <w:r>
         <w:rPr>
@@ -2168,7 +2160,7 @@
           <w:i w:val="0"/>
           <w:vertAlign w:val="superscript"/>
         </w:rPr>
-        <w:t>28</w:t>
+        <w:t>26</w:t>
       </w:r>
       <w:r>
         <w:rPr>
@@ -2183,7 +2175,7 @@
           <w:i w:val="0"/>
           <w:vertAlign w:val="superscript"/>
         </w:rPr>
-        <w:t>29</w:t>
+        <w:t>27</w:t>
       </w:r>
       <w:r>
         <w:rPr>
@@ -2198,7 +2190,7 @@
           <w:i w:val="0"/>
           <w:vertAlign w:val="superscript"/>
         </w:rPr>
-        <w:t>30</w:t>
+        <w:t>28</w:t>
       </w:r>
       <w:r>
         <w:rPr>
@@ -2213,7 +2205,7 @@
           <w:i w:val="0"/>
           <w:vertAlign w:val="superscript"/>
         </w:rPr>
-        <w:t>31,32</w:t>
+        <w:t>29,30</w:t>
       </w:r>
     </w:p>
     <w:p>
@@ -2240,7 +2232,7 @@
           <w:i w:val="0"/>
           <w:vertAlign w:val="superscript"/>
         </w:rPr>
-        <w:t>9,33,34</w:t>
+        <w:t>9,31,32</w:t>
       </w:r>
       <w:r>
         <w:rPr>
@@ -2255,14 +2247,14 @@
           <w:i w:val="0"/>
           <w:vertAlign w:val="superscript"/>
         </w:rPr>
-        <w:t>35</w:t>
+        <w:t>33</w:t>
       </w:r>
       <w:r>
         <w:rPr>
           <w:b w:val="0"/>
           <w:i w:val="0"/>
         </w:rPr>
-        <w:t xml:space="preserve"> A French study of 40 women described binge eating with weight gain after diagnosis in about 10%,</w:t>
+        <w:t xml:space="preserve"> Uterus transplant recipients described changes in self-perception, body, and sexuality.</w:t>
       </w:r>
       <w:r>
         <w:rPr>
@@ -2270,22 +2262,7 @@
           <w:i w:val="0"/>
           <w:vertAlign w:val="superscript"/>
         </w:rPr>
-        <w:t>36</w:t>
-      </w:r>
-      <w:r>
-        <w:rPr>
-          <w:b w:val="0"/>
-          <w:i w:val="0"/>
-        </w:rPr>
-        <w:t xml:space="preserve"> and uterus transplant recipients described changes in self-perception, body, and sexuality.</w:t>
-      </w:r>
-      <w:r>
-        <w:rPr>
-          <w:b w:val="0"/>
-          <w:i w:val="0"/>
-          <w:vertAlign w:val="superscript"/>
-        </w:rPr>
-        <w:t>37</w:t>
+        <w:t>34</w:t>
       </w:r>
     </w:p>
     <w:p>
@@ -2342,7 +2319,7 @@
           <w:i w:val="0"/>
           <w:vertAlign w:val="superscript"/>
         </w:rPr>
-        <w:t>38</w:t>
+        <w:t>35</w:t>
       </w:r>
       <w:r>
         <w:rPr>
@@ -2357,7 +2334,7 @@
           <w:i w:val="0"/>
           <w:vertAlign w:val="superscript"/>
         </w:rPr>
-        <w:t>39</w:t>
+        <w:t>36</w:t>
       </w:r>
       <w:r>
         <w:rPr>
@@ -2372,7 +2349,7 @@
           <w:i w:val="0"/>
           <w:vertAlign w:val="superscript"/>
         </w:rPr>
-        <w:t>40</w:t>
+        <w:t>37</w:t>
       </w:r>
       <w:r>
         <w:rPr>
@@ -2387,7 +2364,7 @@
           <w:i w:val="0"/>
           <w:vertAlign w:val="superscript"/>
         </w:rPr>
-        <w:t>41,42</w:t>
+        <w:t>38,39</w:t>
       </w:r>
       <w:r>
         <w:rPr>
@@ -2402,7 +2379,7 @@
           <w:i w:val="0"/>
           <w:vertAlign w:val="superscript"/>
         </w:rPr>
-        <w:t>43</w:t>
+        <w:t>40</w:t>
       </w:r>
       <w:r>
         <w:rPr>
@@ -2417,7 +2394,7 @@
           <w:i w:val="0"/>
           <w:vertAlign w:val="superscript"/>
         </w:rPr>
-        <w:t>44</w:t>
+        <w:t>41</w:t>
       </w:r>
     </w:p>
     <w:p>
@@ -2437,7 +2414,7 @@
           <w:b w:val="0"/>
           <w:i w:val="0"/>
         </w:rPr>
-        <w:t xml:space="preserve"> Mental health and psychosocial outcome domains reported in included studies (N = 34)</w:t>
+        <w:t xml:space="preserve"> Mental health and psychosocial outcome domains reported in included studies (N = 36)</w:t>
       </w:r>
     </w:p>
     <w:tbl>
@@ -2569,7 +2546,7 @@
                 <w:i w:val="0"/>
                 <w:sz w:val="20"/>
               </w:rPr>
-              <w:t>25 (64.1%)</w:t>
+              <w:t>23 (63.9%)</w:t>
             </w:r>
           </w:p>
         </w:tc>
@@ -2628,7 +2605,7 @@
                 <w:i w:val="0"/>
                 <w:sz w:val="20"/>
               </w:rPr>
-              <w:t>20 (51.3%)</w:t>
+              <w:t>17 (47.2%)</w:t>
             </w:r>
           </w:p>
         </w:tc>
@@ -2687,7 +2664,7 @@
                 <w:i w:val="0"/>
                 <w:sz w:val="20"/>
               </w:rPr>
-              <w:t>22 (56.4%)</w:t>
+              <w:t>20 (55.6%)</w:t>
             </w:r>
           </w:p>
         </w:tc>
@@ -2746,7 +2723,7 @@
                 <w:i w:val="0"/>
                 <w:sz w:val="20"/>
               </w:rPr>
-              <w:t>12 (30.8%)</w:t>
+              <w:t>11 (30.6%)</w:t>
             </w:r>
           </w:p>
         </w:tc>
@@ -2823,7 +2800,7 @@
           <w:i w:val="0"/>
           <w:sz w:val="20"/>
         </w:rPr>
-        <w:t xml:space="preserve"> Number of included studies reporting each outcome domain, coping mechanisms, and healthcare system gaps (N = 34). Studies could contribute to more than one category.</w:t>
+        <w:t xml:space="preserve"> Number of included studies reporting each outcome domain, coping mechanisms, and healthcare system gaps (N = 36). Studies could contribute to more than one category.</w:t>
       </w:r>
     </w:p>
     <w:p>
@@ -2847,7 +2824,7 @@
           <w:b w:val="0"/>
           <w:i w:val="0"/>
         </w:rPr>
-        <w:t>Coping mechanisms were documented in 14 studies (35.9%; Table 3). Peer, family, and social support was most common,</w:t>
+        <w:t>Coping mechanisms were documented in 14 studies (38.9%; Table 3). Peer, family, and social support was most common,</w:t>
       </w:r>
       <w:r>
         <w:rPr>
@@ -2855,7 +2832,7 @@
           <w:i w:val="0"/>
           <w:vertAlign w:val="superscript"/>
         </w:rPr>
-        <w:t>23,26,28,34,45,46</w:t>
+        <w:t>23,25,26,32,42,43</w:t>
       </w:r>
       <w:r>
         <w:rPr>
@@ -2870,7 +2847,7 @@
           <w:i w:val="0"/>
           <w:vertAlign w:val="superscript"/>
         </w:rPr>
-        <w:t>23,33,45,47</w:t>
+        <w:t>23,24,31,42,44</w:t>
       </w:r>
       <w:r>
         <w:rPr>
@@ -2885,7 +2862,7 @@
           <w:i w:val="0"/>
           <w:vertAlign w:val="superscript"/>
         </w:rPr>
-        <w:t>45</w:t>
+        <w:t>42</w:t>
       </w:r>
       <w:r>
         <w:rPr>
@@ -2900,14 +2877,14 @@
           <w:i w:val="0"/>
           <w:vertAlign w:val="superscript"/>
         </w:rPr>
-        <w:t>28</w:t>
+        <w:t>26</w:t>
       </w:r>
       <w:r>
         <w:rPr>
           <w:b w:val="0"/>
           <w:i w:val="0"/>
         </w:rPr>
-        <w:t xml:space="preserve"> Structured psychological or psychosexual interventions were evaluated in only 3 studies.</w:t>
+        <w:t xml:space="preserve"> Structured psychological or psychosexual interventions were evaluated in only 2 studies.</w:t>
       </w:r>
       <w:r>
         <w:rPr>
@@ -2915,7 +2892,7 @@
           <w:i w:val="0"/>
           <w:vertAlign w:val="superscript"/>
         </w:rPr>
-        <w:t>16,27,48</w:t>
+        <w:t>16,45</w:t>
       </w:r>
     </w:p>
     <w:p>
@@ -3126,7 +3103,7 @@
                 <w:i w:val="0"/>
                 <w:sz w:val="20"/>
               </w:rPr>
-              <w:t>4</w:t>
+              <w:t>5</w:t>
             </w:r>
           </w:p>
         </w:tc>
@@ -3147,7 +3124,7 @@
                 <w:i w:val="0"/>
                 <w:sz w:val="20"/>
               </w:rPr>
-              <w:t>Psychological counseling/intervention</w:t>
+              <w:t>Identity reconstruction / positive reappraisal</w:t>
             </w:r>
           </w:p>
         </w:tc>
@@ -3206,7 +3183,7 @@
                 <w:i w:val="0"/>
                 <w:sz w:val="20"/>
               </w:rPr>
-              <w:t>Identity reconstruction / positive reappraisal</w:t>
+              <w:t>Psychological counseling/intervention</w:t>
             </w:r>
           </w:p>
         </w:tc>
@@ -3244,7 +3221,7 @@
                 <w:i w:val="0"/>
                 <w:sz w:val="20"/>
               </w:rPr>
-              <w:t>3</w:t>
+              <w:t>2</w:t>
             </w:r>
           </w:p>
         </w:tc>
@@ -3461,7 +3438,7 @@
           <w:b w:val="0"/>
           <w:i w:val="0"/>
         </w:rPr>
-        <w:t>Healthcare system gaps were reported in 10 studies (25.6%; Table 4). Participants described providers with limited knowledge of MRKH and the need to advocate for themselves,</w:t>
+        <w:t>Healthcare system gaps were reported in 10 studies (27.8%; Table 4). Participants described providers with limited knowledge of MRKH and the need to advocate for themselves,</w:t>
       </w:r>
       <w:r>
         <w:rPr>
@@ -3469,7 +3446,7 @@
           <w:i w:val="0"/>
           <w:vertAlign w:val="superscript"/>
         </w:rPr>
-        <w:t>33,49</w:t>
+        <w:t>31,46</w:t>
       </w:r>
       <w:r>
         <w:rPr>
@@ -3484,7 +3461,7 @@
           <w:i w:val="0"/>
           <w:vertAlign w:val="superscript"/>
         </w:rPr>
-        <w:t>23,35,46</w:t>
+        <w:t>23,33,43</w:t>
       </w:r>
       <w:r>
         <w:rPr>
@@ -3499,7 +3476,7 @@
           <w:i w:val="0"/>
           <w:vertAlign w:val="superscript"/>
         </w:rPr>
-        <w:t>50</w:t>
+        <w:t>47</w:t>
       </w:r>
       <w:r>
         <w:rPr>
@@ -3514,7 +3491,7 @@
           <w:i w:val="0"/>
           <w:vertAlign w:val="superscript"/>
         </w:rPr>
-        <w:t>46,47,51</w:t>
+        <w:t>43,44,48</w:t>
       </w:r>
       <w:r>
         <w:rPr>
@@ -3529,7 +3506,7 @@
           <w:i w:val="0"/>
           <w:vertAlign w:val="superscript"/>
         </w:rPr>
-        <w:t>52</w:t>
+        <w:t>49</w:t>
       </w:r>
     </w:p>
     <w:p>
@@ -3840,7 +3817,7 @@
           <w:b w:val="0"/>
           <w:i w:val="0"/>
         </w:rPr>
-        <w:t>This scoping review mapped 39 studies published between 2019 and 2026 on the mental health and psychosocial outcomes of individuals with MRKH syndrome. Psychosexual and relational challenges were the most frequently reported outcome, reported in about two of every three studies, while broader psychological distress and quality of life, body image, and self-esteem were each reported in about half. Depression and anxiety were measured less often, and results were mixed. Coping was documented in more than one in three studies and relied largely on peer support and self-management, and about one in four studies described healthcare system gaps.</w:t>
+        <w:t>This scoping review mapped 36 studies published between 2019 and 2026 on the mental health and psychosocial outcomes of individuals with MRKH syndrome. Psychosexual and relational challenges were the most frequently reported outcome, reported in about two of every three studies, while broader psychological distress and quality of life, body image, and self-esteem were each reported in about half. Depression and anxiety were measured less often, and results were mixed. Coping was documented in more than one in three studies and relied largely on peer support and self-management, and about one in four studies described healthcare system gaps.</w:t>
       </w:r>
     </w:p>
     <w:p>
@@ -3959,7 +3936,7 @@
           <w:i w:val="0"/>
           <w:vertAlign w:val="superscript"/>
         </w:rPr>
-        <w:t>53</w:t>
+        <w:t>50</w:t>
       </w:r>
       <w:r>
         <w:rPr>
@@ -3974,7 +3951,7 @@
           <w:i w:val="0"/>
           <w:vertAlign w:val="superscript"/>
         </w:rPr>
-        <w:t>16,48</w:t>
+        <w:t>16,45</w:t>
       </w:r>
       <w:r>
         <w:rPr>
@@ -4020,7 +3997,7 @@
           <w:b w:val="0"/>
           <w:i w:val="0"/>
         </w:rPr>
-        <w:t xml:space="preserve"> participants described providers unfamiliar with the condition, insensitive communication, and scarce psychological and fertility counseling, indicating a gap between recommendations and practice. The evidence base is more geographically diverse than earlier literature—Asia contributed nearly as many studies as Europe—yet only 2 studies came from Africa and none from South America, where expectations regarding fertility, marriage, and womanhood and access to specialized care may differ substantially. Studies from Türkiye, Vietnam, and Japan illustrate how cultural context shapes experiences of diagnosis, disclosure, and infertility.</w:t>
+        <w:t xml:space="preserve"> participants described providers unfamiliar with the condition, insensitive communication, and scarce psychological and fertility counseling, indicating a gap between recommendations and practice. The evidence base is more geographically diverse than earlier literature—Asia contributed nearly as many studies as Europe—yet only 1 study came from Africa and none from South America, where expectations regarding fertility, marriage, and womanhood and access to specialized care may differ substantially. Studies from Türkiye, Vietnam, and Japan illustrate how cultural context shapes experiences of diagnosis, disclosure, and infertility.</w:t>
       </w:r>
       <w:r>
         <w:rPr>
@@ -4028,7 +4005,7 @@
           <w:i w:val="0"/>
           <w:vertAlign w:val="superscript"/>
         </w:rPr>
-        <w:t>9,47,54</w:t>
+        <w:t>9,44,51</w:t>
       </w:r>
     </w:p>
     <w:p>
@@ -4076,7 +4053,7 @@
           <w:b w:val="0"/>
           <w:i w:val="0"/>
         </w:rPr>
-        <w:t xml:space="preserve">Strengths include an established methodological framework, PRISMA-ScR reporting, a search of biomedical, nursing, psychological, and women's studies databases, and inclusion of quantitative, qualitative, and mixed-methods evidence. The most important limitation is that the original screening records were lost and selection was repeated from the original exports with AI-assisted screening and abstract-level data charting; results are therefore provisional until reviewer verification and full-text confirmation of the 39 included studies are complete. In addition, the review was limited to 2019–2026, date limits were applied inconsistently across database interfaces and enforced at screening, designs and measures were heterogeneous, and some studies may share samples. Consistent with scoping methodology, study quality was not appraised, and counts reflect how often outcomes were studied, not their prevalence. </w:t>
+        <w:t xml:space="preserve">Strengths include an established methodological framework, PRISMA-ScR reporting, a search of biomedical, nursing, psychological, and women's studies databases, and inclusion of quantitative, qualitative, and mixed-methods evidence. The most important limitation is that the original screening records were lost and selection was repeated from the original exports with AI-assisted screening and abstract-level data charting; results are therefore provisional until reviewer verification and full-text confirmation of the 36 included studies are complete. In addition, the review was limited to 2019–2026, date limits were applied inconsistently across database interfaces and enforced at screening, designs and measures were heterogeneous, and some studies may share samples. Consistent with scoping methodology, study quality was not appraised, and counts reflect how often outcomes were studied, not their prevalence. </w:t>
       </w:r>
       <w:r>
         <w:rPr>
@@ -4926,21 +4903,21 @@
         </w:rPr>
         <w:t>24.</w:t>
         <w:tab/>
-        <w:t xml:space="preserve">Blanc S, Brun A. Absence des organes génitaux internes chez la femme: Enjeux et répercussions sur l’identité sexuelle. </w:t>
+        <w:t xml:space="preserve">Mediå LM, Fauske L, Sigurdardottir S, Feragen KJB, Heggeli C, Wæhre A. ‘It was Supposed to be a Secret’: a study of disclosure and stigma as experienced by adults with differences of sex development. </w:t>
       </w:r>
       <w:r>
         <w:rPr>
           <w:b w:val="0"/>
           <w:i/>
         </w:rPr>
-        <w:t>Evol Psychiatr</w:t>
+        <w:t>Health Psychol Behav Med</w:t>
       </w:r>
       <w:r>
         <w:rPr>
           <w:b w:val="0"/>
           <w:i w:val="0"/>
         </w:rPr>
-        <w:t>. 2019;84(4):591-603. doi:10.1016/j.evopsy.2019.07.006</w:t>
+        <w:t>. 2022;10(1):579-595. doi:10.1080/21642850.2022.2102018</w:t>
       </w:r>
     </w:p>
     <w:p>
@@ -4954,21 +4931,21 @@
         </w:rPr>
         <w:t>25.</w:t>
         <w:tab/>
-        <w:t xml:space="preserve">Magdoud K, Abouda HS, Jellouli A, Ben Hmid R, Chanoufi MB, Karoui A. Sexuality and quality of life of patients operated for Rokitansky syndrome Mayer Kuster Hauser. </w:t>
+        <w:t xml:space="preserve">Rall K, Schenk B, Schäffeler N, et al. Long term findings concerning the mental and physical condition, quality of life and sexuality after laparoscopically assisted creation of a neovagina (modified Vecchietti technique) in young MRKHS (Mayer-Rokitansky-Küster-Hauser-Syndrome) patients. </w:t>
       </w:r>
       <w:r>
         <w:rPr>
           <w:b w:val="0"/>
           <w:i/>
         </w:rPr>
-        <w:t>Tunis Med</w:t>
+        <w:t>J Clin Med</w:t>
       </w:r>
       <w:r>
         <w:rPr>
           <w:b w:val="0"/>
           <w:i w:val="0"/>
         </w:rPr>
-        <w:t>. 2024;102(5):310-314. doi:10.62438/tunismed.v102i5.4738</w:t>
+        <w:t>. 2021;10(6):1269. doi:10.3390/jcm10061269</w:t>
       </w:r>
     </w:p>
     <w:p>
@@ -4982,21 +4959,21 @@
         </w:rPr>
         <w:t>26.</w:t>
         <w:tab/>
-        <w:t xml:space="preserve">Rall K, Schenk B, Schäffeler N, et al. Long term findings concerning the mental and physical condition, quality of life and sexuality after laparoscopically assisted creation of a neovagina (modified Vecchietti technique) in young MRKHS (Mayer-Rokitansky-Küster-Hauser-Syndrome) patients. </w:t>
+        <w:t xml:space="preserve">Carroll S, Laufer MR, Thomas-Kowal P, Lossie AC, Moss-Morris R. From engulfment to enrichment: Associations between illness representations, self-concept, and psychological adjustment in Mayer-Rokitansky-Küster-Hauser syndrome. </w:t>
       </w:r>
       <w:r>
         <w:rPr>
           <w:b w:val="0"/>
           <w:i/>
         </w:rPr>
-        <w:t>J Clin Med</w:t>
+        <w:t>J Pediatr Adolesc Gynecol</w:t>
       </w:r>
       <w:r>
         <w:rPr>
           <w:b w:val="0"/>
           <w:i w:val="0"/>
         </w:rPr>
-        <w:t>. 2021;10(6):1269. doi:10.3390/jcm10061269</w:t>
+        <w:t>. 2020;33(6):639-648. doi:10.1016/j.jpag.2020.07.006</w:t>
       </w:r>
     </w:p>
     <w:p>
@@ -5010,21 +4987,21 @@
         </w:rPr>
         <w:t>27.</w:t>
         <w:tab/>
-        <w:t xml:space="preserve">Schäffeler N, Beckmann J, Schenk B, et al. [Burden of affected persons with MRKH syndrome: Effect of an intervention to support surgical neovaginal placement]. </w:t>
+        <w:t xml:space="preserve">Arsy GR, Ratnawati R, Rachmawati SD. Low self-esteem of women suffering Mayer Rokitansky Kuster Hauser syndrome. </w:t>
       </w:r>
       <w:r>
         <w:rPr>
           <w:b w:val="0"/>
           <w:i/>
         </w:rPr>
-        <w:t>Psychother Psychosom Med Psychol</w:t>
+        <w:t>Indian J Public Health Res Dev</w:t>
       </w:r>
       <w:r>
         <w:rPr>
           <w:b w:val="0"/>
           <w:i w:val="0"/>
         </w:rPr>
-        <w:t>. 2022;72(11):473-480. doi:10.1055/a-1778-5194</w:t>
+        <w:t>. 2019;10(8):2042-2045. doi:10.5958/0976-5506.2019.02155.7</w:t>
       </w:r>
     </w:p>
     <w:p>
@@ -5038,21 +5015,21 @@
         </w:rPr>
         <w:t>28.</w:t>
         <w:tab/>
-        <w:t xml:space="preserve">Carroll S, Laufer MR, Thomas-Kowal P, Lossie AC, Moss-Morris R. From engulfment to enrichment: Associations between illness representations, self-concept, and psychological adjustment in Mayer-Rokitansky-Küster-Hauser syndrome. </w:t>
+        <w:t xml:space="preserve">Kang J, Chen N, Song S, et al. Sexual function and quality of life after the creation of a neovagina in women with Mayer-Rokitansky-Küster-Hauser syndrome: comparison of vaginal dilation and surgical procedures. </w:t>
       </w:r>
       <w:r>
         <w:rPr>
           <w:b w:val="0"/>
           <w:i/>
         </w:rPr>
-        <w:t>J Pediatr Adolesc Gynecol</w:t>
+        <w:t>Fertil Steril</w:t>
       </w:r>
       <w:r>
         <w:rPr>
           <w:b w:val="0"/>
           <w:i w:val="0"/>
         </w:rPr>
-        <w:t>. 2020;33(6):639-648. doi:10.1016/j.jpag.2020.07.006</w:t>
+        <w:t>. 2020;113(5):1024-1031. doi:10.1016/j.fertnstert.2020.01.017</w:t>
       </w:r>
     </w:p>
     <w:p>
@@ -5066,21 +5043,21 @@
         </w:rPr>
         <w:t>29.</w:t>
         <w:tab/>
-        <w:t xml:space="preserve">Arsy GR, Ratnawati R, Rachmawati SD. Low self-esteem of women suffering Mayer Rokitansky Kuster Hauser syndrome. </w:t>
+        <w:t xml:space="preserve">Sabatucci I, Palaia I, Marchese C, et al. Treatment of the Mayer-Rokitansky-Küster-Hauser syndrome with autologous in vitro cultured vaginal tissue: descriptive study of long-term results and patient outcomes. </w:t>
       </w:r>
       <w:r>
         <w:rPr>
           <w:b w:val="0"/>
           <w:i/>
         </w:rPr>
-        <w:t>Indian J Public Health Res Dev</w:t>
+        <w:t>BJOG</w:t>
       </w:r>
       <w:r>
         <w:rPr>
           <w:b w:val="0"/>
           <w:i w:val="0"/>
         </w:rPr>
-        <w:t>. 2019;10(8):2042-2045. doi:10.5958/0976-5506.2019.02155.7</w:t>
+        <w:t>. 2019;126(1):123-127. doi:10.1111/1471-0528.15477</w:t>
       </w:r>
     </w:p>
     <w:p>
@@ -5094,21 +5071,21 @@
         </w:rPr>
         <w:t>30.</w:t>
         <w:tab/>
-        <w:t xml:space="preserve">Kang J, Chen N, Song S, et al. Sexual function and quality of life after the creation of a neovagina in women with Mayer-Rokitansky-Küster-Hauser syndrome: comparison of vaginal dilation and surgical procedures. </w:t>
+        <w:t xml:space="preserve">Mao M, Zhang Y, Fu H, Wang Q, Bai J, Guo R. Long-term results of sexual function and body image after vaginoplasty with acellular dermal matrix in women with Mayer-Rokitansky-Küster-Hauser syndrome. </w:t>
       </w:r>
       <w:r>
         <w:rPr>
           <w:b w:val="0"/>
           <w:i/>
         </w:rPr>
-        <w:t>Fertil Steril</w:t>
+        <w:t>J Minim Invasive Gynecol</w:t>
       </w:r>
       <w:r>
         <w:rPr>
           <w:b w:val="0"/>
           <w:i w:val="0"/>
         </w:rPr>
-        <w:t>. 2020;113(5):1024-1031. doi:10.1016/j.fertnstert.2020.01.017</w:t>
+        <w:t>. 2024;31(1):37-42. doi:10.1016/j.jmig.2023.10.003</w:t>
       </w:r>
     </w:p>
     <w:p>
@@ -5122,21 +5099,21 @@
         </w:rPr>
         <w:t>31.</w:t>
         <w:tab/>
-        <w:t xml:space="preserve">Sabatucci I, Palaia I, Marchese C, et al. Treatment of the Mayer-Rokitansky-Küster-Hauser syndrome with autologous in vitro cultured vaginal tissue: descriptive study of long-term results and patient outcomes. </w:t>
+        <w:t xml:space="preserve">Gilfillan R, Carter P. Issues of identity, perceptions and isolation: An interpretative phenomenological analysis of women's experience of Mayer-Rokitansky-Küster-Hauser (MRKH) syndrome. </w:t>
       </w:r>
       <w:r>
         <w:rPr>
           <w:b w:val="0"/>
           <w:i/>
         </w:rPr>
-        <w:t>BJOG</w:t>
+        <w:t>J Health Psychol</w:t>
       </w:r>
       <w:r>
         <w:rPr>
           <w:b w:val="0"/>
           <w:i w:val="0"/>
         </w:rPr>
-        <w:t>. 2019;126(1):123-127. doi:10.1111/1471-0528.15477</w:t>
+        <w:t>. 2024;29(3):200-212. doi:10.1177/13591053231199253</w:t>
       </w:r>
     </w:p>
     <w:p>
@@ -5150,21 +5127,21 @@
         </w:rPr>
         <w:t>32.</w:t>
         <w:tab/>
-        <w:t xml:space="preserve">Mao M, Zhang Y, Fu H, Wang Q, Bai J, Guo R. Long-term results of sexual function and body image after vaginoplasty with acellular dermal matrix in women with Mayer-Rokitansky-Küster-Hauser syndrome. </w:t>
+        <w:t xml:space="preserve">Jensen AH, Herlin MK, Vogel I, Lou S. A life course perspective on Mayer-Rokitansky-Küster-Hauser syndrome: women's experiences and negotiations of living with an underdeveloped uterus and vagina. </w:t>
       </w:r>
       <w:r>
         <w:rPr>
           <w:b w:val="0"/>
           <w:i/>
         </w:rPr>
-        <w:t>J Minim Invasive Gynecol</w:t>
+        <w:t>Disabil Rehabil</w:t>
       </w:r>
       <w:r>
         <w:rPr>
           <w:b w:val="0"/>
           <w:i w:val="0"/>
         </w:rPr>
-        <w:t>. 2024;31(1):37-42. doi:10.1016/j.jmig.2023.10.003</w:t>
+        <w:t>. 2024;46(6):1130-1140. doi:10.1080/09638288.2023.2191014</w:t>
       </w:r>
     </w:p>
     <w:p>
@@ -5178,21 +5155,21 @@
         </w:rPr>
         <w:t>33.</w:t>
         <w:tab/>
-        <w:t xml:space="preserve">Gilfillan R, Carter P. Issues of identity, perceptions and isolation: An interpretative phenomenological analysis of women's experience of Mayer-Rokitansky-Küster-Hauser (MRKH) syndrome. </w:t>
+        <w:t xml:space="preserve">Lou S, Jensen AH, Vogel I, Trolle B, Herlin MK. Understanding the diagnostic odyssey of women with Mayer-Rokitansky-Küster-Hauser (MRKH) syndrome in Denmark: A qualitative interview study. </w:t>
       </w:r>
       <w:r>
         <w:rPr>
           <w:b w:val="0"/>
           <w:i/>
         </w:rPr>
-        <w:t>J Health Psychol</w:t>
+        <w:t>J Pediatr Adolesc Gynecol</w:t>
       </w:r>
       <w:r>
         <w:rPr>
           <w:b w:val="0"/>
           <w:i w:val="0"/>
         </w:rPr>
-        <w:t>. 2024;29(3):200-212. doi:10.1177/13591053231199253</w:t>
+        <w:t>. 2024;37(4):412-418. doi:10.1016/j.jpag.2024.03.003</w:t>
       </w:r>
     </w:p>
     <w:p>
@@ -5206,21 +5183,21 @@
         </w:rPr>
         <w:t>34.</w:t>
         <w:tab/>
-        <w:t xml:space="preserve">Jensen AH, Herlin MK, Vogel I, Lou S. A life course perspective on Mayer-Rokitansky-Küster-Hauser syndrome: women's experiences and negotiations of living with an underdeveloped uterus and vagina. </w:t>
+        <w:t xml:space="preserve">Järvholm S, Enskog A, Hammarling C, Dahm-Kähler P, Brännström M. Uterus transplantation: Joys and frustrations of becoming a 'complete' woman-a qualitative study regarding self-image in the 5-year period after transplantation. </w:t>
       </w:r>
       <w:r>
         <w:rPr>
           <w:b w:val="0"/>
           <w:i/>
         </w:rPr>
-        <w:t>Disabil Rehabil</w:t>
+        <w:t>Human Reproduction</w:t>
       </w:r>
       <w:r>
         <w:rPr>
           <w:b w:val="0"/>
           <w:i w:val="0"/>
         </w:rPr>
-        <w:t>. 2024;46(6):1130-1140. doi:10.1080/09638288.2023.2191014</w:t>
+        <w:t>. 2020;35(8):1855-1863. doi:10.1093/humrep/deaa143</w:t>
       </w:r>
     </w:p>
     <w:p>
@@ -5234,7 +5211,7 @@
         </w:rPr>
         <w:t>35.</w:t>
         <w:tab/>
-        <w:t xml:space="preserve">Lou S, Jensen AH, Vogel I, Trolle B, Herlin MK. Understanding the diagnostic odyssey of women with Mayer-Rokitansky-Küster-Hauser (MRKH) syndrome in Denmark: A qualitative interview study. </w:t>
+        <w:t xml:space="preserve">Khairudin KB, Nik Mhd Nor NS, Childs JF, et al. Prevalence of anxiety and depression in women with Mayer-Rokitansky-Kϋster-Hauser (MRKH) syndrome in Malaysia. </w:t>
       </w:r>
       <w:r>
         <w:rPr>
@@ -5248,7 +5225,7 @@
           <w:b w:val="0"/>
           <w:i w:val="0"/>
         </w:rPr>
-        <w:t>. 2024;37(4):412-418. doi:10.1016/j.jpag.2024.03.003</w:t>
+        <w:t>. 2026;39(2):215-220. doi:10.1016/j.jpag.2025.11.005</w:t>
       </w:r>
     </w:p>
     <w:p>
@@ -5262,21 +5239,21 @@
         </w:rPr>
         <w:t>36.</w:t>
         <w:tab/>
-        <w:t xml:space="preserve">Gueniche K, Vibert S, Guinard M, Polak M, Le ’Study Group’ MRKH. Quand le féminin est mis à mal … À propos d’une prise de poids significative chez des jeunes femmes en post-annonce diagnostique d’une agénésie utéro-vaginale. </w:t>
+        <w:t xml:space="preserve">Lei XH, Wang X, Shao SY, Hua KQ, Zhang Y. Self-esteem, depression, anxiety and sexual function in Mayer-Rokitansky-Küster-Hauser syndrome with neovagina: A case series. </w:t>
       </w:r>
       <w:r>
         <w:rPr>
           <w:b w:val="0"/>
           <w:i/>
         </w:rPr>
-        <w:t>L'Évolution Psychiatrique</w:t>
+        <w:t>Eur J Obstet Gynecol Reprod Biol</w:t>
       </w:r>
       <w:r>
         <w:rPr>
           <w:b w:val="0"/>
           <w:i w:val="0"/>
         </w:rPr>
-        <w:t>. 2020;85(4):607-618. doi:10.1016/j.evopsy.2020.05.001</w:t>
+        <w:t>. 2024;298:85-90. doi:10.1016/j.ejogrb.2024.04.027</w:t>
       </w:r>
     </w:p>
     <w:p>
@@ -5290,21 +5267,21 @@
         </w:rPr>
         <w:t>37.</w:t>
         <w:tab/>
-        <w:t xml:space="preserve">Järvholm S, Enskog A, Hammarling C, Dahm-Kähler P, Brännström M. Uterus transplantation: Joys and frustrations of becoming a 'complete' woman-a qualitative study regarding self-image in the 5-year period after transplantation. </w:t>
+        <w:t xml:space="preserve">Sorouri Khorashad B, Kaabi O, Gardner MD, et al. Psychiatric comorbidities in women with complete androgen insensitivity syndrome or Müllerian duct aplasia/Agenesis. </w:t>
       </w:r>
       <w:r>
         <w:rPr>
           <w:b w:val="0"/>
           <w:i/>
         </w:rPr>
-        <w:t>Human Reproduction</w:t>
+        <w:t>J Clin Endocrinol Metab</w:t>
       </w:r>
       <w:r>
         <w:rPr>
           <w:b w:val="0"/>
           <w:i w:val="0"/>
         </w:rPr>
-        <w:t>. 2020;35(8):1855-1863. doi:10.1093/humrep/deaa143</w:t>
+        <w:t>. 2025;110(7):1906-1914. doi:10.1210/clinem/dgae720</w:t>
       </w:r>
     </w:p>
     <w:p>
@@ -5318,21 +5295,21 @@
         </w:rPr>
         <w:t>38.</w:t>
         <w:tab/>
-        <w:t xml:space="preserve">Khairudin KB, Nik Mhd Nor NS, Childs JF, et al. Prevalence of anxiety and depression in women with Mayer-Rokitansky-Kϋster-Hauser (MRKH) syndrome in Malaysia. </w:t>
+        <w:t xml:space="preserve">Karpel L, Nicaise M, Carbonnel M, et al. Psychological evaluation of candidates for the uterus transplantation French trial. </w:t>
       </w:r>
       <w:r>
         <w:rPr>
           <w:b w:val="0"/>
           <w:i/>
         </w:rPr>
-        <w:t>J Pediatr Adolesc Gynecol</w:t>
+        <w:t>Acta Obstet Gynecol Scand</w:t>
       </w:r>
       <w:r>
         <w:rPr>
           <w:b w:val="0"/>
           <w:i w:val="0"/>
         </w:rPr>
-        <w:t>. 2026;39(2):215-220. doi:10.1016/j.jpag.2025.11.005</w:t>
+        <w:t>. 2025;104(3):522-527. doi:10.1111/aogs.15004</w:t>
       </w:r>
     </w:p>
     <w:p>
@@ -5346,21 +5323,21 @@
         </w:rPr>
         <w:t>39.</w:t>
         <w:tab/>
-        <w:t xml:space="preserve">Lei XH, Wang X, Shao SY, Hua KQ, Zhang Y. Self-esteem, depression, anxiety and sexual function in Mayer-Rokitansky-Küster-Hauser syndrome with neovagina: A case series. </w:t>
+        <w:t xml:space="preserve">Jha S, Singh S. Sexual and psychosocial outcome after neovaginoplasty using Interceed in females with Mayer-Rokitansky-Küster-Hauser syndrome: A case-control study. </w:t>
       </w:r>
       <w:r>
         <w:rPr>
           <w:b w:val="0"/>
           <w:i/>
         </w:rPr>
-        <w:t>Eur J Obstet Gynecol Reprod Biol</w:t>
+        <w:t>J Obstet Gynaecol Can</w:t>
       </w:r>
       <w:r>
         <w:rPr>
           <w:b w:val="0"/>
           <w:i w:val="0"/>
         </w:rPr>
-        <w:t>. 2024;298:85-90. doi:10.1016/j.ejogrb.2024.04.027</w:t>
+        <w:t>. 2022;44(8):926-930. doi:10.1016/j.jogc.2022.03.018</w:t>
       </w:r>
     </w:p>
     <w:p>
@@ -5374,21 +5351,21 @@
         </w:rPr>
         <w:t>40.</w:t>
         <w:tab/>
-        <w:t xml:space="preserve">Sorouri Khorashad B, Kaabi O, Gardner MD, et al. Psychiatric comorbidities in women with complete androgen insensitivity syndrome or Müllerian duct aplasia/Agenesis. </w:t>
+        <w:t xml:space="preserve">Scollo P, Pecorino B, La Spina S, Veroux P, Giaquinta A, Scibilia G. Psychological and personality assessment in patients candidates for Uterus Transplantation from deceased donor: preliminary results. </w:t>
       </w:r>
       <w:r>
         <w:rPr>
           <w:b w:val="0"/>
           <w:i/>
         </w:rPr>
-        <w:t>J Clin Endocrinol Metab</w:t>
+        <w:t>Italian Journal of Gynaecology and Obstetrics</w:t>
       </w:r>
       <w:r>
         <w:rPr>
           <w:b w:val="0"/>
           <w:i w:val="0"/>
         </w:rPr>
-        <w:t>. 2025;110(7):1906-1914. doi:10.1210/clinem/dgae720</w:t>
+        <w:t>. 2020;32(4):287-292. doi:10.36129/jog.32.04.08</w:t>
       </w:r>
     </w:p>
     <w:p>
@@ -5402,21 +5379,21 @@
         </w:rPr>
         <w:t>41.</w:t>
         <w:tab/>
-        <w:t xml:space="preserve">Karpel L, Nicaise M, Carbonnel M, et al. Psychological evaluation of candidates for the uterus transplantation French trial. </w:t>
+        <w:t xml:space="preserve">Pittman J, Gerstl B, Walch A, Lotz M, Deans R, Morrison N. Psychological well-being of women with uterine infertility before considering uterus transplantation as a treatment option. </w:t>
       </w:r>
       <w:r>
         <w:rPr>
           <w:b w:val="0"/>
           <w:i/>
         </w:rPr>
-        <w:t>Acta Obstet Gynecol Scand</w:t>
+        <w:t>Aust N Z J Obstet Gynaecol</w:t>
       </w:r>
       <w:r>
         <w:rPr>
           <w:b w:val="0"/>
           <w:i w:val="0"/>
         </w:rPr>
-        <w:t>. 2025;104(3):522-527. doi:10.1111/aogs.15004</w:t>
+        <w:t>. 2025;65(2):263-268. doi:10.1111/ajo.13895</w:t>
       </w:r>
     </w:p>
     <w:p>
@@ -5430,21 +5407,21 @@
         </w:rPr>
         <w:t>42.</w:t>
         <w:tab/>
-        <w:t xml:space="preserve">Jha S, Singh S. Sexual and psychosocial outcome after neovaginoplasty using Interceed in females with Mayer-Rokitansky-Küster-Hauser syndrome: A case-control study. </w:t>
+        <w:t xml:space="preserve">Güner P, Ulukaya T. From avoidance to empowerment: Coping strategies in women with Müllerian agenesis (MRKH) after McIndoe reconstruction: A descriptive phenomenological study. </w:t>
       </w:r>
       <w:r>
         <w:rPr>
           <w:b w:val="0"/>
           <w:i/>
         </w:rPr>
-        <w:t>J Obstet Gynaecol Can</w:t>
+        <w:t>J Pediatr Adolesc Gynecol</w:t>
       </w:r>
       <w:r>
         <w:rPr>
           <w:b w:val="0"/>
           <w:i w:val="0"/>
         </w:rPr>
-        <w:t>. 2022;44(8):926-930. doi:10.1016/j.jogc.2022.03.018</w:t>
+        <w:t>. 2026;39(1):101-108. doi:10.1016/j.jpag.2025.10.013</w:t>
       </w:r>
     </w:p>
     <w:p>
@@ -5458,21 +5435,21 @@
         </w:rPr>
         <w:t>43.</w:t>
         <w:tab/>
-        <w:t xml:space="preserve">Scollo P, Pecorino B, La Spina S, Veroux P, Giaquinta A, Scibilia G. Psychological and personality assessment in patients candidates for Uterus Transplantation from deceased donor: preliminary results. </w:t>
+        <w:t xml:space="preserve">Hatim H, Zainuddin AA, Anizah A, et al. The missing uterus, the missed diagnosis, and the missing care. Mayer-Rokitansky-Küster-Hauser syndrome in the lives of women in Malaysia. </w:t>
       </w:r>
       <w:r>
         <w:rPr>
           <w:b w:val="0"/>
           <w:i/>
         </w:rPr>
-        <w:t>Italian Journal of Gynaecology and Obstetrics</w:t>
+        <w:t>J Pediatr Adolesc Gynecol</w:t>
       </w:r>
       <w:r>
         <w:rPr>
           <w:b w:val="0"/>
           <w:i w:val="0"/>
         </w:rPr>
-        <w:t>. 2020;32(4):287-292. doi:10.36129/jog.32.04.08</w:t>
+        <w:t>. 2021;34(2):161-167. doi:10.1016/j.jpag.2020.11.009</w:t>
       </w:r>
     </w:p>
     <w:p>
@@ -5486,21 +5463,21 @@
         </w:rPr>
         <w:t>44.</w:t>
         <w:tab/>
-        <w:t xml:space="preserve">Pittman J, Gerstl B, Walch A, Lotz M, Deans R, Morrison N. Psychological well-being of women with uterine infertility before considering uterus transplantation as a treatment option. </w:t>
+        <w:t xml:space="preserve">Le TTQ, Le NTH, Vu TA, Nguyen HH, Vuong LN. Perception of having children through surrogacy in individuals with MRKH in Vietnam: a qualitative study. </w:t>
       </w:r>
       <w:r>
         <w:rPr>
           <w:b w:val="0"/>
           <w:i/>
         </w:rPr>
-        <w:t>Aust N Z J Obstet Gynaecol</w:t>
+        <w:t>Front Psychol</w:t>
       </w:r>
       <w:r>
         <w:rPr>
           <w:b w:val="0"/>
           <w:i w:val="0"/>
         </w:rPr>
-        <w:t>. 2025;65(2):263-268. doi:10.1111/ajo.13895</w:t>
+        <w:t>. 2024;15:1372405. doi:10.3389/fpsyg.2024.1372405</w:t>
       </w:r>
     </w:p>
     <w:p>
@@ -5514,21 +5491,21 @@
         </w:rPr>
         <w:t>45.</w:t>
         <w:tab/>
-        <w:t xml:space="preserve">Güner P, Ulukaya T. From avoidance to empowerment: Coping strategies in women with Müllerian agenesis (MRKH) after McIndoe reconstruction: A descriptive phenomenological study. </w:t>
+        <w:t xml:space="preserve">Shao S, Wang X, Lei X, Hua K, Zhang Y. Psychological intervention in women with Mayer-Rokitansky-Küster-Hauser syndrome after artificial vaginoplasty: a prospective study. </w:t>
       </w:r>
       <w:r>
         <w:rPr>
           <w:b w:val="0"/>
           <w:i/>
         </w:rPr>
-        <w:t>J Pediatr Adolesc Gynecol</w:t>
+        <w:t>Int Urogynecol J</w:t>
       </w:r>
       <w:r>
         <w:rPr>
           <w:b w:val="0"/>
           <w:i w:val="0"/>
         </w:rPr>
-        <w:t>. 2026;39(1):101-108. doi:10.1016/j.jpag.2025.10.013</w:t>
+        <w:t>. 2022;33(3):723-729. doi:10.1007/s00192-022-05075-y</w:t>
       </w:r>
     </w:p>
     <w:p>
@@ -5542,7 +5519,7 @@
         </w:rPr>
         <w:t>46.</w:t>
         <w:tab/>
-        <w:t xml:space="preserve">Hatim H, Zainuddin AA, Anizah A, et al. The missing uterus, the missed diagnosis, and the missing care. Mayer-Rokitansky-Küster-Hauser syndrome in the lives of women in Malaysia. </w:t>
+        <w:t xml:space="preserve">Marshall N, Rajesh Z, Hunker K, et al. "Don't give up, advocate for yourself": A pilot study examining healthcare experiences of people with Mayer Rokitansky Küster Hauser syndrome. </w:t>
       </w:r>
       <w:r>
         <w:rPr>
@@ -5556,7 +5533,7 @@
           <w:b w:val="0"/>
           <w:i w:val="0"/>
         </w:rPr>
-        <w:t>. 2021;34(2):161-167. doi:10.1016/j.jpag.2020.11.009</w:t>
+        <w:t>. 2025;38(2):167-173. doi:10.1016/j.jpag.2024.12.001</w:t>
       </w:r>
     </w:p>
     <w:p>
@@ -5570,21 +5547,21 @@
         </w:rPr>
         <w:t>47.</w:t>
         <w:tab/>
-        <w:t xml:space="preserve">Le TTQ, Le NTH, Vu TA, Nguyen HH, Vuong LN. Perception of having children through surrogacy in individuals with MRKH in Vietnam: a qualitative study. </w:t>
+        <w:t xml:space="preserve">Ngoumou R.-D.. How does the experience of the medical encounter with Mayer-Rokitansky-Küster-Hauser (MRKH) Syndrome impact women in Africa?. </w:t>
       </w:r>
       <w:r>
         <w:rPr>
           <w:b w:val="0"/>
           <w:i/>
         </w:rPr>
-        <w:t>Front Psychol</w:t>
+        <w:t>Pan African Medical Journal</w:t>
       </w:r>
       <w:r>
         <w:rPr>
           <w:b w:val="0"/>
           <w:i w:val="0"/>
         </w:rPr>
-        <w:t>. 2024;15:1372405. doi:10.3389/fpsyg.2024.1372405</w:t>
+        <w:t>. 2022;42:314. doi:10.11604/pamj.2022.42.314.32830</w:t>
       </w:r>
     </w:p>
     <w:p>
@@ -5598,21 +5575,21 @@
         </w:rPr>
         <w:t>48.</w:t>
         <w:tab/>
-        <w:t xml:space="preserve">Shao S, Wang X, Lei X, Hua K, Zhang Y. Psychological intervention in women with Mayer-Rokitansky-Küster-Hauser syndrome after artificial vaginoplasty: a prospective study. </w:t>
+        <w:t xml:space="preserve">Di Mattei VE, Taranto P, Perego G, et al. Illness experience and (unmet) needs of women with Mayer-Rokitansky-Küster-Hauser Syndrome (MRKH): a qualitative analysis of an online forum. </w:t>
       </w:r>
       <w:r>
         <w:rPr>
           <w:b w:val="0"/>
           <w:i/>
         </w:rPr>
-        <w:t>Int Urogynecol J</w:t>
+        <w:t>Psychol Health</w:t>
       </w:r>
       <w:r>
         <w:rPr>
           <w:b w:val="0"/>
           <w:i w:val="0"/>
         </w:rPr>
-        <w:t>. 2022;33(3):723-729. doi:10.1007/s00192-022-05075-y</w:t>
+        <w:t>. 2026;41(1):53-75. doi:10.1080/08870446.2024.2390647</w:t>
       </w:r>
     </w:p>
     <w:p>
@@ -5626,7 +5603,7 @@
         </w:rPr>
         <w:t>49.</w:t>
         <w:tab/>
-        <w:t xml:space="preserve">Marshall N, Rajesh Z, Hunker K, et al. "Don't give up, advocate for yourself": A pilot study examining healthcare experiences of people with Mayer Rokitansky Küster Hauser syndrome. </w:t>
+        <w:t xml:space="preserve">Pennesi CM, Berkeley J, Lossie AC, Quint EH, Zieman KD, Carroll S. International experiences with vaginal lengthening treatment among individuals with Müllerian agenesis: A mixed-methods study. </w:t>
       </w:r>
       <w:r>
         <w:rPr>
@@ -5640,7 +5617,7 @@
           <w:b w:val="0"/>
           <w:i w:val="0"/>
         </w:rPr>
-        <w:t>. 2025;38(2):167-173. doi:10.1016/j.jpag.2024.12.001</w:t>
+        <w:t>. 2023;36(5):476-483. doi:10.1016/j.jpag.2023.05.004</w:t>
       </w:r>
     </w:p>
     <w:p>
@@ -5654,21 +5631,21 @@
         </w:rPr>
         <w:t>50.</w:t>
         <w:tab/>
-        <w:t xml:space="preserve">Ngoumou R.-D.. How does the experience of the medical encounter with Mayer-Rokitansky-Küster-Hauser (MRKH) Syndrome impact women in Africa?. </w:t>
+        <w:t xml:space="preserve">Heller-Boersma JG, Schmidt UH, Edmonds DK. A randomized controlled trial of a cognitive-behavioural group intervention versus waiting-list control for women with uterovaginal agenesis (Mayer-Rokitansky-Küster-Hauser syndrome: MRKH). </w:t>
       </w:r>
       <w:r>
         <w:rPr>
           <w:b w:val="0"/>
           <w:i/>
         </w:rPr>
-        <w:t>Pan African Medical Journal</w:t>
+        <w:t>Hum Reprod</w:t>
       </w:r>
       <w:r>
         <w:rPr>
           <w:b w:val="0"/>
           <w:i w:val="0"/>
         </w:rPr>
-        <w:t>. 2022;42:314. doi:10.11604/pamj.2022.42.314.32830</w:t>
+        <w:t>. 2007;22(8):2296-2301. doi:10.1093/humrep/dem167</w:t>
       </w:r>
     </w:p>
     <w:p>
@@ -5681,90 +5658,6 @@
           <w:i w:val="0"/>
         </w:rPr>
         <w:t>51.</w:t>
-        <w:tab/>
-        <w:t xml:space="preserve">Di Mattei VE, Taranto P, Perego G, et al. Illness experience and (unmet) needs of women with Mayer-Rokitansky-Küster-Hauser Syndrome (MRKH): a qualitative analysis of an online forum. </w:t>
-      </w:r>
-      <w:r>
-        <w:rPr>
-          <w:b w:val="0"/>
-          <w:i/>
-        </w:rPr>
-        <w:t>Psychol Health</w:t>
-      </w:r>
-      <w:r>
-        <w:rPr>
-          <w:b w:val="0"/>
-          <w:i w:val="0"/>
-        </w:rPr>
-        <w:t>. 2026;41(1):53-75. doi:10.1080/08870446.2024.2390647</w:t>
-      </w:r>
-    </w:p>
-    <w:p>
-      <w:pPr>
-        <w:ind w:left="504" w:hanging="504"/>
-      </w:pPr>
-      <w:r>
-        <w:rPr>
-          <w:b w:val="0"/>
-          <w:i w:val="0"/>
-        </w:rPr>
-        <w:t>52.</w:t>
-        <w:tab/>
-        <w:t xml:space="preserve">Pennesi CM, Berkeley J, Lossie AC, Quint EH, Zieman KD, Carroll S. International experiences with vaginal lengthening treatment among individuals with Müllerian agenesis: A mixed-methods study. </w:t>
-      </w:r>
-      <w:r>
-        <w:rPr>
-          <w:b w:val="0"/>
-          <w:i/>
-        </w:rPr>
-        <w:t>J Pediatr Adolesc Gynecol</w:t>
-      </w:r>
-      <w:r>
-        <w:rPr>
-          <w:b w:val="0"/>
-          <w:i w:val="0"/>
-        </w:rPr>
-        <w:t>. 2023;36(5):476-483. doi:10.1016/j.jpag.2023.05.004</w:t>
-      </w:r>
-    </w:p>
-    <w:p>
-      <w:pPr>
-        <w:ind w:left="504" w:hanging="504"/>
-      </w:pPr>
-      <w:r>
-        <w:rPr>
-          <w:b w:val="0"/>
-          <w:i w:val="0"/>
-        </w:rPr>
-        <w:t>53.</w:t>
-        <w:tab/>
-        <w:t xml:space="preserve">Heller-Boersma JG, Schmidt UH, Edmonds DK. A randomized controlled trial of a cognitive-behavioural group intervention versus waiting-list control for women with uterovaginal agenesis (Mayer-Rokitansky-Küster-Hauser syndrome: MRKH). </w:t>
-      </w:r>
-      <w:r>
-        <w:rPr>
-          <w:b w:val="0"/>
-          <w:i/>
-        </w:rPr>
-        <w:t>Hum Reprod</w:t>
-      </w:r>
-      <w:r>
-        <w:rPr>
-          <w:b w:val="0"/>
-          <w:i w:val="0"/>
-        </w:rPr>
-        <w:t>. 2007;22(8):2296-2301. doi:10.1093/humrep/dem167</w:t>
-      </w:r>
-    </w:p>
-    <w:p>
-      <w:pPr>
-        <w:ind w:left="504" w:hanging="504"/>
-      </w:pPr>
-      <w:r>
-        <w:rPr>
-          <w:b w:val="0"/>
-          <w:i w:val="0"/>
-        </w:rPr>
-        <w:t>54.</w:t>
         <w:tab/>
         <w:t xml:space="preserve">Okunomiya A, Tsuyuki K, Ohsuga T, et al. Long-term psychosocial outcomes in Japanese Mayer-Rokitansky-Küster-Hauser syndrome: a single-center study. </w:t>
       </w:r>
@@ -6415,7 +6308,7 @@
           <w:b w:val="0"/>
           <w:i w:val="0"/>
         </w:rPr>
-        <w:t xml:space="preserve"> Characteristics of included studies (N = 34)</w:t>
+        <w:t xml:space="preserve"> Characteristics of included studies (N = 36)</w:t>
       </w:r>
     </w:p>
     <w:tbl>
@@ -6581,7 +6474,7 @@
                 <w:sz w:val="16"/>
                 <w:vertAlign w:val="superscript"/>
               </w:rPr>
-              <w:t>29</w:t>
+              <w:t>27</w:t>
             </w:r>
           </w:p>
         </w:tc>
@@ -6822,7 +6715,7 @@
                 <w:i w:val="0"/>
                 <w:sz w:val="16"/>
               </w:rPr>
-              <w:t>Blanc 2019</w:t>
+              <w:t>Carroll 2020</w:t>
             </w:r>
             <w:r>
               <w:rPr>
@@ -6831,7 +6724,7 @@
                 <w:sz w:val="16"/>
                 <w:vertAlign w:val="superscript"/>
               </w:rPr>
-              <w:t>24</w:t>
+              <w:t>26</w:t>
             </w:r>
           </w:p>
         </w:tc>
@@ -6850,7 +6743,7 @@
                 <w:i w:val="0"/>
                 <w:sz w:val="16"/>
               </w:rPr>
-              <w:t>France</w:t>
+              <w:t>Multinational</w:t>
             </w:r>
           </w:p>
         </w:tc>
@@ -6869,7 +6762,7 @@
                 <w:i w:val="0"/>
                 <w:sz w:val="16"/>
               </w:rPr>
-              <w:t>Qualitative and quantitative (clinical interviews)</w:t>
+              <w:t>Cross-sectional online survey</w:t>
             </w:r>
           </w:p>
         </w:tc>
@@ -6888,7 +6781,7 @@
                 <w:i w:val="0"/>
                 <w:sz w:val="16"/>
               </w:rPr>
-              <w:t>17</w:t>
+              <w:t>263</w:t>
             </w:r>
           </w:p>
         </w:tc>
@@ -6907,7 +6800,7 @@
                 <w:i w:val="0"/>
                 <w:sz w:val="16"/>
               </w:rPr>
-              <w:t>Q S P</w:t>
+              <w:t>Q P C</w:t>
             </w:r>
           </w:p>
         </w:tc>
@@ -6926,7 +6819,7 @@
                 <w:i w:val="0"/>
                 <w:sz w:val="16"/>
               </w:rPr>
-              <w:t>—</w:t>
+              <w:t>Peer, family &amp; social support; Identity reconstruction / positive reappraisal</w:t>
             </w:r>
           </w:p>
         </w:tc>
@@ -6947,7 +6840,7 @@
                 <w:i w:val="0"/>
                 <w:sz w:val="16"/>
               </w:rPr>
-              <w:t>Carroll 2020</w:t>
+              <w:t>Chen 2020</w:t>
             </w:r>
             <w:r>
               <w:rPr>
@@ -6956,7 +6849,7 @@
                 <w:sz w:val="16"/>
                 <w:vertAlign w:val="superscript"/>
               </w:rPr>
-              <w:t>28</w:t>
+              <w:t>18</w:t>
             </w:r>
           </w:p>
         </w:tc>
@@ -6975,7 +6868,7 @@
                 <w:i w:val="0"/>
                 <w:sz w:val="16"/>
               </w:rPr>
-              <w:t>Multinational</w:t>
+              <w:t>China</w:t>
             </w:r>
           </w:p>
         </w:tc>
@@ -6994,7 +6887,7 @@
                 <w:i w:val="0"/>
                 <w:sz w:val="16"/>
               </w:rPr>
-              <w:t>Cross-sectional online survey</w:t>
+              <w:t>Cross-sectional (with controls)</w:t>
             </w:r>
           </w:p>
         </w:tc>
@@ -7013,7 +6906,7 @@
                 <w:i w:val="0"/>
                 <w:sz w:val="16"/>
               </w:rPr>
-              <w:t>263</w:t>
+              <w:t>141 (+178 controls)</w:t>
             </w:r>
           </w:p>
         </w:tc>
@@ -7032,7 +6925,7 @@
                 <w:i w:val="0"/>
                 <w:sz w:val="16"/>
               </w:rPr>
-              <w:t>Q P C</w:t>
+              <w:t>D S</w:t>
             </w:r>
           </w:p>
         </w:tc>
@@ -7051,7 +6944,7 @@
                 <w:i w:val="0"/>
                 <w:sz w:val="16"/>
               </w:rPr>
-              <w:t>Peer, family &amp; social support; Identity reconstruction / positive reappraisal</w:t>
+              <w:t>—</w:t>
             </w:r>
           </w:p>
         </w:tc>
@@ -7072,7 +6965,7 @@
                 <w:i w:val="0"/>
                 <w:sz w:val="16"/>
               </w:rPr>
-              <w:t>Chen 2020</w:t>
+              <w:t>Di Mattei 2026</w:t>
             </w:r>
             <w:r>
               <w:rPr>
@@ -7081,7 +6974,7 @@
                 <w:sz w:val="16"/>
                 <w:vertAlign w:val="superscript"/>
               </w:rPr>
-              <w:t>18</w:t>
+              <w:t>48</w:t>
             </w:r>
           </w:p>
         </w:tc>
@@ -7100,7 +6993,7 @@
                 <w:i w:val="0"/>
                 <w:sz w:val="16"/>
               </w:rPr>
-              <w:t>China</w:t>
+              <w:t>Italy</w:t>
             </w:r>
           </w:p>
         </w:tc>
@@ -7119,7 +7012,7 @@
                 <w:i w:val="0"/>
                 <w:sz w:val="16"/>
               </w:rPr>
-              <w:t>Cross-sectional (with controls)</w:t>
+              <w:t>Thematic analysis of online forum</w:t>
             </w:r>
           </w:p>
         </w:tc>
@@ -7138,7 +7031,7 @@
                 <w:i w:val="0"/>
                 <w:sz w:val="16"/>
               </w:rPr>
-              <w:t>141 (+178 controls)</w:t>
+              <w:t>NR</w:t>
             </w:r>
           </w:p>
         </w:tc>
@@ -7157,7 +7050,7 @@
                 <w:i w:val="0"/>
                 <w:sz w:val="16"/>
               </w:rPr>
-              <w:t>D S</w:t>
+              <w:t>S P H</w:t>
             </w:r>
           </w:p>
         </w:tc>
@@ -7197,7 +7090,7 @@
                 <w:i w:val="0"/>
                 <w:sz w:val="16"/>
               </w:rPr>
-              <w:t>Di Mattei 2026</w:t>
+              <w:t>Gilfillan 2024</w:t>
             </w:r>
             <w:r>
               <w:rPr>
@@ -7206,7 +7099,7 @@
                 <w:sz w:val="16"/>
                 <w:vertAlign w:val="superscript"/>
               </w:rPr>
-              <w:t>51</w:t>
+              <w:t>31</w:t>
             </w:r>
           </w:p>
         </w:tc>
@@ -7225,7 +7118,7 @@
                 <w:i w:val="0"/>
                 <w:sz w:val="16"/>
               </w:rPr>
-              <w:t>Italy</w:t>
+              <w:t>United Kingdom</w:t>
             </w:r>
           </w:p>
         </w:tc>
@@ -7244,7 +7137,7 @@
                 <w:i w:val="0"/>
                 <w:sz w:val="16"/>
               </w:rPr>
-              <w:t>Thematic analysis of online forum</w:t>
+              <w:t>Interpretative phenomenological analysis</w:t>
             </w:r>
           </w:p>
         </w:tc>
@@ -7263,7 +7156,7 @@
                 <w:i w:val="0"/>
                 <w:sz w:val="16"/>
               </w:rPr>
-              <w:t>NR</w:t>
+              <w:t>13</w:t>
             </w:r>
           </w:p>
         </w:tc>
@@ -7282,7 +7175,7 @@
                 <w:i w:val="0"/>
                 <w:sz w:val="16"/>
               </w:rPr>
-              <w:t>S P H</w:t>
+              <w:t>P C H</w:t>
             </w:r>
           </w:p>
         </w:tc>
@@ -7301,7 +7194,7 @@
                 <w:i w:val="0"/>
                 <w:sz w:val="16"/>
               </w:rPr>
-              <w:t>—</w:t>
+              <w:t>Acceptance; Avoidance / concealment (maladaptive)</w:t>
             </w:r>
           </w:p>
         </w:tc>
@@ -7322,7 +7215,7 @@
                 <w:i w:val="0"/>
                 <w:sz w:val="16"/>
               </w:rPr>
-              <w:t>Gilfillan 2024</w:t>
+              <w:t>Güner 2025</w:t>
             </w:r>
             <w:r>
               <w:rPr>
@@ -7331,7 +7224,7 @@
                 <w:sz w:val="16"/>
                 <w:vertAlign w:val="superscript"/>
               </w:rPr>
-              <w:t>33</w:t>
+              <w:t>9</w:t>
             </w:r>
           </w:p>
         </w:tc>
@@ -7350,7 +7243,7 @@
                 <w:i w:val="0"/>
                 <w:sz w:val="16"/>
               </w:rPr>
-              <w:t>United Kingdom</w:t>
+              <w:t>Türkiye</w:t>
             </w:r>
           </w:p>
         </w:tc>
@@ -7369,7 +7262,7 @@
                 <w:i w:val="0"/>
                 <w:sz w:val="16"/>
               </w:rPr>
-              <w:t>Interpretative phenomenological analysis</w:t>
+              <w:t>Phenomenological interviews</w:t>
             </w:r>
           </w:p>
         </w:tc>
@@ -7388,7 +7281,7 @@
                 <w:i w:val="0"/>
                 <w:sz w:val="16"/>
               </w:rPr>
-              <w:t>13</w:t>
+              <w:t>10</w:t>
             </w:r>
           </w:p>
         </w:tc>
@@ -7407,7 +7300,7 @@
                 <w:i w:val="0"/>
                 <w:sz w:val="16"/>
               </w:rPr>
-              <w:t>P C H</w:t>
+              <w:t>S P</w:t>
             </w:r>
           </w:p>
         </w:tc>
@@ -7426,7 +7319,7 @@
                 <w:i w:val="0"/>
                 <w:sz w:val="16"/>
               </w:rPr>
-              <w:t>Acceptance; Avoidance / concealment (maladaptive)</w:t>
+              <w:t>—</w:t>
             </w:r>
           </w:p>
         </w:tc>
@@ -7447,7 +7340,7 @@
                 <w:i w:val="0"/>
                 <w:sz w:val="16"/>
               </w:rPr>
-              <w:t>Gueniche 2020</w:t>
+              <w:t>Güner 2026</w:t>
             </w:r>
             <w:r>
               <w:rPr>
@@ -7456,7 +7349,7 @@
                 <w:sz w:val="16"/>
                 <w:vertAlign w:val="superscript"/>
               </w:rPr>
-              <w:t>36</w:t>
+              <w:t>42</w:t>
             </w:r>
           </w:p>
         </w:tc>
@@ -7475,7 +7368,7 @@
                 <w:i w:val="0"/>
                 <w:sz w:val="16"/>
               </w:rPr>
-              <w:t>France</w:t>
+              <w:t>Türkiye</w:t>
             </w:r>
           </w:p>
         </w:tc>
@@ -7494,7 +7387,7 @@
                 <w:i w:val="0"/>
                 <w:sz w:val="16"/>
               </w:rPr>
-              <w:t>Clinical interviews and projective tests</w:t>
+              <w:t>Descriptive phenomenological interviews</w:t>
             </w:r>
           </w:p>
         </w:tc>
@@ -7513,7 +7406,7 @@
                 <w:i w:val="0"/>
                 <w:sz w:val="16"/>
               </w:rPr>
-              <w:t>40</w:t>
+              <w:t>10</w:t>
             </w:r>
           </w:p>
         </w:tc>
@@ -7532,7 +7425,7 @@
                 <w:i w:val="0"/>
                 <w:sz w:val="16"/>
               </w:rPr>
-              <w:t>P</w:t>
+              <w:t>S P C</w:t>
             </w:r>
           </w:p>
         </w:tc>
@@ -7551,7 +7444,7 @@
                 <w:i w:val="0"/>
                 <w:sz w:val="16"/>
               </w:rPr>
-              <w:t>—</w:t>
+              <w:t>Avoidance / concealment (maladaptive); Identity reconstruction / positive reappraisal; Spiritual coping; Peer, family &amp; social support</w:t>
             </w:r>
           </w:p>
         </w:tc>
@@ -7572,7 +7465,7 @@
                 <w:i w:val="0"/>
                 <w:sz w:val="16"/>
               </w:rPr>
-              <w:t>Güner 2025</w:t>
+              <w:t>Hatim 2021</w:t>
             </w:r>
             <w:r>
               <w:rPr>
@@ -7581,7 +7474,7 @@
                 <w:sz w:val="16"/>
                 <w:vertAlign w:val="superscript"/>
               </w:rPr>
-              <w:t>9</w:t>
+              <w:t>43</w:t>
             </w:r>
           </w:p>
         </w:tc>
@@ -7600,7 +7493,7 @@
                 <w:i w:val="0"/>
                 <w:sz w:val="16"/>
               </w:rPr>
-              <w:t>Türkiye</w:t>
+              <w:t>Malaysia</w:t>
             </w:r>
           </w:p>
         </w:tc>
@@ -7619,7 +7512,7 @@
                 <w:i w:val="0"/>
                 <w:sz w:val="16"/>
               </w:rPr>
-              <w:t>Phenomenological interviews</w:t>
+              <w:t>Qualitative with quantitative component</w:t>
             </w:r>
           </w:p>
         </w:tc>
@@ -7638,7 +7531,7 @@
                 <w:i w:val="0"/>
                 <w:sz w:val="16"/>
               </w:rPr>
-              <w:t>10</w:t>
+              <w:t>12</w:t>
             </w:r>
           </w:p>
         </w:tc>
@@ -7657,7 +7550,7 @@
                 <w:i w:val="0"/>
                 <w:sz w:val="16"/>
               </w:rPr>
-              <w:t>S P</w:t>
+              <w:t>S P C H</w:t>
             </w:r>
           </w:p>
         </w:tc>
@@ -7676,7 +7569,7 @@
                 <w:i w:val="0"/>
                 <w:sz w:val="16"/>
               </w:rPr>
-              <w:t>—</w:t>
+              <w:t>Peer, family &amp; social support</w:t>
             </w:r>
           </w:p>
         </w:tc>
@@ -7697,7 +7590,7 @@
                 <w:i w:val="0"/>
                 <w:sz w:val="16"/>
               </w:rPr>
-              <w:t>Güner 2026</w:t>
+              <w:t>Jensen 2024</w:t>
             </w:r>
             <w:r>
               <w:rPr>
@@ -7706,7 +7599,7 @@
                 <w:sz w:val="16"/>
                 <w:vertAlign w:val="superscript"/>
               </w:rPr>
-              <w:t>45</w:t>
+              <w:t>32</w:t>
             </w:r>
           </w:p>
         </w:tc>
@@ -7725,7 +7618,7 @@
                 <w:i w:val="0"/>
                 <w:sz w:val="16"/>
               </w:rPr>
-              <w:t>Türkiye</w:t>
+              <w:t>Denmark</w:t>
             </w:r>
           </w:p>
         </w:tc>
@@ -7744,7 +7637,7 @@
                 <w:i w:val="0"/>
                 <w:sz w:val="16"/>
               </w:rPr>
-              <w:t>Descriptive phenomenological interviews</w:t>
+              <w:t>Semi-structured interviews (life course)</w:t>
             </w:r>
           </w:p>
         </w:tc>
@@ -7763,7 +7656,7 @@
                 <w:i w:val="0"/>
                 <w:sz w:val="16"/>
               </w:rPr>
-              <w:t>10</w:t>
+              <w:t>18</w:t>
             </w:r>
           </w:p>
         </w:tc>
@@ -7782,7 +7675,7 @@
                 <w:i w:val="0"/>
                 <w:sz w:val="16"/>
               </w:rPr>
-              <w:t>S P C</w:t>
+              <w:t>S P C H</w:t>
             </w:r>
           </w:p>
         </w:tc>
@@ -7801,7 +7694,7 @@
                 <w:i w:val="0"/>
                 <w:sz w:val="16"/>
               </w:rPr>
-              <w:t>Avoidance / concealment (maladaptive); Identity reconstruction / positive reappraisal; Spiritual coping; Peer, family &amp; social support</w:t>
+              <w:t>Peer, family &amp; social support</w:t>
             </w:r>
           </w:p>
         </w:tc>
@@ -7822,7 +7715,7 @@
                 <w:i w:val="0"/>
                 <w:sz w:val="16"/>
               </w:rPr>
-              <w:t>Hatim 2021</w:t>
+              <w:t>Jensen 2024</w:t>
             </w:r>
             <w:r>
               <w:rPr>
@@ -7831,7 +7724,7 @@
                 <w:sz w:val="16"/>
                 <w:vertAlign w:val="superscript"/>
               </w:rPr>
-              <w:t>46</w:t>
+              <w:t>21</w:t>
             </w:r>
           </w:p>
         </w:tc>
@@ -7850,7 +7743,7 @@
                 <w:i w:val="0"/>
                 <w:sz w:val="16"/>
               </w:rPr>
-              <w:t>Malaysia</w:t>
+              <w:t>Denmark</w:t>
             </w:r>
           </w:p>
         </w:tc>
@@ -7869,7 +7762,7 @@
                 <w:i w:val="0"/>
                 <w:sz w:val="16"/>
               </w:rPr>
-              <w:t>Qualitative with quantitative component</w:t>
+              <w:t>Semi-structured interviews</w:t>
             </w:r>
           </w:p>
         </w:tc>
@@ -7888,7 +7781,7 @@
                 <w:i w:val="0"/>
                 <w:sz w:val="16"/>
               </w:rPr>
-              <w:t>12</w:t>
+              <w:t>18</w:t>
             </w:r>
           </w:p>
         </w:tc>
@@ -7907,7 +7800,7 @@
                 <w:i w:val="0"/>
                 <w:sz w:val="16"/>
               </w:rPr>
-              <w:t>S P C H</w:t>
+              <w:t>Q S P</w:t>
             </w:r>
           </w:p>
         </w:tc>
@@ -7926,7 +7819,7 @@
                 <w:i w:val="0"/>
                 <w:sz w:val="16"/>
               </w:rPr>
-              <w:t>Peer, family &amp; social support</w:t>
+              <w:t>—</w:t>
             </w:r>
           </w:p>
         </w:tc>
@@ -7947,7 +7840,7 @@
                 <w:i w:val="0"/>
                 <w:sz w:val="16"/>
               </w:rPr>
-              <w:t>Jensen 2024</w:t>
+              <w:t>Jha 2022</w:t>
             </w:r>
             <w:r>
               <w:rPr>
@@ -7956,7 +7849,7 @@
                 <w:sz w:val="16"/>
                 <w:vertAlign w:val="superscript"/>
               </w:rPr>
-              <w:t>34</w:t>
+              <w:t>39</w:t>
             </w:r>
           </w:p>
         </w:tc>
@@ -7975,7 +7868,7 @@
                 <w:i w:val="0"/>
                 <w:sz w:val="16"/>
               </w:rPr>
-              <w:t>Denmark</w:t>
+              <w:t>India</w:t>
             </w:r>
           </w:p>
         </w:tc>
@@ -7994,7 +7887,7 @@
                 <w:i w:val="0"/>
                 <w:sz w:val="16"/>
               </w:rPr>
-              <w:t>Semi-structured interviews (life course)</w:t>
+              <w:t>Case-control</w:t>
             </w:r>
           </w:p>
         </w:tc>
@@ -8013,7 +7906,7 @@
                 <w:i w:val="0"/>
                 <w:sz w:val="16"/>
               </w:rPr>
-              <w:t>18</w:t>
+              <w:t>NR</w:t>
             </w:r>
           </w:p>
         </w:tc>
@@ -8032,7 +7925,7 @@
                 <w:i w:val="0"/>
                 <w:sz w:val="16"/>
               </w:rPr>
-              <w:t>S P C H</w:t>
+              <w:t>D Q S</w:t>
             </w:r>
           </w:p>
         </w:tc>
@@ -8051,7 +7944,7 @@
                 <w:i w:val="0"/>
                 <w:sz w:val="16"/>
               </w:rPr>
-              <w:t>Peer, family &amp; social support</w:t>
+              <w:t>—</w:t>
             </w:r>
           </w:p>
         </w:tc>
@@ -8072,7 +7965,7 @@
                 <w:i w:val="0"/>
                 <w:sz w:val="16"/>
               </w:rPr>
-              <w:t>Jensen 2024</w:t>
+              <w:t>Järvholm 2020</w:t>
             </w:r>
             <w:r>
               <w:rPr>
@@ -8081,7 +7974,7 @@
                 <w:sz w:val="16"/>
                 <w:vertAlign w:val="superscript"/>
               </w:rPr>
-              <w:t>21</w:t>
+              <w:t>34</w:t>
             </w:r>
           </w:p>
         </w:tc>
@@ -8100,7 +7993,7 @@
                 <w:i w:val="0"/>
                 <w:sz w:val="16"/>
               </w:rPr>
-              <w:t>Denmark</w:t>
+              <w:t>Sweden</w:t>
             </w:r>
           </w:p>
         </w:tc>
@@ -8119,7 +8012,7 @@
                 <w:i w:val="0"/>
                 <w:sz w:val="16"/>
               </w:rPr>
-              <w:t>Semi-structured interviews</w:t>
+              <w:t>Interviews after uterus transplantation</w:t>
             </w:r>
           </w:p>
         </w:tc>
@@ -8138,7 +8031,7 @@
                 <w:i w:val="0"/>
                 <w:sz w:val="16"/>
               </w:rPr>
-              <w:t>18</w:t>
+              <w:t>7 (6 MRKH)</w:t>
             </w:r>
           </w:p>
         </w:tc>
@@ -8197,7 +8090,7 @@
                 <w:i w:val="0"/>
                 <w:sz w:val="16"/>
               </w:rPr>
-              <w:t>Jha 2022</w:t>
+              <w:t>Kang 2020</w:t>
             </w:r>
             <w:r>
               <w:rPr>
@@ -8206,7 +8099,7 @@
                 <w:sz w:val="16"/>
                 <w:vertAlign w:val="superscript"/>
               </w:rPr>
-              <w:t>42</w:t>
+              <w:t>28</w:t>
             </w:r>
           </w:p>
         </w:tc>
@@ -8225,7 +8118,7 @@
                 <w:i w:val="0"/>
                 <w:sz w:val="16"/>
               </w:rPr>
-              <w:t>India</w:t>
+              <w:t>China</w:t>
             </w:r>
           </w:p>
         </w:tc>
@@ -8244,7 +8137,7 @@
                 <w:i w:val="0"/>
                 <w:sz w:val="16"/>
               </w:rPr>
-              <w:t>Case-control</w:t>
+              <w:t>Cross-sectional</w:t>
             </w:r>
           </w:p>
         </w:tc>
@@ -8263,7 +8156,7 @@
                 <w:i w:val="0"/>
                 <w:sz w:val="16"/>
               </w:rPr>
-              <w:t>NR</w:t>
+              <w:t>133</w:t>
             </w:r>
           </w:p>
         </w:tc>
@@ -8282,7 +8175,7 @@
                 <w:i w:val="0"/>
                 <w:sz w:val="16"/>
               </w:rPr>
-              <w:t>D Q S</w:t>
+              <w:t>Q S</w:t>
             </w:r>
           </w:p>
         </w:tc>
@@ -8322,7 +8215,7 @@
                 <w:i w:val="0"/>
                 <w:sz w:val="16"/>
               </w:rPr>
-              <w:t>Järvholm 2020</w:t>
+              <w:t>Karpel 2025</w:t>
             </w:r>
             <w:r>
               <w:rPr>
@@ -8331,7 +8224,7 @@
                 <w:sz w:val="16"/>
                 <w:vertAlign w:val="superscript"/>
               </w:rPr>
-              <w:t>37</w:t>
+              <w:t>38</w:t>
             </w:r>
           </w:p>
         </w:tc>
@@ -8350,7 +8243,7 @@
                 <w:i w:val="0"/>
                 <w:sz w:val="16"/>
               </w:rPr>
-              <w:t>Sweden</w:t>
+              <w:t>France</w:t>
             </w:r>
           </w:p>
         </w:tc>
@@ -8369,7 +8262,7 @@
                 <w:i w:val="0"/>
                 <w:sz w:val="16"/>
               </w:rPr>
-              <w:t>Interviews after uterus transplantation</w:t>
+              <w:t>Cross-sectional (uterus transplant candidates)</w:t>
             </w:r>
           </w:p>
         </w:tc>
@@ -8388,7 +8281,7 @@
                 <w:i w:val="0"/>
                 <w:sz w:val="16"/>
               </w:rPr>
-              <w:t>7 (6 MRKH)</w:t>
+              <w:t>16 (incl. partners, donors)</w:t>
             </w:r>
           </w:p>
         </w:tc>
@@ -8407,7 +8300,7 @@
                 <w:i w:val="0"/>
                 <w:sz w:val="16"/>
               </w:rPr>
-              <w:t>Q S P</w:t>
+              <w:t>D Q S P</w:t>
             </w:r>
           </w:p>
         </w:tc>
@@ -8447,7 +8340,7 @@
                 <w:i w:val="0"/>
                 <w:sz w:val="16"/>
               </w:rPr>
-              <w:t>Kang 2020</w:t>
+              <w:t>Khairudin 2026</w:t>
             </w:r>
             <w:r>
               <w:rPr>
@@ -8456,7 +8349,7 @@
                 <w:sz w:val="16"/>
                 <w:vertAlign w:val="superscript"/>
               </w:rPr>
-              <w:t>30</w:t>
+              <w:t>35</w:t>
             </w:r>
           </w:p>
         </w:tc>
@@ -8475,7 +8368,7 @@
                 <w:i w:val="0"/>
                 <w:sz w:val="16"/>
               </w:rPr>
-              <w:t>China</w:t>
+              <w:t>Malaysia</w:t>
             </w:r>
           </w:p>
         </w:tc>
@@ -8513,7 +8406,7 @@
                 <w:i w:val="0"/>
                 <w:sz w:val="16"/>
               </w:rPr>
-              <w:t>133</w:t>
+              <w:t>77</w:t>
             </w:r>
           </w:p>
         </w:tc>
@@ -8532,7 +8425,7 @@
                 <w:i w:val="0"/>
                 <w:sz w:val="16"/>
               </w:rPr>
-              <w:t>Q S</w:t>
+              <w:t>D</w:t>
             </w:r>
           </w:p>
         </w:tc>
@@ -8572,7 +8465,7 @@
                 <w:i w:val="0"/>
                 <w:sz w:val="16"/>
               </w:rPr>
-              <w:t>Karpel 2025</w:t>
+              <w:t>Le 2024</w:t>
             </w:r>
             <w:r>
               <w:rPr>
@@ -8581,7 +8474,7 @@
                 <w:sz w:val="16"/>
                 <w:vertAlign w:val="superscript"/>
               </w:rPr>
-              <w:t>41</w:t>
+              <w:t>44</w:t>
             </w:r>
           </w:p>
         </w:tc>
@@ -8600,7 +8493,7 @@
                 <w:i w:val="0"/>
                 <w:sz w:val="16"/>
               </w:rPr>
-              <w:t>France</w:t>
+              <w:t>Vietnam</w:t>
             </w:r>
           </w:p>
         </w:tc>
@@ -8619,7 +8512,7 @@
                 <w:i w:val="0"/>
                 <w:sz w:val="16"/>
               </w:rPr>
-              <w:t>Cross-sectional (uterus transplant candidates)</w:t>
+              <w:t>In-depth interviews</w:t>
             </w:r>
           </w:p>
         </w:tc>
@@ -8638,7 +8531,7 @@
                 <w:i w:val="0"/>
                 <w:sz w:val="16"/>
               </w:rPr>
-              <w:t>16 (incl. partners, donors)</w:t>
+              <w:t>20</w:t>
             </w:r>
           </w:p>
         </w:tc>
@@ -8657,7 +8550,7 @@
                 <w:i w:val="0"/>
                 <w:sz w:val="16"/>
               </w:rPr>
-              <w:t>D Q S P</w:t>
+              <w:t>C H</w:t>
             </w:r>
           </w:p>
         </w:tc>
@@ -8676,7 +8569,7 @@
                 <w:i w:val="0"/>
                 <w:sz w:val="16"/>
               </w:rPr>
-              <w:t>—</w:t>
+              <w:t>Avoidance / concealment (maladaptive); Spiritual coping</w:t>
             </w:r>
           </w:p>
         </w:tc>
@@ -8697,7 +8590,7 @@
                 <w:i w:val="0"/>
                 <w:sz w:val="16"/>
               </w:rPr>
-              <w:t>Khairudin 2026</w:t>
+              <w:t>Lei 2024</w:t>
             </w:r>
             <w:r>
               <w:rPr>
@@ -8706,7 +8599,7 @@
                 <w:sz w:val="16"/>
                 <w:vertAlign w:val="superscript"/>
               </w:rPr>
-              <w:t>38</w:t>
+              <w:t>36</w:t>
             </w:r>
           </w:p>
         </w:tc>
@@ -8725,7 +8618,7 @@
                 <w:i w:val="0"/>
                 <w:sz w:val="16"/>
               </w:rPr>
-              <w:t>Malaysia</w:t>
+              <w:t>China</w:t>
             </w:r>
           </w:p>
         </w:tc>
@@ -8744,7 +8637,7 @@
                 <w:i w:val="0"/>
                 <w:sz w:val="16"/>
               </w:rPr>
-              <w:t>Cross-sectional</w:t>
+              <w:t>Longitudinal case series (2 survey rounds)</w:t>
             </w:r>
           </w:p>
         </w:tc>
@@ -8763,7 +8656,7 @@
                 <w:i w:val="0"/>
                 <w:sz w:val="16"/>
               </w:rPr>
-              <w:t>77</w:t>
+              <w:t>53</w:t>
             </w:r>
           </w:p>
         </w:tc>
@@ -8782,7 +8675,7 @@
                 <w:i w:val="0"/>
                 <w:sz w:val="16"/>
               </w:rPr>
-              <w:t>D</w:t>
+              <w:t>D Q S</w:t>
             </w:r>
           </w:p>
         </w:tc>
@@ -8822,7 +8715,7 @@
                 <w:i w:val="0"/>
                 <w:sz w:val="16"/>
               </w:rPr>
-              <w:t>Le 2024</w:t>
+              <w:t>Lou 2024</w:t>
             </w:r>
             <w:r>
               <w:rPr>
@@ -8831,7 +8724,7 @@
                 <w:sz w:val="16"/>
                 <w:vertAlign w:val="superscript"/>
               </w:rPr>
-              <w:t>47</w:t>
+              <w:t>33</w:t>
             </w:r>
           </w:p>
         </w:tc>
@@ -8850,7 +8743,7 @@
                 <w:i w:val="0"/>
                 <w:sz w:val="16"/>
               </w:rPr>
-              <w:t>Vietnam</w:t>
+              <w:t>Denmark</w:t>
             </w:r>
           </w:p>
         </w:tc>
@@ -8869,7 +8762,7 @@
                 <w:i w:val="0"/>
                 <w:sz w:val="16"/>
               </w:rPr>
-              <w:t>In-depth interviews</w:t>
+              <w:t>Interview study</w:t>
             </w:r>
           </w:p>
         </w:tc>
@@ -8888,7 +8781,7 @@
                 <w:i w:val="0"/>
                 <w:sz w:val="16"/>
               </w:rPr>
-              <w:t>20</w:t>
+              <w:t>NR</w:t>
             </w:r>
           </w:p>
         </w:tc>
@@ -8907,7 +8800,7 @@
                 <w:i w:val="0"/>
                 <w:sz w:val="16"/>
               </w:rPr>
-              <w:t>C H</w:t>
+              <w:t>P H</w:t>
             </w:r>
           </w:p>
         </w:tc>
@@ -8926,7 +8819,7 @@
                 <w:i w:val="0"/>
                 <w:sz w:val="16"/>
               </w:rPr>
-              <w:t>Avoidance / concealment (maladaptive); Spiritual coping</w:t>
+              <w:t>—</w:t>
             </w:r>
           </w:p>
         </w:tc>
@@ -8947,7 +8840,7 @@
                 <w:i w:val="0"/>
                 <w:sz w:val="16"/>
               </w:rPr>
-              <w:t>Lei 2024</w:t>
+              <w:t>Mao 2024</w:t>
             </w:r>
             <w:r>
               <w:rPr>
@@ -8956,7 +8849,7 @@
                 <w:sz w:val="16"/>
                 <w:vertAlign w:val="superscript"/>
               </w:rPr>
-              <w:t>39</w:t>
+              <w:t>30</w:t>
             </w:r>
           </w:p>
         </w:tc>
@@ -8994,7 +8887,7 @@
                 <w:i w:val="0"/>
                 <w:sz w:val="16"/>
               </w:rPr>
-              <w:t>Longitudinal case series (2 survey rounds)</w:t>
+              <w:t>Retrospective (with controls)</w:t>
             </w:r>
           </w:p>
         </w:tc>
@@ -9013,7 +8906,7 @@
                 <w:i w:val="0"/>
                 <w:sz w:val="16"/>
               </w:rPr>
-              <w:t>53</w:t>
+              <w:t>42 (+30 controls)</w:t>
             </w:r>
           </w:p>
         </w:tc>
@@ -9032,7 +8925,7 @@
                 <w:i w:val="0"/>
                 <w:sz w:val="16"/>
               </w:rPr>
-              <w:t>D Q S</w:t>
+              <w:t>Q S</w:t>
             </w:r>
           </w:p>
         </w:tc>
@@ -9072,7 +8965,7 @@
                 <w:i w:val="0"/>
                 <w:sz w:val="16"/>
               </w:rPr>
-              <w:t>Lou 2024</w:t>
+              <w:t>Marshall 2025</w:t>
             </w:r>
             <w:r>
               <w:rPr>
@@ -9081,7 +8974,7 @@
                 <w:sz w:val="16"/>
                 <w:vertAlign w:val="superscript"/>
               </w:rPr>
-              <w:t>35</w:t>
+              <w:t>46</w:t>
             </w:r>
           </w:p>
         </w:tc>
@@ -9100,7 +8993,7 @@
                 <w:i w:val="0"/>
                 <w:sz w:val="16"/>
               </w:rPr>
-              <w:t>Denmark</w:t>
+              <w:t>United States/Canada</w:t>
             </w:r>
           </w:p>
         </w:tc>
@@ -9119,7 +9012,7 @@
                 <w:i w:val="0"/>
                 <w:sz w:val="16"/>
               </w:rPr>
-              <w:t>Interview study</w:t>
+              <w:t>Semi-structured interviews</w:t>
             </w:r>
           </w:p>
         </w:tc>
@@ -9157,7 +9050,7 @@
                 <w:i w:val="0"/>
                 <w:sz w:val="16"/>
               </w:rPr>
-              <w:t>P H</w:t>
+              <w:t>C H</w:t>
             </w:r>
           </w:p>
         </w:tc>
@@ -9176,7 +9069,7 @@
                 <w:i w:val="0"/>
                 <w:sz w:val="16"/>
               </w:rPr>
-              <w:t>—</w:t>
+              <w:t>Self-advocacy</w:t>
             </w:r>
           </w:p>
         </w:tc>
@@ -9197,7 +9090,7 @@
                 <w:i w:val="0"/>
                 <w:sz w:val="16"/>
               </w:rPr>
-              <w:t>Magdoud 2024</w:t>
+              <w:t>Mediå 2022</w:t>
             </w:r>
             <w:r>
               <w:rPr>
@@ -9206,7 +9099,7 @@
                 <w:sz w:val="16"/>
                 <w:vertAlign w:val="superscript"/>
               </w:rPr>
-              <w:t>25</w:t>
+              <w:t>24</w:t>
             </w:r>
           </w:p>
         </w:tc>
@@ -9225,7 +9118,7 @@
                 <w:i w:val="0"/>
                 <w:sz w:val="16"/>
               </w:rPr>
-              <w:t>Tunisia</w:t>
+              <w:t>Norway</w:t>
             </w:r>
           </w:p>
         </w:tc>
@@ -9244,7 +9137,7 @@
                 <w:i w:val="0"/>
                 <w:sz w:val="16"/>
               </w:rPr>
-              <w:t>Retrospective comparative (with controls)</w:t>
+              <w:t>Semi-structured interviews (adults with 5 DSD conditions)</w:t>
             </w:r>
           </w:p>
         </w:tc>
@@ -9263,7 +9156,7 @@
                 <w:i w:val="0"/>
                 <w:sz w:val="16"/>
               </w:rPr>
-              <w:t>30</w:t>
+              <w:t>15 (DSD; MRKH subgroup)</w:t>
             </w:r>
           </w:p>
         </w:tc>
@@ -9282,7 +9175,7 @@
                 <w:i w:val="0"/>
                 <w:sz w:val="16"/>
               </w:rPr>
-              <w:t>Q S</w:t>
+              <w:t>S P C</w:t>
             </w:r>
           </w:p>
         </w:tc>
@@ -9301,7 +9194,7 @@
                 <w:i w:val="0"/>
                 <w:sz w:val="16"/>
               </w:rPr>
-              <w:t>—</w:t>
+              <w:t>Avoidance / concealment (maladaptive)</w:t>
             </w:r>
           </w:p>
         </w:tc>
@@ -9322,7 +9215,7 @@
                 <w:i w:val="0"/>
                 <w:sz w:val="16"/>
               </w:rPr>
-              <w:t>Mao 2024</w:t>
+              <w:t>Ngoumou 2022</w:t>
             </w:r>
             <w:r>
               <w:rPr>
@@ -9331,7 +9224,7 @@
                 <w:sz w:val="16"/>
                 <w:vertAlign w:val="superscript"/>
               </w:rPr>
-              <w:t>32</w:t>
+              <w:t>47</w:t>
             </w:r>
           </w:p>
         </w:tc>
@@ -9350,7 +9243,7 @@
                 <w:i w:val="0"/>
                 <w:sz w:val="16"/>
               </w:rPr>
-              <w:t>China</w:t>
+              <w:t>Cameroon, Côte d'Ivoire, Senegal</w:t>
             </w:r>
           </w:p>
         </w:tc>
@@ -9369,7 +9262,7 @@
                 <w:i w:val="0"/>
                 <w:sz w:val="16"/>
               </w:rPr>
-              <w:t>Retrospective (with controls)</w:t>
+              <w:t>In-depth interviews</w:t>
             </w:r>
           </w:p>
         </w:tc>
@@ -9388,7 +9281,7 @@
                 <w:i w:val="0"/>
                 <w:sz w:val="16"/>
               </w:rPr>
-              <w:t>42 (+30 controls)</w:t>
+              <w:t>5</w:t>
             </w:r>
           </w:p>
         </w:tc>
@@ -9407,7 +9300,7 @@
                 <w:i w:val="0"/>
                 <w:sz w:val="16"/>
               </w:rPr>
-              <w:t>Q S</w:t>
+              <w:t>P H</w:t>
             </w:r>
           </w:p>
         </w:tc>
@@ -9447,7 +9340,7 @@
                 <w:i w:val="0"/>
                 <w:sz w:val="16"/>
               </w:rPr>
-              <w:t>Marshall 2025</w:t>
+              <w:t>Pennesi 2023</w:t>
             </w:r>
             <w:r>
               <w:rPr>
@@ -9475,7 +9368,7 @@
                 <w:i w:val="0"/>
                 <w:sz w:val="16"/>
               </w:rPr>
-              <w:t>United States/Canada</w:t>
+              <w:t>Multinational (40 countries)</w:t>
             </w:r>
           </w:p>
         </w:tc>
@@ -9494,7 +9387,7 @@
                 <w:i w:val="0"/>
                 <w:sz w:val="16"/>
               </w:rPr>
-              <w:t>Semi-structured interviews</w:t>
+              <w:t>Cross-sectional mixed-methods survey</w:t>
             </w:r>
           </w:p>
         </w:tc>
@@ -9513,7 +9406,7 @@
                 <w:i w:val="0"/>
                 <w:sz w:val="16"/>
               </w:rPr>
-              <w:t>NR</w:t>
+              <w:t>616</w:t>
             </w:r>
           </w:p>
         </w:tc>
@@ -9532,7 +9425,7 @@
                 <w:i w:val="0"/>
                 <w:sz w:val="16"/>
               </w:rPr>
-              <w:t>C H</w:t>
+              <w:t>S P H</w:t>
             </w:r>
           </w:p>
         </w:tc>
@@ -9551,7 +9444,7 @@
                 <w:i w:val="0"/>
                 <w:sz w:val="16"/>
               </w:rPr>
-              <w:t>Self-advocacy</w:t>
+              <w:t>—</w:t>
             </w:r>
           </w:p>
         </w:tc>
@@ -9572,7 +9465,7 @@
                 <w:i w:val="0"/>
                 <w:sz w:val="16"/>
               </w:rPr>
-              <w:t>Ngoumou 2022</w:t>
+              <w:t>Pittman 2025</w:t>
             </w:r>
             <w:r>
               <w:rPr>
@@ -9581,7 +9474,7 @@
                 <w:sz w:val="16"/>
                 <w:vertAlign w:val="superscript"/>
               </w:rPr>
-              <w:t>50</w:t>
+              <w:t>41</w:t>
             </w:r>
           </w:p>
         </w:tc>
@@ -9600,7 +9493,7 @@
                 <w:i w:val="0"/>
                 <w:sz w:val="16"/>
               </w:rPr>
-              <w:t>Cameroon, Côte d'Ivoire, Senegal</w:t>
+              <w:t>Australia</w:t>
             </w:r>
           </w:p>
         </w:tc>
@@ -9619,7 +9512,7 @@
                 <w:i w:val="0"/>
                 <w:sz w:val="16"/>
               </w:rPr>
-              <w:t>In-depth interviews</w:t>
+              <w:t>Cross-sectional survey (congenital vs acquired uterine factor infertility)</w:t>
             </w:r>
           </w:p>
         </w:tc>
@@ -9638,7 +9531,7 @@
                 <w:i w:val="0"/>
                 <w:sz w:val="16"/>
               </w:rPr>
-              <w:t>5</w:t>
+              <w:t>39</w:t>
             </w:r>
           </w:p>
         </w:tc>
@@ -9657,7 +9550,7 @@
                 <w:i w:val="0"/>
                 <w:sz w:val="16"/>
               </w:rPr>
-              <w:t>P H</w:t>
+              <w:t>D Q</w:t>
             </w:r>
           </w:p>
         </w:tc>
@@ -9697,7 +9590,7 @@
                 <w:i w:val="0"/>
                 <w:sz w:val="16"/>
               </w:rPr>
-              <w:t>Pennesi 2023</w:t>
+              <w:t>Rajesh 2026</w:t>
             </w:r>
             <w:r>
               <w:rPr>
@@ -9706,7 +9599,7 @@
                 <w:sz w:val="16"/>
                 <w:vertAlign w:val="superscript"/>
               </w:rPr>
-              <w:t>52</w:t>
+              <w:t>10</w:t>
             </w:r>
           </w:p>
         </w:tc>
@@ -9725,7 +9618,7 @@
                 <w:i w:val="0"/>
                 <w:sz w:val="16"/>
               </w:rPr>
-              <w:t>Multinational (40 countries)</w:t>
+              <w:t>Canada</w:t>
             </w:r>
           </w:p>
         </w:tc>
@@ -9744,7 +9637,7 @@
                 <w:i w:val="0"/>
                 <w:sz w:val="16"/>
               </w:rPr>
-              <w:t>Cross-sectional mixed-methods survey</w:t>
+              <w:t>Semi-structured interviews</w:t>
             </w:r>
           </w:p>
         </w:tc>
@@ -9763,7 +9656,7 @@
                 <w:i w:val="0"/>
                 <w:sz w:val="16"/>
               </w:rPr>
-              <w:t>616</w:t>
+              <w:t>12</w:t>
             </w:r>
           </w:p>
         </w:tc>
@@ -9782,7 +9675,7 @@
                 <w:i w:val="0"/>
                 <w:sz w:val="16"/>
               </w:rPr>
-              <w:t>S P H</w:t>
+              <w:t>Q S C</w:t>
             </w:r>
           </w:p>
         </w:tc>
@@ -9801,7 +9694,7 @@
                 <w:i w:val="0"/>
                 <w:sz w:val="16"/>
               </w:rPr>
-              <w:t>—</w:t>
+              <w:t>Identity reconstruction / positive reappraisal</w:t>
             </w:r>
           </w:p>
         </w:tc>
@@ -9822,7 +9715,7 @@
                 <w:i w:val="0"/>
                 <w:sz w:val="16"/>
               </w:rPr>
-              <w:t>Pittman 2025</w:t>
+              <w:t>Rall 2021</w:t>
             </w:r>
             <w:r>
               <w:rPr>
@@ -9831,7 +9724,7 @@
                 <w:sz w:val="16"/>
                 <w:vertAlign w:val="superscript"/>
               </w:rPr>
-              <w:t>44</w:t>
+              <w:t>25</w:t>
             </w:r>
           </w:p>
         </w:tc>
@@ -9850,7 +9743,7 @@
                 <w:i w:val="0"/>
                 <w:sz w:val="16"/>
               </w:rPr>
-              <w:t>Australia</w:t>
+              <w:t>Germany</w:t>
             </w:r>
           </w:p>
         </w:tc>
@@ -9869,7 +9762,7 @@
                 <w:i w:val="0"/>
                 <w:sz w:val="16"/>
               </w:rPr>
-              <w:t>Cross-sectional survey (congenital vs acquired uterine factor infertility)</w:t>
+              <w:t>Prospective cohort (pre/post surgery)</w:t>
             </w:r>
           </w:p>
         </w:tc>
@@ -9888,7 +9781,7 @@
                 <w:i w:val="0"/>
                 <w:sz w:val="16"/>
               </w:rPr>
-              <w:t>39</w:t>
+              <w:t>82</w:t>
             </w:r>
           </w:p>
         </w:tc>
@@ -9907,7 +9800,7 @@
                 <w:i w:val="0"/>
                 <w:sz w:val="16"/>
               </w:rPr>
-              <w:t>D Q</w:t>
+              <w:t>Q S P C</w:t>
             </w:r>
           </w:p>
         </w:tc>
@@ -9926,7 +9819,7 @@
                 <w:i w:val="0"/>
                 <w:sz w:val="16"/>
               </w:rPr>
-              <w:t>—</w:t>
+              <w:t>Peer, family &amp; social support</w:t>
             </w:r>
           </w:p>
         </w:tc>
@@ -9947,7 +9840,7 @@
                 <w:i w:val="0"/>
                 <w:sz w:val="16"/>
               </w:rPr>
-              <w:t>Rajesh 2026</w:t>
+              <w:t>Sabatucci 2019</w:t>
             </w:r>
             <w:r>
               <w:rPr>
@@ -9956,7 +9849,7 @@
                 <w:sz w:val="16"/>
                 <w:vertAlign w:val="superscript"/>
               </w:rPr>
-              <w:t>10</w:t>
+              <w:t>29</w:t>
             </w:r>
           </w:p>
         </w:tc>
@@ -9975,7 +9868,7 @@
                 <w:i w:val="0"/>
                 <w:sz w:val="16"/>
               </w:rPr>
-              <w:t>Canada</w:t>
+              <w:t>Italy</w:t>
             </w:r>
           </w:p>
         </w:tc>
@@ -9994,7 +9887,7 @@
                 <w:i w:val="0"/>
                 <w:sz w:val="16"/>
               </w:rPr>
-              <w:t>Semi-structured interviews</w:t>
+              <w:t>Descriptive longitudinal</w:t>
             </w:r>
           </w:p>
         </w:tc>
@@ -10013,7 +9906,7 @@
                 <w:i w:val="0"/>
                 <w:sz w:val="16"/>
               </w:rPr>
-              <w:t>12</w:t>
+              <w:t>39</w:t>
             </w:r>
           </w:p>
         </w:tc>
@@ -10032,7 +9925,7 @@
                 <w:i w:val="0"/>
                 <w:sz w:val="16"/>
               </w:rPr>
-              <w:t>Q S C</w:t>
+              <w:t>Q S</w:t>
             </w:r>
           </w:p>
         </w:tc>
@@ -10051,7 +9944,7 @@
                 <w:i w:val="0"/>
                 <w:sz w:val="16"/>
               </w:rPr>
-              <w:t>Identity reconstruction / positive reappraisal</w:t>
+              <w:t>—</w:t>
             </w:r>
           </w:p>
         </w:tc>
@@ -10072,7 +9965,7 @@
                 <w:i w:val="0"/>
                 <w:sz w:val="16"/>
               </w:rPr>
-              <w:t>Rall 2021</w:t>
+              <w:t>Scollo 2020</w:t>
             </w:r>
             <w:r>
               <w:rPr>
@@ -10081,7 +9974,7 @@
                 <w:sz w:val="16"/>
                 <w:vertAlign w:val="superscript"/>
               </w:rPr>
-              <w:t>26</w:t>
+              <w:t>40</w:t>
             </w:r>
           </w:p>
         </w:tc>
@@ -10100,7 +9993,7 @@
                 <w:i w:val="0"/>
                 <w:sz w:val="16"/>
               </w:rPr>
-              <w:t>Germany</w:t>
+              <w:t>Italy</w:t>
             </w:r>
           </w:p>
         </w:tc>
@@ -10119,7 +10012,7 @@
                 <w:i w:val="0"/>
                 <w:sz w:val="16"/>
               </w:rPr>
-              <w:t>Prospective cohort (pre/post surgery)</w:t>
+              <w:t>Cross-sectional (MMPI-2; uterus transplant candidates)</w:t>
             </w:r>
           </w:p>
         </w:tc>
@@ -10138,7 +10031,7 @@
                 <w:i w:val="0"/>
                 <w:sz w:val="16"/>
               </w:rPr>
-              <w:t>82</w:t>
+              <w:t>19 (18 MRKH)</w:t>
             </w:r>
           </w:p>
         </w:tc>
@@ -10157,7 +10050,7 @@
                 <w:i w:val="0"/>
                 <w:sz w:val="16"/>
               </w:rPr>
-              <w:t>Q S P C</w:t>
+              <w:t>D P</w:t>
             </w:r>
           </w:p>
         </w:tc>
@@ -10176,7 +10069,7 @@
                 <w:i w:val="0"/>
                 <w:sz w:val="16"/>
               </w:rPr>
-              <w:t>Peer, family &amp; social support</w:t>
+              <w:t>—</w:t>
             </w:r>
           </w:p>
         </w:tc>
@@ -10197,7 +10090,7 @@
                 <w:i w:val="0"/>
                 <w:sz w:val="16"/>
               </w:rPr>
-              <w:t>Sabatucci 2019</w:t>
+              <w:t>Shao 2022</w:t>
             </w:r>
             <w:r>
               <w:rPr>
@@ -10206,7 +10099,7 @@
                 <w:sz w:val="16"/>
                 <w:vertAlign w:val="superscript"/>
               </w:rPr>
-              <w:t>31</w:t>
+              <w:t>45</w:t>
             </w:r>
           </w:p>
         </w:tc>
@@ -10225,7 +10118,7 @@
                 <w:i w:val="0"/>
                 <w:sz w:val="16"/>
               </w:rPr>
-              <w:t>Italy</w:t>
+              <w:t>China</w:t>
             </w:r>
           </w:p>
         </w:tc>
@@ -10244,7 +10137,7 @@
                 <w:i w:val="0"/>
                 <w:sz w:val="16"/>
               </w:rPr>
-              <w:t>Descriptive longitudinal</w:t>
+              <w:t>Prospective pre/post intervention</w:t>
             </w:r>
           </w:p>
         </w:tc>
@@ -10263,7 +10156,7 @@
                 <w:i w:val="0"/>
                 <w:sz w:val="16"/>
               </w:rPr>
-              <w:t>39</w:t>
+              <w:t>30</w:t>
             </w:r>
           </w:p>
         </w:tc>
@@ -10282,7 +10175,7 @@
                 <w:i w:val="0"/>
                 <w:sz w:val="16"/>
               </w:rPr>
-              <w:t>Q S</w:t>
+              <w:t>D C</w:t>
             </w:r>
           </w:p>
         </w:tc>
@@ -10301,7 +10194,7 @@
                 <w:i w:val="0"/>
                 <w:sz w:val="16"/>
               </w:rPr>
-              <w:t>—</w:t>
+              <w:t>Psychological counseling/intervention</w:t>
             </w:r>
           </w:p>
         </w:tc>
@@ -10322,7 +10215,7 @@
                 <w:i w:val="0"/>
                 <w:sz w:val="16"/>
               </w:rPr>
-              <w:t>Schäffeler 2022</w:t>
+              <w:t>Song 2020</w:t>
             </w:r>
             <w:r>
               <w:rPr>
@@ -10331,7 +10224,7 @@
                 <w:sz w:val="16"/>
                 <w:vertAlign w:val="superscript"/>
               </w:rPr>
-              <w:t>27</w:t>
+              <w:t>17</w:t>
             </w:r>
           </w:p>
         </w:tc>
@@ -10350,7 +10243,7 @@
                 <w:i w:val="0"/>
                 <w:sz w:val="16"/>
               </w:rPr>
-              <w:t>Germany</w:t>
+              <w:t>China</w:t>
             </w:r>
           </w:p>
         </w:tc>
@@ -10369,7 +10262,7 @@
                 <w:i w:val="0"/>
                 <w:sz w:val="16"/>
               </w:rPr>
-              <w:t>Quasi-experimental pre/post</w:t>
+              <w:t>Cross-sectional (with controls)</w:t>
             </w:r>
           </w:p>
         </w:tc>
@@ -10388,7 +10281,7 @@
                 <w:i w:val="0"/>
                 <w:sz w:val="16"/>
               </w:rPr>
-              <w:t>53</w:t>
+              <w:t>141 (+178 controls)</w:t>
             </w:r>
           </w:p>
         </w:tc>
@@ -10407,7 +10300,7 @@
                 <w:i w:val="0"/>
                 <w:sz w:val="16"/>
               </w:rPr>
-              <w:t>D Q S P C</w:t>
+              <w:t>D</w:t>
             </w:r>
           </w:p>
         </w:tc>
@@ -10426,7 +10319,7 @@
                 <w:i w:val="0"/>
                 <w:sz w:val="16"/>
               </w:rPr>
-              <w:t>Psychological counseling/intervention</w:t>
+              <w:t>—</w:t>
             </w:r>
           </w:p>
         </w:tc>
@@ -10447,7 +10340,7 @@
                 <w:i w:val="0"/>
                 <w:sz w:val="16"/>
               </w:rPr>
-              <w:t>Scollo 2020</w:t>
+              <w:t>Sorouri Khorashad 2025</w:t>
             </w:r>
             <w:r>
               <w:rPr>
@@ -10456,382 +10349,7 @@
                 <w:sz w:val="16"/>
                 <w:vertAlign w:val="superscript"/>
               </w:rPr>
-              <w:t>43</w:t>
-            </w:r>
-          </w:p>
-        </w:tc>
-        <w:tc>
-          <w:tcPr>
-            <w:tcW w:type="dxa" w:w="1296"/>
-          </w:tcPr>
-          <w:p>
-            <w:pPr>
-              <w:spacing w:line="240" w:lineRule="auto"/>
-            </w:pPr>
-            <w:r/>
-            <w:r>
-              <w:rPr>
-                <w:b w:val="0"/>
-                <w:i w:val="0"/>
-                <w:sz w:val="16"/>
-              </w:rPr>
-              <w:t>Italy</w:t>
-            </w:r>
-          </w:p>
-        </w:tc>
-        <w:tc>
-          <w:tcPr>
-            <w:tcW w:type="dxa" w:w="2160"/>
-          </w:tcPr>
-          <w:p>
-            <w:pPr>
-              <w:spacing w:line="240" w:lineRule="auto"/>
-            </w:pPr>
-            <w:r/>
-            <w:r>
-              <w:rPr>
-                <w:b w:val="0"/>
-                <w:i w:val="0"/>
-                <w:sz w:val="16"/>
-              </w:rPr>
-              <w:t>Cross-sectional (MMPI-2; uterus transplant candidates)</w:t>
-            </w:r>
-          </w:p>
-        </w:tc>
-        <w:tc>
-          <w:tcPr>
-            <w:tcW w:type="dxa" w:w="1152"/>
-          </w:tcPr>
-          <w:p>
-            <w:pPr>
-              <w:spacing w:line="240" w:lineRule="auto"/>
-            </w:pPr>
-            <w:r/>
-            <w:r>
-              <w:rPr>
-                <w:b w:val="0"/>
-                <w:i w:val="0"/>
-                <w:sz w:val="16"/>
-              </w:rPr>
-              <w:t>19 (18 MRKH)</w:t>
-            </w:r>
-          </w:p>
-        </w:tc>
-        <w:tc>
-          <w:tcPr>
-            <w:tcW w:type="dxa" w:w="1008"/>
-          </w:tcPr>
-          <w:p>
-            <w:pPr>
-              <w:spacing w:line="240" w:lineRule="auto"/>
-            </w:pPr>
-            <w:r/>
-            <w:r>
-              <w:rPr>
-                <w:b w:val="0"/>
-                <w:i w:val="0"/>
-                <w:sz w:val="16"/>
-              </w:rPr>
-              <w:t>D P</w:t>
-            </w:r>
-          </w:p>
-        </w:tc>
-        <w:tc>
-          <w:tcPr>
-            <w:tcW w:type="dxa" w:w="2160"/>
-          </w:tcPr>
-          <w:p>
-            <w:pPr>
-              <w:spacing w:line="240" w:lineRule="auto"/>
-            </w:pPr>
-            <w:r/>
-            <w:r>
-              <w:rPr>
-                <w:b w:val="0"/>
-                <w:i w:val="0"/>
-                <w:sz w:val="16"/>
-              </w:rPr>
-              <w:t>—</w:t>
-            </w:r>
-          </w:p>
-        </w:tc>
-      </w:tr>
-      <w:tr>
-        <w:tc>
-          <w:tcPr>
-            <w:tcW w:type="dxa" w:w="1584"/>
-          </w:tcPr>
-          <w:p>
-            <w:pPr>
-              <w:spacing w:line="240" w:lineRule="auto"/>
-            </w:pPr>
-            <w:r/>
-            <w:r>
-              <w:rPr>
-                <w:b w:val="0"/>
-                <w:i w:val="0"/>
-                <w:sz w:val="16"/>
-              </w:rPr>
-              <w:t>Shao 2022</w:t>
-            </w:r>
-            <w:r>
-              <w:rPr>
-                <w:b w:val="0"/>
-                <w:i w:val="0"/>
-                <w:sz w:val="16"/>
-                <w:vertAlign w:val="superscript"/>
-              </w:rPr>
-              <w:t>48</w:t>
-            </w:r>
-          </w:p>
-        </w:tc>
-        <w:tc>
-          <w:tcPr>
-            <w:tcW w:type="dxa" w:w="1296"/>
-          </w:tcPr>
-          <w:p>
-            <w:pPr>
-              <w:spacing w:line="240" w:lineRule="auto"/>
-            </w:pPr>
-            <w:r/>
-            <w:r>
-              <w:rPr>
-                <w:b w:val="0"/>
-                <w:i w:val="0"/>
-                <w:sz w:val="16"/>
-              </w:rPr>
-              <w:t>China</w:t>
-            </w:r>
-          </w:p>
-        </w:tc>
-        <w:tc>
-          <w:tcPr>
-            <w:tcW w:type="dxa" w:w="2160"/>
-          </w:tcPr>
-          <w:p>
-            <w:pPr>
-              <w:spacing w:line="240" w:lineRule="auto"/>
-            </w:pPr>
-            <w:r/>
-            <w:r>
-              <w:rPr>
-                <w:b w:val="0"/>
-                <w:i w:val="0"/>
-                <w:sz w:val="16"/>
-              </w:rPr>
-              <w:t>Prospective pre/post intervention</w:t>
-            </w:r>
-          </w:p>
-        </w:tc>
-        <w:tc>
-          <w:tcPr>
-            <w:tcW w:type="dxa" w:w="1152"/>
-          </w:tcPr>
-          <w:p>
-            <w:pPr>
-              <w:spacing w:line="240" w:lineRule="auto"/>
-            </w:pPr>
-            <w:r/>
-            <w:r>
-              <w:rPr>
-                <w:b w:val="0"/>
-                <w:i w:val="0"/>
-                <w:sz w:val="16"/>
-              </w:rPr>
-              <w:t>30</w:t>
-            </w:r>
-          </w:p>
-        </w:tc>
-        <w:tc>
-          <w:tcPr>
-            <w:tcW w:type="dxa" w:w="1008"/>
-          </w:tcPr>
-          <w:p>
-            <w:pPr>
-              <w:spacing w:line="240" w:lineRule="auto"/>
-            </w:pPr>
-            <w:r/>
-            <w:r>
-              <w:rPr>
-                <w:b w:val="0"/>
-                <w:i w:val="0"/>
-                <w:sz w:val="16"/>
-              </w:rPr>
-              <w:t>D C</w:t>
-            </w:r>
-          </w:p>
-        </w:tc>
-        <w:tc>
-          <w:tcPr>
-            <w:tcW w:type="dxa" w:w="2160"/>
-          </w:tcPr>
-          <w:p>
-            <w:pPr>
-              <w:spacing w:line="240" w:lineRule="auto"/>
-            </w:pPr>
-            <w:r/>
-            <w:r>
-              <w:rPr>
-                <w:b w:val="0"/>
-                <w:i w:val="0"/>
-                <w:sz w:val="16"/>
-              </w:rPr>
-              <w:t>Psychological counseling/intervention</w:t>
-            </w:r>
-          </w:p>
-        </w:tc>
-      </w:tr>
-      <w:tr>
-        <w:tc>
-          <w:tcPr>
-            <w:tcW w:type="dxa" w:w="1584"/>
-          </w:tcPr>
-          <w:p>
-            <w:pPr>
-              <w:spacing w:line="240" w:lineRule="auto"/>
-            </w:pPr>
-            <w:r/>
-            <w:r>
-              <w:rPr>
-                <w:b w:val="0"/>
-                <w:i w:val="0"/>
-                <w:sz w:val="16"/>
-              </w:rPr>
-              <w:t>Song 2020</w:t>
-            </w:r>
-            <w:r>
-              <w:rPr>
-                <w:b w:val="0"/>
-                <w:i w:val="0"/>
-                <w:sz w:val="16"/>
-                <w:vertAlign w:val="superscript"/>
-              </w:rPr>
-              <w:t>17</w:t>
-            </w:r>
-          </w:p>
-        </w:tc>
-        <w:tc>
-          <w:tcPr>
-            <w:tcW w:type="dxa" w:w="1296"/>
-          </w:tcPr>
-          <w:p>
-            <w:pPr>
-              <w:spacing w:line="240" w:lineRule="auto"/>
-            </w:pPr>
-            <w:r/>
-            <w:r>
-              <w:rPr>
-                <w:b w:val="0"/>
-                <w:i w:val="0"/>
-                <w:sz w:val="16"/>
-              </w:rPr>
-              <w:t>China</w:t>
-            </w:r>
-          </w:p>
-        </w:tc>
-        <w:tc>
-          <w:tcPr>
-            <w:tcW w:type="dxa" w:w="2160"/>
-          </w:tcPr>
-          <w:p>
-            <w:pPr>
-              <w:spacing w:line="240" w:lineRule="auto"/>
-            </w:pPr>
-            <w:r/>
-            <w:r>
-              <w:rPr>
-                <w:b w:val="0"/>
-                <w:i w:val="0"/>
-                <w:sz w:val="16"/>
-              </w:rPr>
-              <w:t>Cross-sectional (with controls)</w:t>
-            </w:r>
-          </w:p>
-        </w:tc>
-        <w:tc>
-          <w:tcPr>
-            <w:tcW w:type="dxa" w:w="1152"/>
-          </w:tcPr>
-          <w:p>
-            <w:pPr>
-              <w:spacing w:line="240" w:lineRule="auto"/>
-            </w:pPr>
-            <w:r/>
-            <w:r>
-              <w:rPr>
-                <w:b w:val="0"/>
-                <w:i w:val="0"/>
-                <w:sz w:val="16"/>
-              </w:rPr>
-              <w:t>141 (+178 controls)</w:t>
-            </w:r>
-          </w:p>
-        </w:tc>
-        <w:tc>
-          <w:tcPr>
-            <w:tcW w:type="dxa" w:w="1008"/>
-          </w:tcPr>
-          <w:p>
-            <w:pPr>
-              <w:spacing w:line="240" w:lineRule="auto"/>
-            </w:pPr>
-            <w:r/>
-            <w:r>
-              <w:rPr>
-                <w:b w:val="0"/>
-                <w:i w:val="0"/>
-                <w:sz w:val="16"/>
-              </w:rPr>
-              <w:t>D</w:t>
-            </w:r>
-          </w:p>
-        </w:tc>
-        <w:tc>
-          <w:tcPr>
-            <w:tcW w:type="dxa" w:w="2160"/>
-          </w:tcPr>
-          <w:p>
-            <w:pPr>
-              <w:spacing w:line="240" w:lineRule="auto"/>
-            </w:pPr>
-            <w:r/>
-            <w:r>
-              <w:rPr>
-                <w:b w:val="0"/>
-                <w:i w:val="0"/>
-                <w:sz w:val="16"/>
-              </w:rPr>
-              <w:t>—</w:t>
-            </w:r>
-          </w:p>
-        </w:tc>
-      </w:tr>
-      <w:tr>
-        <w:tc>
-          <w:tcPr>
-            <w:tcW w:type="dxa" w:w="1584"/>
-          </w:tcPr>
-          <w:p>
-            <w:pPr>
-              <w:spacing w:line="240" w:lineRule="auto"/>
-            </w:pPr>
-            <w:r/>
-            <w:r>
-              <w:rPr>
-                <w:b w:val="0"/>
-                <w:i w:val="0"/>
-                <w:sz w:val="16"/>
-              </w:rPr>
-              <w:t>Sorouri Khorashad 2025</w:t>
-            </w:r>
-            <w:r>
-              <w:rPr>
-                <w:b w:val="0"/>
-                <w:i w:val="0"/>
-                <w:sz w:val="16"/>
-                <w:vertAlign w:val="superscript"/>
-              </w:rPr>
-              <w:t>40</w:t>
+              <w:t>37</w:t>
             </w:r>
           </w:p>
         </w:tc>

</xml_diff>

<commit_message>
Full-text verification of 30 of 35 included studies
Checked extraction against the uploaded full texts; excluded Mediå 2022 at
eligibility (2 of 15 participants had MRKH, not analyzed separately), giving
35 included studies. Corrected domains, sample sizes and coping codes;
rebuilt data.json, figures, map, manuscript and poster. Added
rescreen/FULLTEXT_VERIFICATION.md.

Co-Authored-By: Claude Opus 5.5 <noreply@anthropic.com>
Claude-Session: https://claude.ai/code/session_01N468nYR7vy45HpujgUezn5
</commit_message>
<xml_diff>
--- a/manuscript/MRKH_Scoping_Review_Manuscript.docx
+++ b/manuscript/MRKH_Scoping_Review_Manuscript.docx
@@ -142,7 +142,7 @@
           <w:b w:val="0"/>
           <w:i w:val="0"/>
         </w:rPr>
-        <w:t xml:space="preserve"> 2,463   </w:t>
+        <w:t xml:space="preserve"> 2,566   </w:t>
       </w:r>
       <w:r>
         <w:rPr>
@@ -277,7 +277,7 @@
           <w:b w:val="0"/>
           <w:i w:val="0"/>
         </w:rPr>
-        <w:t xml:space="preserve"> Of 516 records identified (324 after deduplication), 36 studies were provisionally included. Psychosexual and relational challenges were the most frequently reported outcomes (n = 23; 64%), followed by reduced quality of life, body image, and self-esteem (n = 17; 47%), broader psychological distress (n = 20; 56%), and depression and anxiety (n = 11; 31%). Coping mechanisms were documented in 14 studies, mostly peer support and self-management, and healthcare system gaps in 10. Studies came mainly from Europe (n = 15) and Asia (n = 14).</w:t>
+        <w:t xml:space="preserve"> Of 516 records identified (324 after deduplication), 35 studies were included. Psychosexual and relational challenges were the most frequently reported outcomes (n = 24; 69%), followed by reduced quality of life, body image, and self-esteem (n = 19; 54%), broader psychological distress (n = 20; 57%), and depression and anxiety (n = 14; 40%). Coping mechanisms were documented in 15 studies, mostly peer support and self-management, and healthcare system gaps in 10. Studies came mainly from Europe (n = 14) and Asia (n = 14).</w:t>
       </w:r>
     </w:p>
     <w:p>
@@ -812,7 +812,7 @@
           <w:b w:val="0"/>
           <w:i w:val="0"/>
         </w:rPr>
-        <w:t xml:space="preserve">. Records that could not be classified from the exported title and abstract were assessed for eligibility using the published abstract; studies with mixed samples were included only if results were reported separately for participants with MRKH or at least 80% of participants had MRKH. </w:t>
+        <w:t xml:space="preserve">. Records that could not be classified from the exported title and abstract were assessed for eligibility using the published abstract; studies with mixed samples were included only if results were reported separately for participants with MRKH or at least 80% of participants had MRKH. Full texts were then obtained for 30 of the 35 included studies and checked against the same criteria; at this stage one study of adults with differences of sex development was excluded because only 2 of its 15 participants had MRKH and their findings were not analyzed separately. </w:t>
       </w:r>
       <w:r>
         <w:rPr>
@@ -820,7 +820,7 @@
           <w:i w:val="0"/>
           <w:highlight w:val="yellow"/>
         </w:rPr>
-        <w:t>[Full-text verification of all included studies is pending.]</w:t>
+        <w:t>[The full texts of the remaining 5 studies could not be obtained; their inclusion rests on the published abstract or title.]</w:t>
       </w:r>
       <w:r>
         <w:rPr>
@@ -851,7 +851,7 @@
           <w:b w:val="0"/>
           <w:i w:val="0"/>
         </w:rPr>
-        <w:t xml:space="preserve">For each included study, data were charted on author, year, country, study design, sample size, reported mental health and psychosocial outcomes, coping mechanisms, and healthcare system gaps. In this version, charting was based on titles and abstracts; </w:t>
+        <w:t xml:space="preserve">For each included study, data were charted on author, year, country, study design, sample size, reported mental health and psychosocial outcomes, coping mechanisms, and healthcare system gaps. Charted items were checked against the full text for 30 of 35 studies; the remaining 5 were charted from the title and abstract </w:t>
       </w:r>
       <w:r>
         <w:rPr>
@@ -859,7 +859,7 @@
           <w:i w:val="0"/>
           <w:highlight w:val="yellow"/>
         </w:rPr>
-        <w:t>[full-text verification of every charted item is pending]</w:t>
+        <w:t>[and should be checked when their full texts are obtained]</w:t>
       </w:r>
       <w:r>
         <w:rPr>
@@ -941,7 +941,7 @@
           <w:b w:val="0"/>
           <w:i w:val="0"/>
         </w:rPr>
-        <w:t>The searches identified 516 records. After removal of 192 duplicates, 324 records were screened and 282 were excluded: published before 2019 (n = 89); case report / surgical case series (n = 75); not primary research (n = 48); surgical/functional outcomes only (n = 38); wrong population / topic (n = 28); not in english (n = 4). Of the 42 records assessed for eligibility, 6 were excluded (mixed sample, mrkh not separate, n = 4; no psychological outcome, n = 2), and 36 studies were provisionally included (Figure 1).</w:t>
+        <w:t>The searches identified 516 records. After removal of 192 duplicates, 324 records were screened and 282 were excluded: published before 2019 (n = 89); case report / surgical case series (n = 75); not primary research (n = 48); surgical/functional outcomes only (n = 38); wrong population / topic (n = 28); not in english (n = 4). Of the 42 records assessed for eligibility, 7 were excluded (mixed sample, mrkh not separate, n = 5; no psychological outcome, n = 2), and 35 studies were included (Figure 1).</w:t>
       </w:r>
     </w:p>
     <w:p>
@@ -1002,7 +1002,7 @@
           <w:i w:val="0"/>
           <w:sz w:val="20"/>
         </w:rPr>
-        <w:t xml:space="preserve"> PRISMA-ScR flow diagram of study selection. Counts are provisional pending reviewer verification and full-text confirmation.</w:t>
+        <w:t xml:space="preserve"> PRISMA-ScR flow diagram of study selection. Counts are pending confirmation by the review team.</w:t>
       </w:r>
     </w:p>
     <w:p>
@@ -1026,7 +1026,7 @@
           <w:b w:val="0"/>
           <w:i w:val="0"/>
         </w:rPr>
-        <w:t>The 36 included studies were published between 2019 and 2026 and comprised 18 quantitative studies (50.0%), 15 qualitative studies (41.7%), and 2 mixed-methods studies (5.6%); the design of 1 study could not be determined from its abstract (Table 1; Figure 2). Quantitative designs included cross-sectional surveys, case-control comparisons, cohort and pre–post studies, and 1 randomized controlled trial.</w:t>
+        <w:t>The 35 included studies were published between 2019 and 2026 and comprised 18 quantitative studies (51.4%), 14 qualitative studies (40.0%), and 2 mixed-methods studies (5.7%); the design of 1 study could not be determined because only its title was available (Table 1; Figure 2). Quantitative designs included cross-sectional surveys, case-control comparisons, cohort and pre–post studies, and 1 randomized controlled trial.</w:t>
       </w:r>
       <w:r>
         <w:rPr>
@@ -1041,7 +1041,7 @@
           <w:b w:val="0"/>
           <w:i w:val="0"/>
         </w:rPr>
-        <w:t xml:space="preserve"> Most studies came from Europe (n = 15) and Asia (n = 14), followed by North America (n = 3), Africa (n = 1), and Oceania (n = 1); 2 studies recruited internationally, and none came from South America (Figure 3). China contributed the most studies (n = 6). Sample sizes, where reported, ranged from 5 to 616 participants. Two Chinese reports appear to draw on the same sample of 141 patients.</w:t>
+        <w:t xml:space="preserve"> Most studies came from Europe (n = 14) and Asia (n = 14), followed by North America (n = 3), Africa (n = 1), and Oceania (n = 1); 2 studies recruited internationally, and none came from South America (Figure 3). China contributed the most studies (n = 6). Sample sizes, where reported, ranged from 5 to 616 participants. Two Chinese reports appear to draw on the same sample of 141 patients.</w:t>
       </w:r>
       <w:r>
         <w:rPr>
@@ -1076,7 +1076,7 @@
           <w:b w:val="0"/>
           <w:i w:val="0"/>
         </w:rPr>
-        <w:t xml:space="preserve"> Study design and geographic distribution of included studies (N = 36)</w:t>
+        <w:t xml:space="preserve"> Study design and geographic distribution of included studies (N = 35)</w:t>
       </w:r>
     </w:p>
     <w:tbl>
@@ -1251,7 +1251,7 @@
                 <w:i w:val="0"/>
                 <w:sz w:val="20"/>
               </w:rPr>
-              <w:t>50.0%</w:t>
+              <w:t>51.4%</w:t>
             </w:r>
           </w:p>
         </w:tc>
@@ -1291,7 +1291,7 @@
                 <w:i w:val="0"/>
                 <w:sz w:val="20"/>
               </w:rPr>
-              <w:t>15</w:t>
+              <w:t>14</w:t>
             </w:r>
           </w:p>
         </w:tc>
@@ -1310,7 +1310,7 @@
                 <w:i w:val="0"/>
                 <w:sz w:val="20"/>
               </w:rPr>
-              <w:t>41.7%</w:t>
+              <w:t>40.0%</w:t>
             </w:r>
           </w:p>
         </w:tc>
@@ -1369,7 +1369,7 @@
                 <w:i w:val="0"/>
                 <w:sz w:val="20"/>
               </w:rPr>
-              <w:t>5.6%</w:t>
+              <w:t>5.7%</w:t>
             </w:r>
           </w:p>
         </w:tc>
@@ -1428,7 +1428,7 @@
                 <w:i w:val="0"/>
                 <w:sz w:val="20"/>
               </w:rPr>
-              <w:t>2.8%</w:t>
+              <w:t>2.9%</w:t>
             </w:r>
           </w:p>
         </w:tc>
@@ -1511,7 +1511,7 @@
                 <w:i w:val="0"/>
                 <w:sz w:val="20"/>
               </w:rPr>
-              <w:t>15</w:t>
+              <w:t>14</w:t>
             </w:r>
           </w:p>
         </w:tc>
@@ -1530,7 +1530,7 @@
                 <w:i w:val="0"/>
                 <w:sz w:val="20"/>
               </w:rPr>
-              <w:t>41.7%</w:t>
+              <w:t>40.0%</w:t>
             </w:r>
           </w:p>
         </w:tc>
@@ -1589,7 +1589,7 @@
                 <w:i w:val="0"/>
                 <w:sz w:val="20"/>
               </w:rPr>
-              <w:t>38.9%</w:t>
+              <w:t>40.0%</w:t>
             </w:r>
           </w:p>
         </w:tc>
@@ -1648,7 +1648,7 @@
                 <w:i w:val="0"/>
                 <w:sz w:val="20"/>
               </w:rPr>
-              <w:t>8.3%</w:t>
+              <w:t>8.6%</w:t>
             </w:r>
           </w:p>
         </w:tc>
@@ -1707,7 +1707,7 @@
                 <w:i w:val="0"/>
                 <w:sz w:val="20"/>
               </w:rPr>
-              <w:t>5.6%</w:t>
+              <w:t>5.7%</w:t>
             </w:r>
           </w:p>
         </w:tc>
@@ -1766,7 +1766,7 @@
                 <w:i w:val="0"/>
                 <w:sz w:val="20"/>
               </w:rPr>
-              <w:t>2.8%</w:t>
+              <w:t>2.9%</w:t>
             </w:r>
           </w:p>
         </w:tc>
@@ -1825,7 +1825,7 @@
                 <w:i w:val="0"/>
                 <w:sz w:val="20"/>
               </w:rPr>
-              <w:t>2.8%</w:t>
+              <w:t>2.9%</w:t>
             </w:r>
           </w:p>
         </w:tc>
@@ -1900,7 +1900,7 @@
           <w:i w:val="0"/>
           <w:sz w:val="20"/>
         </w:rPr>
-        <w:t>Percentages are of all included studies (N = 36) and may not total 100% because of rounding. Classifications are provisional (abstract-level).</w:t>
+        <w:t>Percentages are of all included studies (N = 35) and may not total 100% because of rounding. Five studies were charted from the abstract or title only.</w:t>
       </w:r>
     </w:p>
     <w:p>
@@ -1961,7 +1961,7 @@
           <w:i w:val="0"/>
           <w:sz w:val="20"/>
         </w:rPr>
-        <w:t xml:space="preserve"> Distribution of included studies by design (N = 36).</w:t>
+        <w:t xml:space="preserve"> Distribution of included studies by design (N = 35).</w:t>
       </w:r>
     </w:p>
     <w:p>
@@ -2022,7 +2022,7 @@
           <w:i w:val="0"/>
           <w:sz w:val="20"/>
         </w:rPr>
-        <w:t xml:space="preserve"> Geographic distribution of included studies by region (N = 36). Darker shading indicates more studies; 2 multinational studies are not mapped.</w:t>
+        <w:t xml:space="preserve"> Geographic distribution of included studies by region (N = 35). Darker shading indicates more studies; 2 multinational studies are not mapped.</w:t>
       </w:r>
     </w:p>
     <w:p>
@@ -2046,7 +2046,7 @@
           <w:b w:val="0"/>
           <w:i w:val="0"/>
         </w:rPr>
-        <w:t>Psychosexual and relational challenges were the most frequently reported domain (23 of 36 studies; 63.9%), followed by quality of life, body image, and self-esteem (17; 47.2%), broader psychological distress (20; 55.6%), and depression and anxiety (11; 30.6%) (Table 2; Figure 4).</w:t>
+        <w:t>Psychosexual and relational challenges were the most frequently reported domain (24 of 35 studies; 68.6%), followed by quality of life, body image, and self-esteem (19; 54.3%), broader psychological distress (20; 57.1%), and depression and anxiety (14; 40.0%) (Table 2; Figure 4).</w:t>
       </w:r>
     </w:p>
     <w:p>
@@ -2110,7 +2110,7 @@
           <w:b w:val="0"/>
           <w:i w:val="0"/>
         </w:rPr>
-        <w:t xml:space="preserve"> Adults with differences of sex development, including MRKH, described balancing concealment and disclosure of their condition.</w:t>
+        <w:t xml:space="preserve"> In an African qualitative study, cultural and religious expectations about virginity discouraged vaginal dilation.</w:t>
       </w:r>
       <w:r>
         <w:rPr>
@@ -2414,7 +2414,7 @@
           <w:b w:val="0"/>
           <w:i w:val="0"/>
         </w:rPr>
-        <w:t xml:space="preserve"> Mental health and psychosocial outcome domains reported in included studies (N = 36)</w:t>
+        <w:t xml:space="preserve"> Mental health and psychosocial outcome domains reported in included studies (N = 35)</w:t>
       </w:r>
     </w:p>
     <w:tbl>
@@ -2546,7 +2546,7 @@
                 <w:i w:val="0"/>
                 <w:sz w:val="20"/>
               </w:rPr>
-              <w:t>23 (63.9%)</w:t>
+              <w:t>24 (68.6%)</w:t>
             </w:r>
           </w:p>
         </w:tc>
@@ -2605,7 +2605,7 @@
                 <w:i w:val="0"/>
                 <w:sz w:val="20"/>
               </w:rPr>
-              <w:t>17 (47.2%)</w:t>
+              <w:t>19 (54.3%)</w:t>
             </w:r>
           </w:p>
         </w:tc>
@@ -2664,7 +2664,7 @@
                 <w:i w:val="0"/>
                 <w:sz w:val="20"/>
               </w:rPr>
-              <w:t>20 (55.6%)</w:t>
+              <w:t>20 (57.1%)</w:t>
             </w:r>
           </w:p>
         </w:tc>
@@ -2723,7 +2723,7 @@
                 <w:i w:val="0"/>
                 <w:sz w:val="20"/>
               </w:rPr>
-              <w:t>11 (30.6%)</w:t>
+              <w:t>14 (40.0%)</w:t>
             </w:r>
           </w:p>
         </w:tc>
@@ -2800,7 +2800,7 @@
           <w:i w:val="0"/>
           <w:sz w:val="20"/>
         </w:rPr>
-        <w:t xml:space="preserve"> Number of included studies reporting each outcome domain, coping mechanisms, and healthcare system gaps (N = 36). Studies could contribute to more than one category.</w:t>
+        <w:t xml:space="preserve"> Number of included studies reporting each outcome domain, coping mechanisms, and healthcare system gaps (N = 35). Studies could contribute to more than one category.</w:t>
       </w:r>
     </w:p>
     <w:p>
@@ -2824,7 +2824,7 @@
           <w:b w:val="0"/>
           <w:i w:val="0"/>
         </w:rPr>
-        <w:t>Coping mechanisms were documented in 14 studies (38.9%; Table 3). Peer, family, and social support was most common,</w:t>
+        <w:t>Coping mechanisms were documented in 15 studies (42.9%; Table 3). Peer, family, and social support was most common,</w:t>
       </w:r>
       <w:r>
         <w:rPr>
@@ -2832,7 +2832,7 @@
           <w:i w:val="0"/>
           <w:vertAlign w:val="superscript"/>
         </w:rPr>
-        <w:t>23,25,26,32,42,43</w:t>
+        <w:t>23,25,26,32,33,42,43</w:t>
       </w:r>
       <w:r>
         <w:rPr>
@@ -2847,7 +2847,7 @@
           <w:i w:val="0"/>
           <w:vertAlign w:val="superscript"/>
         </w:rPr>
-        <w:t>23,24,31,42,44</w:t>
+        <w:t>23,24,31,42–44</w:t>
       </w:r>
       <w:r>
         <w:rPr>
@@ -3044,7 +3044,7 @@
                 <w:i w:val="0"/>
                 <w:sz w:val="20"/>
               </w:rPr>
-              <w:t>6</w:t>
+              <w:t>7</w:t>
             </w:r>
           </w:p>
         </w:tc>
@@ -3103,7 +3103,7 @@
                 <w:i w:val="0"/>
                 <w:sz w:val="20"/>
               </w:rPr>
-              <w:t>5</w:t>
+              <w:t>6</w:t>
             </w:r>
           </w:p>
         </w:tc>
@@ -3242,7 +3242,7 @@
                 <w:i w:val="0"/>
                 <w:sz w:val="20"/>
               </w:rPr>
-              <w:t>Spiritual coping</w:t>
+              <w:t>Acceptance</w:t>
             </w:r>
           </w:p>
         </w:tc>
@@ -3301,7 +3301,7 @@
                 <w:i w:val="0"/>
                 <w:sz w:val="20"/>
               </w:rPr>
-              <w:t>Acceptance</w:t>
+              <w:t>Spiritual coping</w:t>
             </w:r>
           </w:p>
         </w:tc>
@@ -3339,7 +3339,7 @@
                 <w:i w:val="0"/>
                 <w:sz w:val="20"/>
               </w:rPr>
-              <w:t>2</w:t>
+              <w:t>1</w:t>
             </w:r>
           </w:p>
         </w:tc>
@@ -3438,7 +3438,7 @@
           <w:b w:val="0"/>
           <w:i w:val="0"/>
         </w:rPr>
-        <w:t>Healthcare system gaps were reported in 10 studies (27.8%; Table 4). Participants described providers with limited knowledge of MRKH and the need to advocate for themselves,</w:t>
+        <w:t>Healthcare system gaps were reported in 10 studies (28.6%; Table 4). Participants described providers with limited knowledge of MRKH and the need to advocate for themselves,</w:t>
       </w:r>
       <w:r>
         <w:rPr>
@@ -3476,7 +3476,7 @@
           <w:i w:val="0"/>
           <w:vertAlign w:val="superscript"/>
         </w:rPr>
-        <w:t>47</w:t>
+        <w:t>24</w:t>
       </w:r>
       <w:r>
         <w:rPr>
@@ -3491,7 +3491,7 @@
           <w:i w:val="0"/>
           <w:vertAlign w:val="superscript"/>
         </w:rPr>
-        <w:t>43,44,48</w:t>
+        <w:t>43,44,47</w:t>
       </w:r>
       <w:r>
         <w:rPr>
@@ -3506,7 +3506,7 @@
           <w:i w:val="0"/>
           <w:vertAlign w:val="superscript"/>
         </w:rPr>
-        <w:t>49</w:t>
+        <w:t>48</w:t>
       </w:r>
     </w:p>
     <w:p>
@@ -3817,7 +3817,7 @@
           <w:b w:val="0"/>
           <w:i w:val="0"/>
         </w:rPr>
-        <w:t>This scoping review mapped 36 studies published between 2019 and 2026 on the mental health and psychosocial outcomes of individuals with MRKH syndrome. Psychosexual and relational challenges were the most frequently reported outcome, reported in about two of every three studies, while broader psychological distress and quality of life, body image, and self-esteem were each reported in about half. Depression and anxiety were measured less often, and results were mixed. Coping was documented in more than one in three studies and relied largely on peer support and self-management, and about one in four studies described healthcare system gaps.</w:t>
+        <w:t>This scoping review mapped 35 studies published between 2019 and 2026 on the mental health and psychosocial outcomes of individuals with MRKH syndrome. Psychosexual and relational challenges were the most frequently reported outcome, reported in about two of every three studies, while broader psychological distress and quality of life, body image, and self-esteem were each reported in about half. Depression and anxiety were measured less often, and results were mixed. Coping was documented in more than one in three studies and relied largely on peer support and self-management, and more than one in four studies described healthcare system gaps.</w:t>
       </w:r>
     </w:p>
     <w:p>
@@ -3936,7 +3936,7 @@
           <w:i w:val="0"/>
           <w:vertAlign w:val="superscript"/>
         </w:rPr>
-        <w:t>50</w:t>
+        <w:t>49</w:t>
       </w:r>
       <w:r>
         <w:rPr>
@@ -4005,7 +4005,7 @@
           <w:i w:val="0"/>
           <w:vertAlign w:val="superscript"/>
         </w:rPr>
-        <w:t>9,44,51</w:t>
+        <w:t>9,44,50</w:t>
       </w:r>
     </w:p>
     <w:p>
@@ -4053,7 +4053,22 @@
           <w:b w:val="0"/>
           <w:i w:val="0"/>
         </w:rPr>
-        <w:t xml:space="preserve">Strengths include an established methodological framework, PRISMA-ScR reporting, a search of biomedical, nursing, psychological, and women's studies databases, and inclusion of quantitative, qualitative, and mixed-methods evidence. The most important limitation is that the original screening records were lost and selection was repeated from the original exports with AI-assisted screening and abstract-level data charting; results are therefore provisional until reviewer verification and full-text confirmation of the 36 included studies are complete. In addition, the review was limited to 2019–2026, date limits were applied inconsistently across database interfaces and enforced at screening, designs and measures were heterogeneous, and some studies may share samples. Consistent with scoping methodology, study quality was not appraised, and counts reflect how often outcomes were studied, not their prevalence. </w:t>
+        <w:t xml:space="preserve">Strengths include an established methodological framework, PRISMA-ScR reporting, a search of biomedical, nursing, psychological, and women's studies databases, and inclusion of quantitative, qualitative, and mixed-methods evidence. The most important limitation is that the original screening records were lost and selection was repeated from the original exports with AI-assisted screening and charting. Charting was checked against the full text for 30 of the 35 included studies, but the remaining 5 rest on abstracts or titles, and </w:t>
+      </w:r>
+      <w:r>
+        <w:rPr>
+          <w:b w:val="0"/>
+          <w:i w:val="0"/>
+          <w:highlight w:val="yellow"/>
+        </w:rPr>
+        <w:t>[reviewer verification of all decisions is still required]</w:t>
+      </w:r>
+      <w:r>
+        <w:rPr>
+          <w:b w:val="0"/>
+          <w:i w:val="0"/>
+        </w:rPr>
+        <w:t xml:space="preserve">. Two Danish reports and two Chinese reports appear to share samples. In addition, the review was limited to 2019–2026, date limits were applied inconsistently across database interfaces and enforced at screening, designs and measures were heterogeneous, and other studies may also share samples. Consistent with scoping methodology, study quality was not appraised, and counts reflect how often outcomes were studied, not their prevalence. </w:t>
       </w:r>
       <w:r>
         <w:rPr>
@@ -4903,21 +4918,21 @@
         </w:rPr>
         <w:t>24.</w:t>
         <w:tab/>
-        <w:t xml:space="preserve">Mediå LM, Fauske L, Sigurdardottir S, Feragen KJB, Heggeli C, Wæhre A. ‘It was Supposed to be a Secret’: a study of disclosure and stigma as experienced by adults with differences of sex development. </w:t>
+        <w:t xml:space="preserve">Ngoumou R.-D.. How does the experience of the medical encounter with Mayer-Rokitansky-Küster-Hauser (MRKH) Syndrome impact women in Africa?. </w:t>
       </w:r>
       <w:r>
         <w:rPr>
           <w:b w:val="0"/>
           <w:i/>
         </w:rPr>
-        <w:t>Health Psychol Behav Med</w:t>
+        <w:t>Pan African Medical Journal</w:t>
       </w:r>
       <w:r>
         <w:rPr>
           <w:b w:val="0"/>
           <w:i w:val="0"/>
         </w:rPr>
-        <w:t>. 2022;10(1):579-595. doi:10.1080/21642850.2022.2102018</w:t>
+        <w:t>. 2022;42:314. doi:10.11604/pamj.2022.42.314.32830</w:t>
       </w:r>
     </w:p>
     <w:p>
@@ -5547,21 +5562,21 @@
         </w:rPr>
         <w:t>47.</w:t>
         <w:tab/>
-        <w:t xml:space="preserve">Ngoumou R.-D.. How does the experience of the medical encounter with Mayer-Rokitansky-Küster-Hauser (MRKH) Syndrome impact women in Africa?. </w:t>
+        <w:t xml:space="preserve">Di Mattei VE, Taranto P, Perego G, et al. Illness experience and (unmet) needs of women with Mayer-Rokitansky-Küster-Hauser Syndrome (MRKH): a qualitative analysis of an online forum. </w:t>
       </w:r>
       <w:r>
         <w:rPr>
           <w:b w:val="0"/>
           <w:i/>
         </w:rPr>
-        <w:t>Pan African Medical Journal</w:t>
+        <w:t>Psychol Health</w:t>
       </w:r>
       <w:r>
         <w:rPr>
           <w:b w:val="0"/>
           <w:i w:val="0"/>
         </w:rPr>
-        <w:t>. 2022;42:314. doi:10.11604/pamj.2022.42.314.32830</w:t>
+        <w:t>. 2026;41(1):53-75. doi:10.1080/08870446.2024.2390647</w:t>
       </w:r>
     </w:p>
     <w:p>
@@ -5575,21 +5590,21 @@
         </w:rPr>
         <w:t>48.</w:t>
         <w:tab/>
-        <w:t xml:space="preserve">Di Mattei VE, Taranto P, Perego G, et al. Illness experience and (unmet) needs of women with Mayer-Rokitansky-Küster-Hauser Syndrome (MRKH): a qualitative analysis of an online forum. </w:t>
+        <w:t xml:space="preserve">Pennesi CM, Berkeley J, Lossie AC, Quint EH, Zieman KD, Carroll S. International experiences with vaginal lengthening treatment among individuals with Müllerian agenesis: A mixed-methods study. </w:t>
       </w:r>
       <w:r>
         <w:rPr>
           <w:b w:val="0"/>
           <w:i/>
         </w:rPr>
-        <w:t>Psychol Health</w:t>
+        <w:t>J Pediatr Adolesc Gynecol</w:t>
       </w:r>
       <w:r>
         <w:rPr>
           <w:b w:val="0"/>
           <w:i w:val="0"/>
         </w:rPr>
-        <w:t>. 2026;41(1):53-75. doi:10.1080/08870446.2024.2390647</w:t>
+        <w:t>. 2023;36(5):476-483. doi:10.1016/j.jpag.2023.05.004</w:t>
       </w:r>
     </w:p>
     <w:p>
@@ -5603,21 +5618,21 @@
         </w:rPr>
         <w:t>49.</w:t>
         <w:tab/>
-        <w:t xml:space="preserve">Pennesi CM, Berkeley J, Lossie AC, Quint EH, Zieman KD, Carroll S. International experiences with vaginal lengthening treatment among individuals with Müllerian agenesis: A mixed-methods study. </w:t>
+        <w:t xml:space="preserve">Heller-Boersma JG, Schmidt UH, Edmonds DK. A randomized controlled trial of a cognitive-behavioural group intervention versus waiting-list control for women with uterovaginal agenesis (Mayer-Rokitansky-Küster-Hauser syndrome: MRKH). </w:t>
       </w:r>
       <w:r>
         <w:rPr>
           <w:b w:val="0"/>
           <w:i/>
         </w:rPr>
-        <w:t>J Pediatr Adolesc Gynecol</w:t>
+        <w:t>Hum Reprod</w:t>
       </w:r>
       <w:r>
         <w:rPr>
           <w:b w:val="0"/>
           <w:i w:val="0"/>
         </w:rPr>
-        <w:t>. 2023;36(5):476-483. doi:10.1016/j.jpag.2023.05.004</w:t>
+        <w:t>. 2007;22(8):2296-2301. doi:10.1093/humrep/dem167</w:t>
       </w:r>
     </w:p>
     <w:p>
@@ -5630,34 +5645,6 @@
           <w:i w:val="0"/>
         </w:rPr>
         <w:t>50.</w:t>
-        <w:tab/>
-        <w:t xml:space="preserve">Heller-Boersma JG, Schmidt UH, Edmonds DK. A randomized controlled trial of a cognitive-behavioural group intervention versus waiting-list control for women with uterovaginal agenesis (Mayer-Rokitansky-Küster-Hauser syndrome: MRKH). </w:t>
-      </w:r>
-      <w:r>
-        <w:rPr>
-          <w:b w:val="0"/>
-          <w:i/>
-        </w:rPr>
-        <w:t>Hum Reprod</w:t>
-      </w:r>
-      <w:r>
-        <w:rPr>
-          <w:b w:val="0"/>
-          <w:i w:val="0"/>
-        </w:rPr>
-        <w:t>. 2007;22(8):2296-2301. doi:10.1093/humrep/dem167</w:t>
-      </w:r>
-    </w:p>
-    <w:p>
-      <w:pPr>
-        <w:ind w:left="504" w:hanging="504"/>
-      </w:pPr>
-      <w:r>
-        <w:rPr>
-          <w:b w:val="0"/>
-          <w:i w:val="0"/>
-        </w:rPr>
-        <w:t>51.</w:t>
         <w:tab/>
         <w:t xml:space="preserve">Okunomiya A, Tsuyuki K, Ohsuga T, et al. Long-term psychosocial outcomes in Japanese Mayer-Rokitansky-Küster-Hauser syndrome: a single-center study. </w:t>
       </w:r>
@@ -6288,7 +6275,7 @@
           <w:i w:val="0"/>
           <w:sz w:val="20"/>
         </w:rPr>
-        <w:t>Provisional, abstract-level data charting; every entry requires full-text verification. Domains: D, depression/anxiety; Q, quality of life, body image, self-esteem; S, psychosexual and relational; P, broader psychological distress; C, coping documented; H, healthcare system gaps. Reference numbers refer to the main reference list.</w:t>
+        <w:t>Data charting was checked against the full text for 30 of 35 studies; entries marked † were charted from the abstract or title only. Domains: D, depression/anxiety; Q, quality of life, body image, self-esteem; S, psychosexual and relational; P, broader psychological distress; C, coping documented; H, healthcare system gaps. Reference numbers refer to the main reference list.</w:t>
       </w:r>
     </w:p>
     <w:p>
@@ -6308,7 +6295,7 @@
           <w:b w:val="0"/>
           <w:i w:val="0"/>
         </w:rPr>
-        <w:t xml:space="preserve"> Characteristics of included studies (N = 36)</w:t>
+        <w:t xml:space="preserve"> Characteristics of included studies (N = 35)</w:t>
       </w:r>
     </w:p>
     <w:tbl>
@@ -6476,6 +6463,14 @@
               </w:rPr>
               <w:t>27</w:t>
             </w:r>
+            <w:r>
+              <w:rPr>
+                <w:b w:val="0"/>
+                <w:i w:val="0"/>
+                <w:sz w:val="16"/>
+              </w:rPr>
+              <w:t>†</w:t>
+            </w:r>
           </w:p>
         </w:tc>
         <w:tc>
@@ -6974,7 +6969,15 @@
                 <w:sz w:val="16"/>
                 <w:vertAlign w:val="superscript"/>
               </w:rPr>
-              <w:t>48</w:t>
+              <w:t>47</w:t>
+            </w:r>
+            <w:r>
+              <w:rPr>
+                <w:b w:val="0"/>
+                <w:i w:val="0"/>
+                <w:sz w:val="16"/>
+              </w:rPr>
+              <w:t>†</w:t>
             </w:r>
           </w:p>
         </w:tc>
@@ -7550,7 +7553,7 @@
                 <w:i w:val="0"/>
                 <w:sz w:val="16"/>
               </w:rPr>
-              <w:t>S P C H</w:t>
+              <w:t>D Q S P C H</w:t>
             </w:r>
           </w:p>
         </w:tc>
@@ -7569,7 +7572,7 @@
                 <w:i w:val="0"/>
                 <w:sz w:val="16"/>
               </w:rPr>
-              <w:t>Peer, family &amp; social support</w:t>
+              <w:t>Peer, family &amp; social support; Avoidance / concealment (maladaptive)</w:t>
             </w:r>
           </w:p>
         </w:tc>
@@ -7601,6 +7604,14 @@
               </w:rPr>
               <w:t>32</w:t>
             </w:r>
+            <w:r>
+              <w:rPr>
+                <w:b w:val="0"/>
+                <w:i w:val="0"/>
+                <w:sz w:val="16"/>
+              </w:rPr>
+              <w:t>†</w:t>
+            </w:r>
           </w:p>
         </w:tc>
         <w:tc>
@@ -7851,6 +7862,14 @@
               </w:rPr>
               <w:t>39</w:t>
             </w:r>
+            <w:r>
+              <w:rPr>
+                <w:b w:val="0"/>
+                <w:i w:val="0"/>
+                <w:sz w:val="16"/>
+              </w:rPr>
+              <w:t>†</w:t>
+            </w:r>
           </w:p>
         </w:tc>
         <w:tc>
@@ -8031,7 +8050,7 @@
                 <w:i w:val="0"/>
                 <w:sz w:val="16"/>
               </w:rPr>
-              <w:t>7 (6 MRKH)</w:t>
+              <w:t>9 (8 MRKH)</w:t>
             </w:r>
           </w:p>
         </w:tc>
@@ -8137,7 +8156,7 @@
                 <w:i w:val="0"/>
                 <w:sz w:val="16"/>
               </w:rPr>
-              <w:t>Cross-sectional</w:t>
+              <w:t>Cross-sectional (dilation vs surgery)</w:t>
             </w:r>
           </w:p>
         </w:tc>
@@ -8281,7 +8300,7 @@
                 <w:i w:val="0"/>
                 <w:sz w:val="16"/>
               </w:rPr>
-              <w:t>16 (incl. partners, donors)</w:t>
+              <w:t>16 recipients (+16 partners, 16 donors)</w:t>
             </w:r>
           </w:p>
         </w:tc>
@@ -8569,7 +8588,7 @@
                 <w:i w:val="0"/>
                 <w:sz w:val="16"/>
               </w:rPr>
-              <w:t>Avoidance / concealment (maladaptive); Spiritual coping</w:t>
+              <w:t>Avoidance / concealment (maladaptive)</w:t>
             </w:r>
           </w:p>
         </w:tc>
@@ -8762,7 +8781,7 @@
                 <w:i w:val="0"/>
                 <w:sz w:val="16"/>
               </w:rPr>
-              <w:t>Interview study</w:t>
+              <w:t>In-depth interviews</w:t>
             </w:r>
           </w:p>
         </w:tc>
@@ -8781,7 +8800,7 @@
                 <w:i w:val="0"/>
                 <w:sz w:val="16"/>
               </w:rPr>
-              <w:t>NR</w:t>
+              <w:t>18</w:t>
             </w:r>
           </w:p>
         </w:tc>
@@ -8800,7 +8819,7 @@
                 <w:i w:val="0"/>
                 <w:sz w:val="16"/>
               </w:rPr>
-              <w:t>P H</w:t>
+              <w:t>P C H</w:t>
             </w:r>
           </w:p>
         </w:tc>
@@ -8819,7 +8838,7 @@
                 <w:i w:val="0"/>
                 <w:sz w:val="16"/>
               </w:rPr>
-              <w:t>—</w:t>
+              <w:t>Peer, family &amp; social support</w:t>
             </w:r>
           </w:p>
         </w:tc>
@@ -8851,6 +8870,14 @@
               </w:rPr>
               <w:t>30</w:t>
             </w:r>
+            <w:r>
+              <w:rPr>
+                <w:b w:val="0"/>
+                <w:i w:val="0"/>
+                <w:sz w:val="16"/>
+              </w:rPr>
+              <w:t>†</w:t>
+            </w:r>
           </w:p>
         </w:tc>
         <w:tc>
@@ -9031,7 +9058,7 @@
                 <w:i w:val="0"/>
                 <w:sz w:val="16"/>
               </w:rPr>
-              <w:t>NR</w:t>
+              <w:t>12</w:t>
             </w:r>
           </w:p>
         </w:tc>
@@ -9090,7 +9117,7 @@
                 <w:i w:val="0"/>
                 <w:sz w:val="16"/>
               </w:rPr>
-              <w:t>Mediå 2022</w:t>
+              <w:t>Ngoumou 2022</w:t>
             </w:r>
             <w:r>
               <w:rPr>
@@ -9118,7 +9145,7 @@
                 <w:i w:val="0"/>
                 <w:sz w:val="16"/>
               </w:rPr>
-              <w:t>Norway</w:t>
+              <w:t>Cameroon, Côte d'Ivoire, Senegal</w:t>
             </w:r>
           </w:p>
         </w:tc>
@@ -9137,7 +9164,7 @@
                 <w:i w:val="0"/>
                 <w:sz w:val="16"/>
               </w:rPr>
-              <w:t>Semi-structured interviews (adults with 5 DSD conditions)</w:t>
+              <w:t>In-depth interviews</w:t>
             </w:r>
           </w:p>
         </w:tc>
@@ -9156,7 +9183,7 @@
                 <w:i w:val="0"/>
                 <w:sz w:val="16"/>
               </w:rPr>
-              <w:t>15 (DSD; MRKH subgroup)</w:t>
+              <w:t>5</w:t>
             </w:r>
           </w:p>
         </w:tc>
@@ -9175,7 +9202,7 @@
                 <w:i w:val="0"/>
                 <w:sz w:val="16"/>
               </w:rPr>
-              <w:t>S P C</w:t>
+              <w:t>Q S P C H</w:t>
             </w:r>
           </w:p>
         </w:tc>
@@ -9215,7 +9242,7 @@
                 <w:i w:val="0"/>
                 <w:sz w:val="16"/>
               </w:rPr>
-              <w:t>Ngoumou 2022</w:t>
+              <w:t>Pennesi 2023</w:t>
             </w:r>
             <w:r>
               <w:rPr>
@@ -9224,7 +9251,7 @@
                 <w:sz w:val="16"/>
                 <w:vertAlign w:val="superscript"/>
               </w:rPr>
-              <w:t>47</w:t>
+              <w:t>48</w:t>
             </w:r>
           </w:p>
         </w:tc>
@@ -9243,7 +9270,7 @@
                 <w:i w:val="0"/>
                 <w:sz w:val="16"/>
               </w:rPr>
-              <w:t>Cameroon, Côte d'Ivoire, Senegal</w:t>
+              <w:t>Multinational (40 countries)</w:t>
             </w:r>
           </w:p>
         </w:tc>
@@ -9262,7 +9289,7 @@
                 <w:i w:val="0"/>
                 <w:sz w:val="16"/>
               </w:rPr>
-              <w:t>In-depth interviews</w:t>
+              <w:t>Cross-sectional mixed-methods survey</w:t>
             </w:r>
           </w:p>
         </w:tc>
@@ -9281,7 +9308,7 @@
                 <w:i w:val="0"/>
                 <w:sz w:val="16"/>
               </w:rPr>
-              <w:t>5</w:t>
+              <w:t>616</w:t>
             </w:r>
           </w:p>
         </w:tc>
@@ -9300,7 +9327,7 @@
                 <w:i w:val="0"/>
                 <w:sz w:val="16"/>
               </w:rPr>
-              <w:t>P H</w:t>
+              <w:t>S P H</w:t>
             </w:r>
           </w:p>
         </w:tc>
@@ -9340,7 +9367,7 @@
                 <w:i w:val="0"/>
                 <w:sz w:val="16"/>
               </w:rPr>
-              <w:t>Pennesi 2023</w:t>
+              <w:t>Pittman 2025</w:t>
             </w:r>
             <w:r>
               <w:rPr>
@@ -9349,7 +9376,7 @@
                 <w:sz w:val="16"/>
                 <w:vertAlign w:val="superscript"/>
               </w:rPr>
-              <w:t>49</w:t>
+              <w:t>41</w:t>
             </w:r>
           </w:p>
         </w:tc>
@@ -9368,7 +9395,7 @@
                 <w:i w:val="0"/>
                 <w:sz w:val="16"/>
               </w:rPr>
-              <w:t>Multinational (40 countries)</w:t>
+              <w:t>Australia</w:t>
             </w:r>
           </w:p>
         </w:tc>
@@ -9387,7 +9414,7 @@
                 <w:i w:val="0"/>
                 <w:sz w:val="16"/>
               </w:rPr>
-              <w:t>Cross-sectional mixed-methods survey</w:t>
+              <w:t>Cross-sectional survey (congenital vs acquired uterine factor infertility)</w:t>
             </w:r>
           </w:p>
         </w:tc>
@@ -9406,7 +9433,7 @@
                 <w:i w:val="0"/>
                 <w:sz w:val="16"/>
               </w:rPr>
-              <w:t>616</w:t>
+              <w:t>39 (31 MRKH)</w:t>
             </w:r>
           </w:p>
         </w:tc>
@@ -9425,7 +9452,7 @@
                 <w:i w:val="0"/>
                 <w:sz w:val="16"/>
               </w:rPr>
-              <w:t>S P H</w:t>
+              <w:t>D Q P</w:t>
             </w:r>
           </w:p>
         </w:tc>
@@ -9465,7 +9492,7 @@
                 <w:i w:val="0"/>
                 <w:sz w:val="16"/>
               </w:rPr>
-              <w:t>Pittman 2025</w:t>
+              <w:t>Rajesh 2026</w:t>
             </w:r>
             <w:r>
               <w:rPr>
@@ -9474,7 +9501,7 @@
                 <w:sz w:val="16"/>
                 <w:vertAlign w:val="superscript"/>
               </w:rPr>
-              <w:t>41</w:t>
+              <w:t>10</w:t>
             </w:r>
           </w:p>
         </w:tc>
@@ -9493,7 +9520,7 @@
                 <w:i w:val="0"/>
                 <w:sz w:val="16"/>
               </w:rPr>
-              <w:t>Australia</w:t>
+              <w:t>Canada</w:t>
             </w:r>
           </w:p>
         </w:tc>
@@ -9512,7 +9539,7 @@
                 <w:i w:val="0"/>
                 <w:sz w:val="16"/>
               </w:rPr>
-              <w:t>Cross-sectional survey (congenital vs acquired uterine factor infertility)</w:t>
+              <w:t>Semi-structured interviews</w:t>
             </w:r>
           </w:p>
         </w:tc>
@@ -9531,7 +9558,7 @@
                 <w:i w:val="0"/>
                 <w:sz w:val="16"/>
               </w:rPr>
-              <w:t>39</w:t>
+              <w:t>12</w:t>
             </w:r>
           </w:p>
         </w:tc>
@@ -9550,7 +9577,7 @@
                 <w:i w:val="0"/>
                 <w:sz w:val="16"/>
               </w:rPr>
-              <w:t>D Q</w:t>
+              <w:t>Q S C</w:t>
             </w:r>
           </w:p>
         </w:tc>
@@ -9569,7 +9596,7 @@
                 <w:i w:val="0"/>
                 <w:sz w:val="16"/>
               </w:rPr>
-              <w:t>—</w:t>
+              <w:t>Identity reconstruction / positive reappraisal</w:t>
             </w:r>
           </w:p>
         </w:tc>
@@ -9590,7 +9617,7 @@
                 <w:i w:val="0"/>
                 <w:sz w:val="16"/>
               </w:rPr>
-              <w:t>Rajesh 2026</w:t>
+              <w:t>Rall 2021</w:t>
             </w:r>
             <w:r>
               <w:rPr>
@@ -9599,7 +9626,7 @@
                 <w:sz w:val="16"/>
                 <w:vertAlign w:val="superscript"/>
               </w:rPr>
-              <w:t>10</w:t>
+              <w:t>25</w:t>
             </w:r>
           </w:p>
         </w:tc>
@@ -9618,7 +9645,7 @@
                 <w:i w:val="0"/>
                 <w:sz w:val="16"/>
               </w:rPr>
-              <w:t>Canada</w:t>
+              <w:t>Germany</w:t>
             </w:r>
           </w:p>
         </w:tc>
@@ -9637,7 +9664,7 @@
                 <w:i w:val="0"/>
                 <w:sz w:val="16"/>
               </w:rPr>
-              <w:t>Semi-structured interviews</w:t>
+              <w:t>Prospective cohort (pre/post surgery)</w:t>
             </w:r>
           </w:p>
         </w:tc>
@@ -9656,7 +9683,7 @@
                 <w:i w:val="0"/>
                 <w:sz w:val="16"/>
               </w:rPr>
-              <w:t>12</w:t>
+              <w:t>82</w:t>
             </w:r>
           </w:p>
         </w:tc>
@@ -9675,7 +9702,7 @@
                 <w:i w:val="0"/>
                 <w:sz w:val="16"/>
               </w:rPr>
-              <w:t>Q S C</w:t>
+              <w:t>D Q S P C</w:t>
             </w:r>
           </w:p>
         </w:tc>
@@ -9694,7 +9721,7 @@
                 <w:i w:val="0"/>
                 <w:sz w:val="16"/>
               </w:rPr>
-              <w:t>Identity reconstruction / positive reappraisal</w:t>
+              <w:t>Peer, family &amp; social support</w:t>
             </w:r>
           </w:p>
         </w:tc>
@@ -9715,7 +9742,7 @@
                 <w:i w:val="0"/>
                 <w:sz w:val="16"/>
               </w:rPr>
-              <w:t>Rall 2021</w:t>
+              <w:t>Sabatucci 2019</w:t>
             </w:r>
             <w:r>
               <w:rPr>
@@ -9724,7 +9751,7 @@
                 <w:sz w:val="16"/>
                 <w:vertAlign w:val="superscript"/>
               </w:rPr>
-              <w:t>25</w:t>
+              <w:t>29</w:t>
             </w:r>
           </w:p>
         </w:tc>
@@ -9743,7 +9770,7 @@
                 <w:i w:val="0"/>
                 <w:sz w:val="16"/>
               </w:rPr>
-              <w:t>Germany</w:t>
+              <w:t>Italy</w:t>
             </w:r>
           </w:p>
         </w:tc>
@@ -9762,7 +9789,7 @@
                 <w:i w:val="0"/>
                 <w:sz w:val="16"/>
               </w:rPr>
-              <w:t>Prospective cohort (pre/post surgery)</w:t>
+              <w:t>Descriptive longitudinal</w:t>
             </w:r>
           </w:p>
         </w:tc>
@@ -9781,7 +9808,7 @@
                 <w:i w:val="0"/>
                 <w:sz w:val="16"/>
               </w:rPr>
-              <w:t>82</w:t>
+              <w:t>39</w:t>
             </w:r>
           </w:p>
         </w:tc>
@@ -9800,7 +9827,7 @@
                 <w:i w:val="0"/>
                 <w:sz w:val="16"/>
               </w:rPr>
-              <w:t>Q S P C</w:t>
+              <w:t>Q S</w:t>
             </w:r>
           </w:p>
         </w:tc>
@@ -9819,7 +9846,7 @@
                 <w:i w:val="0"/>
                 <w:sz w:val="16"/>
               </w:rPr>
-              <w:t>Peer, family &amp; social support</w:t>
+              <w:t>—</w:t>
             </w:r>
           </w:p>
         </w:tc>
@@ -9840,7 +9867,7 @@
                 <w:i w:val="0"/>
                 <w:sz w:val="16"/>
               </w:rPr>
-              <w:t>Sabatucci 2019</w:t>
+              <w:t>Scollo 2020</w:t>
             </w:r>
             <w:r>
               <w:rPr>
@@ -9849,7 +9876,7 @@
                 <w:sz w:val="16"/>
                 <w:vertAlign w:val="superscript"/>
               </w:rPr>
-              <w:t>29</w:t>
+              <w:t>40</w:t>
             </w:r>
           </w:p>
         </w:tc>
@@ -9887,7 +9914,7 @@
                 <w:i w:val="0"/>
                 <w:sz w:val="16"/>
               </w:rPr>
-              <w:t>Descriptive longitudinal</w:t>
+              <w:t>Retrospective (MMPI-2; uterus transplant candidates)</w:t>
             </w:r>
           </w:p>
         </w:tc>
@@ -9906,7 +9933,7 @@
                 <w:i w:val="0"/>
                 <w:sz w:val="16"/>
               </w:rPr>
-              <w:t>39</w:t>
+              <w:t>19 (18 MRKH)</w:t>
             </w:r>
           </w:p>
         </w:tc>
@@ -9925,7 +9952,7 @@
                 <w:i w:val="0"/>
                 <w:sz w:val="16"/>
               </w:rPr>
-              <w:t>Q S</w:t>
+              <w:t>D P</w:t>
             </w:r>
           </w:p>
         </w:tc>
@@ -9965,7 +9992,7 @@
                 <w:i w:val="0"/>
                 <w:sz w:val="16"/>
               </w:rPr>
-              <w:t>Scollo 2020</w:t>
+              <w:t>Shao 2022</w:t>
             </w:r>
             <w:r>
               <w:rPr>
@@ -9974,7 +10001,7 @@
                 <w:sz w:val="16"/>
                 <w:vertAlign w:val="superscript"/>
               </w:rPr>
-              <w:t>40</w:t>
+              <w:t>45</w:t>
             </w:r>
           </w:p>
         </w:tc>
@@ -9993,7 +10020,7 @@
                 <w:i w:val="0"/>
                 <w:sz w:val="16"/>
               </w:rPr>
-              <w:t>Italy</w:t>
+              <w:t>China</w:t>
             </w:r>
           </w:p>
         </w:tc>
@@ -10012,7 +10039,7 @@
                 <w:i w:val="0"/>
                 <w:sz w:val="16"/>
               </w:rPr>
-              <w:t>Cross-sectional (MMPI-2; uterus transplant candidates)</w:t>
+              <w:t>Prospective pre/post intervention</w:t>
             </w:r>
           </w:p>
         </w:tc>
@@ -10031,7 +10058,7 @@
                 <w:i w:val="0"/>
                 <w:sz w:val="16"/>
               </w:rPr>
-              <w:t>19 (18 MRKH)</w:t>
+              <w:t>30</w:t>
             </w:r>
           </w:p>
         </w:tc>
@@ -10050,7 +10077,7 @@
                 <w:i w:val="0"/>
                 <w:sz w:val="16"/>
               </w:rPr>
-              <w:t>D P</w:t>
+              <w:t>D C</w:t>
             </w:r>
           </w:p>
         </w:tc>
@@ -10069,7 +10096,7 @@
                 <w:i w:val="0"/>
                 <w:sz w:val="16"/>
               </w:rPr>
-              <w:t>—</w:t>
+              <w:t>Psychological counseling/intervention</w:t>
             </w:r>
           </w:p>
         </w:tc>
@@ -10090,7 +10117,7 @@
                 <w:i w:val="0"/>
                 <w:sz w:val="16"/>
               </w:rPr>
-              <w:t>Shao 2022</w:t>
+              <w:t>Song 2020</w:t>
             </w:r>
             <w:r>
               <w:rPr>
@@ -10099,7 +10126,7 @@
                 <w:sz w:val="16"/>
                 <w:vertAlign w:val="superscript"/>
               </w:rPr>
-              <w:t>45</w:t>
+              <w:t>17</w:t>
             </w:r>
           </w:p>
         </w:tc>
@@ -10137,7 +10164,7 @@
                 <w:i w:val="0"/>
                 <w:sz w:val="16"/>
               </w:rPr>
-              <w:t>Prospective pre/post intervention</w:t>
+              <w:t>Cross-sectional (with controls)</w:t>
             </w:r>
           </w:p>
         </w:tc>
@@ -10156,7 +10183,7 @@
                 <w:i w:val="0"/>
                 <w:sz w:val="16"/>
               </w:rPr>
-              <w:t>30</w:t>
+              <w:t>141 (+178 controls)</w:t>
             </w:r>
           </w:p>
         </w:tc>
@@ -10175,7 +10202,7 @@
                 <w:i w:val="0"/>
                 <w:sz w:val="16"/>
               </w:rPr>
-              <w:t>D C</w:t>
+              <w:t>D S</w:t>
             </w:r>
           </w:p>
         </w:tc>
@@ -10194,7 +10221,7 @@
                 <w:i w:val="0"/>
                 <w:sz w:val="16"/>
               </w:rPr>
-              <w:t>Psychological counseling/intervention</w:t>
+              <w:t>—</w:t>
             </w:r>
           </w:p>
         </w:tc>
@@ -10215,7 +10242,7 @@
                 <w:i w:val="0"/>
                 <w:sz w:val="16"/>
               </w:rPr>
-              <w:t>Song 2020</w:t>
+              <w:t>Sorouri Khorashad 2025</w:t>
             </w:r>
             <w:r>
               <w:rPr>
@@ -10224,7 +10251,7 @@
                 <w:sz w:val="16"/>
                 <w:vertAlign w:val="superscript"/>
               </w:rPr>
-              <w:t>17</w:t>
+              <w:t>37</w:t>
             </w:r>
           </w:p>
         </w:tc>
@@ -10243,7 +10270,7 @@
                 <w:i w:val="0"/>
                 <w:sz w:val="16"/>
               </w:rPr>
-              <w:t>China</w:t>
+              <w:t>United States</w:t>
             </w:r>
           </w:p>
         </w:tc>
@@ -10262,7 +10289,7 @@
                 <w:i w:val="0"/>
                 <w:sz w:val="16"/>
               </w:rPr>
-              <w:t>Cross-sectional (with controls)</w:t>
+              <w:t>Retrospective cohort (EHR, matched referents)</w:t>
             </w:r>
           </w:p>
         </w:tc>
@@ -10281,7 +10308,7 @@
                 <w:i w:val="0"/>
                 <w:sz w:val="16"/>
               </w:rPr>
-              <w:t>141 (+178 controls)</w:t>
+              <w:t>101 MA (60 uterovaginal agenesis) + 63 CAIS</w:t>
             </w:r>
           </w:p>
         </w:tc>
@@ -10300,7 +10327,7 @@
                 <w:i w:val="0"/>
                 <w:sz w:val="16"/>
               </w:rPr>
-              <w:t>D</w:t>
+              <w:t>D P</w:t>
             </w:r>
           </w:p>
         </w:tc>
@@ -10340,7 +10367,7 @@
                 <w:i w:val="0"/>
                 <w:sz w:val="16"/>
               </w:rPr>
-              <w:t>Sorouri Khorashad 2025</w:t>
+              <w:t>Stepanow 2023</w:t>
             </w:r>
             <w:r>
               <w:rPr>
@@ -10349,7 +10376,7 @@
                 <w:sz w:val="16"/>
                 <w:vertAlign w:val="superscript"/>
               </w:rPr>
-              <w:t>37</w:t>
+              <w:t>22</w:t>
             </w:r>
           </w:p>
         </w:tc>
@@ -10368,7 +10395,7 @@
                 <w:i w:val="0"/>
                 <w:sz w:val="16"/>
               </w:rPr>
-              <w:t>United States</w:t>
+              <w:t>Austria</w:t>
             </w:r>
           </w:p>
         </w:tc>
@@ -10387,7 +10414,7 @@
                 <w:i w:val="0"/>
                 <w:sz w:val="16"/>
               </w:rPr>
-              <w:t>Retrospective cohort</w:t>
+              <w:t>Semi-structured interviews</w:t>
             </w:r>
           </w:p>
         </w:tc>
@@ -10406,7 +10433,7 @@
                 <w:i w:val="0"/>
                 <w:sz w:val="16"/>
               </w:rPr>
-              <w:t>NR</w:t>
+              <w:t>10 (+20 controls)</w:t>
             </w:r>
           </w:p>
         </w:tc>
@@ -10425,7 +10452,7 @@
                 <w:i w:val="0"/>
                 <w:sz w:val="16"/>
               </w:rPr>
-              <w:t>D P</w:t>
+              <w:t>Q S C</w:t>
             </w:r>
           </w:p>
         </w:tc>
@@ -10444,7 +10471,7 @@
                 <w:i w:val="0"/>
                 <w:sz w:val="16"/>
               </w:rPr>
-              <w:t>—</w:t>
+              <w:t>Acceptance</w:t>
             </w:r>
           </w:p>
         </w:tc>
@@ -10465,7 +10492,7 @@
                 <w:i w:val="0"/>
                 <w:sz w:val="16"/>
               </w:rPr>
-              <w:t>Stepanow 2023</w:t>
+              <w:t>Tsitoura 2021</w:t>
             </w:r>
             <w:r>
               <w:rPr>
@@ -10474,7 +10501,7 @@
                 <w:sz w:val="16"/>
                 <w:vertAlign w:val="superscript"/>
               </w:rPr>
-              <w:t>22</w:t>
+              <w:t>23</w:t>
             </w:r>
           </w:p>
         </w:tc>
@@ -10493,7 +10520,7 @@
                 <w:i w:val="0"/>
                 <w:sz w:val="16"/>
               </w:rPr>
-              <w:t>Austria</w:t>
+              <w:t>Greece</w:t>
             </w:r>
           </w:p>
         </w:tc>
@@ -10531,7 +10558,7 @@
                 <w:i w:val="0"/>
                 <w:sz w:val="16"/>
               </w:rPr>
-              <w:t>10 (+20 controls)</w:t>
+              <w:t>7</w:t>
             </w:r>
           </w:p>
         </w:tc>
@@ -10550,7 +10577,7 @@
                 <w:i w:val="0"/>
                 <w:sz w:val="16"/>
               </w:rPr>
-              <w:t>Q S C</w:t>
+              <w:t>S P C H</w:t>
             </w:r>
           </w:p>
         </w:tc>
@@ -10569,7 +10596,7 @@
                 <w:i w:val="0"/>
                 <w:sz w:val="16"/>
               </w:rPr>
-              <w:t>Acceptance</w:t>
+              <w:t>Avoidance / concealment (maladaptive); Peer, family &amp; social support</w:t>
             </w:r>
           </w:p>
         </w:tc>
@@ -10590,7 +10617,7 @@
                 <w:i w:val="0"/>
                 <w:sz w:val="16"/>
               </w:rPr>
-              <w:t>Tsitoura 2021</w:t>
+              <w:t>Vosoughi 2022</w:t>
             </w:r>
             <w:r>
               <w:rPr>
@@ -10599,7 +10626,7 @@
                 <w:sz w:val="16"/>
                 <w:vertAlign w:val="superscript"/>
               </w:rPr>
-              <w:t>23</w:t>
+              <w:t>16</w:t>
             </w:r>
           </w:p>
         </w:tc>
@@ -10618,7 +10645,7 @@
                 <w:i w:val="0"/>
                 <w:sz w:val="16"/>
               </w:rPr>
-              <w:t>Greece</w:t>
+              <w:t>Iran</w:t>
             </w:r>
           </w:p>
         </w:tc>
@@ -10637,7 +10664,7 @@
                 <w:i w:val="0"/>
                 <w:sz w:val="16"/>
               </w:rPr>
-              <w:t>Semi-structured interviews</w:t>
+              <w:t>Randomized controlled trial</w:t>
             </w:r>
           </w:p>
         </w:tc>
@@ -10656,7 +10683,7 @@
                 <w:i w:val="0"/>
                 <w:sz w:val="16"/>
               </w:rPr>
-              <w:t>7</w:t>
+              <w:t>38</w:t>
             </w:r>
           </w:p>
         </w:tc>
@@ -10675,7 +10702,7 @@
                 <w:i w:val="0"/>
                 <w:sz w:val="16"/>
               </w:rPr>
-              <w:t>S P C H</w:t>
+              <w:t>Q S C</w:t>
             </w:r>
           </w:p>
         </w:tc>
@@ -10694,7 +10721,7 @@
                 <w:i w:val="0"/>
                 <w:sz w:val="16"/>
               </w:rPr>
-              <w:t>Avoidance / concealment (maladaptive); Peer, family &amp; social support</w:t>
+              <w:t>Psychological counseling/intervention</w:t>
             </w:r>
           </w:p>
         </w:tc>
@@ -10715,7 +10742,7 @@
                 <w:i w:val="0"/>
                 <w:sz w:val="16"/>
               </w:rPr>
-              <w:t>Vosoughi 2022</w:t>
+              <w:t>Weijenborg 2019</w:t>
             </w:r>
             <w:r>
               <w:rPr>
@@ -10724,7 +10751,7 @@
                 <w:sz w:val="16"/>
                 <w:vertAlign w:val="superscript"/>
               </w:rPr>
-              <w:t>16</w:t>
+              <w:t>19</w:t>
             </w:r>
           </w:p>
         </w:tc>
@@ -10743,7 +10770,7 @@
                 <w:i w:val="0"/>
                 <w:sz w:val="16"/>
               </w:rPr>
-              <w:t>Iran</w:t>
+              <w:t>Netherlands</w:t>
             </w:r>
           </w:p>
         </w:tc>
@@ -10762,7 +10789,7 @@
                 <w:i w:val="0"/>
                 <w:sz w:val="16"/>
               </w:rPr>
-              <w:t>Randomized controlled trial</w:t>
+              <w:t>Case-control</w:t>
             </w:r>
           </w:p>
         </w:tc>
@@ -10781,7 +10808,7 @@
                 <w:i w:val="0"/>
                 <w:sz w:val="16"/>
               </w:rPr>
-              <w:t>38</w:t>
+              <w:t>54 (+79 controls)</w:t>
             </w:r>
           </w:p>
         </w:tc>
@@ -10800,132 +10827,7 @@
                 <w:i w:val="0"/>
                 <w:sz w:val="16"/>
               </w:rPr>
-              <w:t>Q S C</w:t>
-            </w:r>
-          </w:p>
-        </w:tc>
-        <w:tc>
-          <w:tcPr>
-            <w:tcW w:type="dxa" w:w="2160"/>
-          </w:tcPr>
-          <w:p>
-            <w:pPr>
-              <w:spacing w:line="240" w:lineRule="auto"/>
-            </w:pPr>
-            <w:r/>
-            <w:r>
-              <w:rPr>
-                <w:b w:val="0"/>
-                <w:i w:val="0"/>
-                <w:sz w:val="16"/>
-              </w:rPr>
-              <w:t>Psychological counseling/intervention</w:t>
-            </w:r>
-          </w:p>
-        </w:tc>
-      </w:tr>
-      <w:tr>
-        <w:tc>
-          <w:tcPr>
-            <w:tcW w:type="dxa" w:w="1584"/>
-          </w:tcPr>
-          <w:p>
-            <w:pPr>
-              <w:spacing w:line="240" w:lineRule="auto"/>
-            </w:pPr>
-            <w:r/>
-            <w:r>
-              <w:rPr>
-                <w:b w:val="0"/>
-                <w:i w:val="0"/>
-                <w:sz w:val="16"/>
-              </w:rPr>
-              <w:t>Weijenborg 2019</w:t>
-            </w:r>
-            <w:r>
-              <w:rPr>
-                <w:b w:val="0"/>
-                <w:i w:val="0"/>
-                <w:sz w:val="16"/>
-                <w:vertAlign w:val="superscript"/>
-              </w:rPr>
-              <w:t>19</w:t>
-            </w:r>
-          </w:p>
-        </w:tc>
-        <w:tc>
-          <w:tcPr>
-            <w:tcW w:type="dxa" w:w="1296"/>
-          </w:tcPr>
-          <w:p>
-            <w:pPr>
-              <w:spacing w:line="240" w:lineRule="auto"/>
-            </w:pPr>
-            <w:r/>
-            <w:r>
-              <w:rPr>
-                <w:b w:val="0"/>
-                <w:i w:val="0"/>
-                <w:sz w:val="16"/>
-              </w:rPr>
-              <w:t>Netherlands</w:t>
-            </w:r>
-          </w:p>
-        </w:tc>
-        <w:tc>
-          <w:tcPr>
-            <w:tcW w:type="dxa" w:w="2160"/>
-          </w:tcPr>
-          <w:p>
-            <w:pPr>
-              <w:spacing w:line="240" w:lineRule="auto"/>
-            </w:pPr>
-            <w:r/>
-            <w:r>
-              <w:rPr>
-                <w:b w:val="0"/>
-                <w:i w:val="0"/>
-                <w:sz w:val="16"/>
-              </w:rPr>
-              <w:t>Case-control</w:t>
-            </w:r>
-          </w:p>
-        </w:tc>
-        <w:tc>
-          <w:tcPr>
-            <w:tcW w:type="dxa" w:w="1152"/>
-          </w:tcPr>
-          <w:p>
-            <w:pPr>
-              <w:spacing w:line="240" w:lineRule="auto"/>
-            </w:pPr>
-            <w:r/>
-            <w:r>
-              <w:rPr>
-                <w:b w:val="0"/>
-                <w:i w:val="0"/>
-                <w:sz w:val="16"/>
-              </w:rPr>
-              <w:t>54 (+79 controls)</w:t>
-            </w:r>
-          </w:p>
-        </w:tc>
-        <w:tc>
-          <w:tcPr>
-            <w:tcW w:type="dxa" w:w="1008"/>
-          </w:tcPr>
-          <w:p>
-            <w:pPr>
-              <w:spacing w:line="240" w:lineRule="auto"/>
-            </w:pPr>
-            <w:r/>
-            <w:r>
-              <w:rPr>
-                <w:b w:val="0"/>
-                <w:i w:val="0"/>
-                <w:sz w:val="16"/>
-              </w:rPr>
-              <w:t>Q S P</w:t>
+              <w:t>D Q S P</w:t>
             </w:r>
           </w:p>
         </w:tc>
@@ -11897,16 +11799,7 @@
                 <w:i w:val="0"/>
                 <w:sz w:val="20"/>
               </w:rPr>
-              <w:t xml:space="preserve">Results; Figure 1 </w:t>
-            </w:r>
-            <w:r>
-              <w:rPr>
-                <w:b w:val="0"/>
-                <w:i w:val="0"/>
-                <w:sz w:val="20"/>
-                <w:highlight w:val="yellow"/>
-              </w:rPr>
-              <w:t>[full-text stage pending]</w:t>
+              <w:t>Results; Figure 1</w:t>
             </w:r>
           </w:p>
         </w:tc>

</xml_diff>

<commit_message>
Poster: fuller text with AMA in-text citations, QR code spot in the sample's References position, full reference list document; AMA fixes to reference formatting
Co-Authored-By: Claude Opus 5.5 <noreply@anthropic.com>
Claude-Session: https://claude.ai/code/session_01N468nYR7vy45HpujgUezn5
</commit_message>
<xml_diff>
--- a/manuscript/MRKH_Scoping_Review_Manuscript.docx
+++ b/manuscript/MRKH_Scoping_Review_Manuscript.docx
@@ -4498,7 +4498,7 @@
         </w:rPr>
         <w:t>9.</w:t>
         <w:tab/>
-        <w:t xml:space="preserve">Güner P, Ulukaya T, Pehlivan Sarıbudak T. "I felt like a woman": A phenomenological qualitative study of disease-related experiences in Mayer-Rokitansky-Küster-Hauser syndrome (MRKH syndrome). </w:t>
+        <w:t xml:space="preserve">Güner P, Ulukaya T, Pehlivan Sarıbudak T. "I felt like a woman": a phenomenological qualitative study of disease-related experiences in Mayer-Rokitansky-Küster-Hauser syndrome (MRKH syndrome). </w:t>
       </w:r>
       <w:r>
         <w:rPr>
@@ -4526,7 +4526,7 @@
         </w:rPr>
         <w:t>10.</w:t>
         <w:tab/>
-        <w:t xml:space="preserve">Rajesh Z, Marshall N, Hunker KE, et al. Understanding the impact of Mayer-Rokitansky-Küster-Hauser syndrome on sexual wellbeing-a qualitative study. </w:t>
+        <w:t xml:space="preserve">Rajesh Z, Marshall N, Hunker KE, et al. Understanding the impact of Mayer-Rokitansky-Küster-Hauser syndrome on sexual wellbeing—a qualitative study. </w:t>
       </w:r>
       <w:r>
         <w:rPr>
@@ -4694,7 +4694,7 @@
         </w:rPr>
         <w:t>16.</w:t>
         <w:tab/>
-        <w:t xml:space="preserve">Vosoughi N, Maasoumi R, Haeri Mehrizi AA, Ghanbari Z. The effect of psychosexual education on promoting sexual function, genital self-image, and sexual distress among women with Rokitansky syndrome: A randomized controlled clinical trial. </w:t>
+        <w:t xml:space="preserve">Vosoughi N, Maasoumi R, Haeri Mehrizi AA, Ghanbari Z. The effect of psychosexual education on promoting sexual function, genital self-image, and sexual distress among women with Rokitansky syndrome: a randomized controlled clinical trial. </w:t>
       </w:r>
       <w:r>
         <w:rPr>
@@ -4778,7 +4778,7 @@
         </w:rPr>
         <w:t>19.</w:t>
         <w:tab/>
-        <w:t xml:space="preserve">Weijenborg PTM, Kluivers KB, Dessens AB, Kate-Booij MJ, Both S. Sexual functioning, sexual esteem, genital self-image and psychological and relational functioning in women with Mayer-Rokitansky-Küster-Hauser syndrome: a case-control study. </w:t>
+        <w:t xml:space="preserve">Weijenborg PTM, Kluivers KB, Dessens AB, ten Kate-Booij MJ, Both S. Sexual functioning, sexual esteem, genital self-image and psychological and relational functioning in women with Mayer-Rokitansky-Küster-Hauser syndrome: a case-control study. </w:t>
       </w:r>
       <w:r>
         <w:rPr>
@@ -4834,7 +4834,7 @@
         </w:rPr>
         <w:t>21.</w:t>
         <w:tab/>
-        <w:t xml:space="preserve">Jensen AH, Herlin MK, Trolle B, Vogel I, Lou S. Experiences of vaginal lengthening treatment and sexual well-being in women with Mayer-Rokitansky-Küster-Hauser (MRKH) syndrome: An interview study. </w:t>
+        <w:t xml:space="preserve">Jensen AH, Herlin MK, Trolle B, Vogel I, Lou S. Experiences of vaginal lengthening treatment and sexual well-being in women with Mayer-Rokitansky-Küster-Hauser (MRKH) syndrome: an interview study. </w:t>
       </w:r>
       <w:r>
         <w:rPr>
@@ -4890,7 +4890,7 @@
         </w:rPr>
         <w:t>23.</w:t>
         <w:tab/>
-        <w:t xml:space="preserve">Tsitoura A, Michala L. The sexuality of adolescents and young women with MRKH syndrome: A qualitative study. </w:t>
+        <w:t xml:space="preserve">Tsitoura A, Michala L. The sexuality of adolescents and young women with MRKH syndrome: a qualitative study. </w:t>
       </w:r>
       <w:r>
         <w:rPr>
@@ -4918,14 +4918,14 @@
         </w:rPr>
         <w:t>24.</w:t>
         <w:tab/>
-        <w:t xml:space="preserve">Ngoumou R.-D.. How does the experience of the medical encounter with Mayer-Rokitansky-Küster-Hauser (MRKH) Syndrome impact women in Africa?. </w:t>
+        <w:t xml:space="preserve">Ngoumou RD. How does the experience of the medical encounter with Mayer-Rokitansky-Küster-Hauser (MRKH) syndrome impact women in Africa? </w:t>
       </w:r>
       <w:r>
         <w:rPr>
           <w:b w:val="0"/>
           <w:i/>
         </w:rPr>
-        <w:t>Pan African Medical Journal</w:t>
+        <w:t>Pan Afr Med J</w:t>
       </w:r>
       <w:r>
         <w:rPr>
@@ -4974,7 +4974,7 @@
         </w:rPr>
         <w:t>26.</w:t>
         <w:tab/>
-        <w:t xml:space="preserve">Carroll S, Laufer MR, Thomas-Kowal P, Lossie AC, Moss-Morris R. From engulfment to enrichment: Associations between illness representations, self-concept, and psychological adjustment in Mayer-Rokitansky-Küster-Hauser syndrome. </w:t>
+        <w:t xml:space="preserve">Carroll S, Laufer MR, Thomas-Kowal P, Lossie AC, Moss-Morris R. From engulfment to enrichment: associations between illness representations, self-concept, and psychological adjustment in Mayer-Rokitansky-Küster-Hauser syndrome. </w:t>
       </w:r>
       <w:r>
         <w:rPr>
@@ -5114,7 +5114,7 @@
         </w:rPr>
         <w:t>31.</w:t>
         <w:tab/>
-        <w:t xml:space="preserve">Gilfillan R, Carter P. Issues of identity, perceptions and isolation: An interpretative phenomenological analysis of women's experience of Mayer-Rokitansky-Küster-Hauser (MRKH) syndrome. </w:t>
+        <w:t xml:space="preserve">Gilfillan R, Carter P. Issues of identity, perceptions and isolation: an interpretative phenomenological analysis of women's experience of Mayer-Rokitansky-Küster-Hauser (MRKH) syndrome. </w:t>
       </w:r>
       <w:r>
         <w:rPr>
@@ -5170,7 +5170,7 @@
         </w:rPr>
         <w:t>33.</w:t>
         <w:tab/>
-        <w:t xml:space="preserve">Lou S, Jensen AH, Vogel I, Trolle B, Herlin MK. Understanding the diagnostic odyssey of women with Mayer-Rokitansky-Küster-Hauser (MRKH) syndrome in Denmark: A qualitative interview study. </w:t>
+        <w:t xml:space="preserve">Lou S, Jensen AH, Vogel I, Trolle B, Herlin MK. Understanding the diagnostic odyssey of women with Mayer-Rokitansky-Küster-Hauser (MRKH) syndrome in Denmark: a qualitative interview study. </w:t>
       </w:r>
       <w:r>
         <w:rPr>
@@ -5198,14 +5198,14 @@
         </w:rPr>
         <w:t>34.</w:t>
         <w:tab/>
-        <w:t xml:space="preserve">Järvholm S, Enskog A, Hammarling C, Dahm-Kähler P, Brännström M. Uterus transplantation: Joys and frustrations of becoming a 'complete' woman-a qualitative study regarding self-image in the 5-year period after transplantation. </w:t>
+        <w:t xml:space="preserve">Järvholm S, Enskog A, Hammarling C, Dahm-Kähler P, Brännström M. Uterus transplantation: joys and frustrations of becoming a "complete" woman—a qualitative study regarding self-image in the 5-year period after transplantation. </w:t>
       </w:r>
       <w:r>
         <w:rPr>
           <w:b w:val="0"/>
           <w:i/>
         </w:rPr>
-        <w:t>Human Reproduction</w:t>
+        <w:t>Hum Reprod</w:t>
       </w:r>
       <w:r>
         <w:rPr>
@@ -5226,7 +5226,7 @@
         </w:rPr>
         <w:t>35.</w:t>
         <w:tab/>
-        <w:t xml:space="preserve">Khairudin KB, Nik Mhd Nor NS, Childs JF, et al. Prevalence of anxiety and depression in women with Mayer-Rokitansky-Kϋster-Hauser (MRKH) syndrome in Malaysia. </w:t>
+        <w:t xml:space="preserve">Khairudin KB, Nik Mhd Nor NS, Childs JF, et al. Prevalence of anxiety and depression in women with Mayer-Rokitansky-Küster-Hauser (MRKH) syndrome in Malaysia. </w:t>
       </w:r>
       <w:r>
         <w:rPr>
@@ -5254,7 +5254,7 @@
         </w:rPr>
         <w:t>36.</w:t>
         <w:tab/>
-        <w:t xml:space="preserve">Lei XH, Wang X, Shao SY, Hua KQ, Zhang Y. Self-esteem, depression, anxiety and sexual function in Mayer-Rokitansky-Küster-Hauser syndrome with neovagina: A case series. </w:t>
+        <w:t xml:space="preserve">Lei XH, Wang X, Shao SY, Hua KQ, Zhang Y. Self-esteem, depression, anxiety and sexual function in Mayer-Rokitansky-Küster-Hauser syndrome with neovagina: a case series. </w:t>
       </w:r>
       <w:r>
         <w:rPr>
@@ -5282,7 +5282,7 @@
         </w:rPr>
         <w:t>37.</w:t>
         <w:tab/>
-        <w:t xml:space="preserve">Sorouri Khorashad B, Kaabi O, Gardner MD, et al. Psychiatric comorbidities in women with complete androgen insensitivity syndrome or Müllerian duct aplasia/Agenesis. </w:t>
+        <w:t xml:space="preserve">Sorouri Khorashad B, Kaabi O, Gardner MD, et al. Psychiatric comorbidities in women with complete androgen insensitivity syndrome or Müllerian duct aplasia/agenesis. </w:t>
       </w:r>
       <w:r>
         <w:rPr>
@@ -5338,7 +5338,7 @@
         </w:rPr>
         <w:t>39.</w:t>
         <w:tab/>
-        <w:t xml:space="preserve">Jha S, Singh S. Sexual and psychosocial outcome after neovaginoplasty using Interceed in females with Mayer-Rokitansky-Küster-Hauser syndrome: A case-control study. </w:t>
+        <w:t xml:space="preserve">Jha S, Singh S. Sexual and psychosocial outcome after neovaginoplasty using Interceed in females with Mayer-Rokitansky-Küster-Hauser syndrome: a case-control study. </w:t>
       </w:r>
       <w:r>
         <w:rPr>
@@ -5366,14 +5366,14 @@
         </w:rPr>
         <w:t>40.</w:t>
         <w:tab/>
-        <w:t xml:space="preserve">Scollo P, Pecorino B, La Spina S, Veroux P, Giaquinta A, Scibilia G. Psychological and personality assessment in patients candidates for Uterus Transplantation from deceased donor: preliminary results. </w:t>
+        <w:t xml:space="preserve">Scollo P, Pecorino B, La Spina S, Veroux P, Giaquinta A, Scibilia G. Psychological and personality assessment in patients candidates for uterus transplantation from deceased donor: preliminary results. </w:t>
       </w:r>
       <w:r>
         <w:rPr>
           <w:b w:val="0"/>
           <w:i/>
         </w:rPr>
-        <w:t>Italian Journal of Gynaecology and Obstetrics</w:t>
+        <w:t>Ital J Gynaecol Obstet</w:t>
       </w:r>
       <w:r>
         <w:rPr>
@@ -5422,7 +5422,7 @@
         </w:rPr>
         <w:t>42.</w:t>
         <w:tab/>
-        <w:t xml:space="preserve">Güner P, Ulukaya T. From avoidance to empowerment: Coping strategies in women with Müllerian agenesis (MRKH) after McIndoe reconstruction: A descriptive phenomenological study. </w:t>
+        <w:t xml:space="preserve">Güner P, Ulukaya T. From avoidance to empowerment: coping strategies in women with Müllerian agenesis (MRKH) after McIndoe reconstruction: a descriptive phenomenological study. </w:t>
       </w:r>
       <w:r>
         <w:rPr>
@@ -5534,7 +5534,7 @@
         </w:rPr>
         <w:t>46.</w:t>
         <w:tab/>
-        <w:t xml:space="preserve">Marshall N, Rajesh Z, Hunker K, et al. "Don't give up, advocate for yourself": A pilot study examining healthcare experiences of people with Mayer Rokitansky Küster Hauser syndrome. </w:t>
+        <w:t xml:space="preserve">Marshall N, Rajesh Z, Hunker K, et al. "Don't give up, advocate for yourself": a pilot study examining healthcare experiences of people with Mayer Rokitansky Küster Hauser syndrome. </w:t>
       </w:r>
       <w:r>
         <w:rPr>
@@ -5562,7 +5562,7 @@
         </w:rPr>
         <w:t>47.</w:t>
         <w:tab/>
-        <w:t xml:space="preserve">Di Mattei VE, Taranto P, Perego G, et al. Illness experience and (unmet) needs of women with Mayer-Rokitansky-Küster-Hauser Syndrome (MRKH): a qualitative analysis of an online forum. </w:t>
+        <w:t xml:space="preserve">Di Mattei VE, Taranto P, Perego G, et al. Illness experience and (unmet) needs of women with Mayer-Rokitansky-Küster-Hauser syndrome (MRKH): a qualitative analysis of an online forum. </w:t>
       </w:r>
       <w:r>
         <w:rPr>
@@ -5590,7 +5590,7 @@
         </w:rPr>
         <w:t>48.</w:t>
         <w:tab/>
-        <w:t xml:space="preserve">Pennesi CM, Berkeley J, Lossie AC, Quint EH, Zieman KD, Carroll S. International experiences with vaginal lengthening treatment among individuals with Müllerian agenesis: A mixed-methods study. </w:t>
+        <w:t xml:space="preserve">Pennesi CM, Berkeley J, Lossie AC, Quint EH, Zieman KD, Carroll S. International experiences with vaginal lengthening treatment among individuals with Müllerian agenesis: a mixed-methods study. </w:t>
       </w:r>
       <w:r>
         <w:rPr>
@@ -5660,15 +5660,7 @@
           <w:b w:val="0"/>
           <w:i w:val="0"/>
         </w:rPr>
-        <w:t xml:space="preserve">. 2026;52(5). doi:10.1111/jog.70291 </w:t>
-      </w:r>
-      <w:r>
-        <w:rPr>
-          <w:b w:val="0"/>
-          <w:i w:val="0"/>
-          <w:highlight w:val="yellow"/>
-        </w:rPr>
-        <w:t>[add article number]</w:t>
+        <w:t>. 2026;52(5):e70291. doi:10.1111/jog.70291</w:t>
       </w:r>
     </w:p>
     <w:p>

</xml_diff>

<commit_message>
Limitations: grey literature, small single-center samples, abstract-only studies; AI use stays disclosed in Methods
Co-Authored-By: Claude Opus 5.5 <noreply@anthropic.com>
Claude-Session: https://claude.ai/code/session_01N468nYR7vy45HpujgUezn5
</commit_message>
<xml_diff>
--- a/manuscript/MRKH_Scoping_Review_Manuscript.docx
+++ b/manuscript/MRKH_Scoping_Review_Manuscript.docx
@@ -142,7 +142,7 @@
           <w:b w:val="0"/>
           <w:i w:val="0"/>
         </w:rPr>
-        <w:t xml:space="preserve"> 2,566   </w:t>
+        <w:t xml:space="preserve"> 2,575   </w:t>
       </w:r>
       <w:r>
         <w:rPr>
@@ -4068,15 +4068,7 @@
           <w:b w:val="0"/>
           <w:i w:val="0"/>
         </w:rPr>
-        <w:t xml:space="preserve">. Two Danish reports and two Chinese reports appear to share samples. In addition, the review was limited to 2019–2026, date limits were applied inconsistently across database interfaces and enforced at screening, designs and measures were heterogeneous, and other studies may also share samples. Consistent with scoping methodology, study quality was not appraised, and counts reflect how often outcomes were studied, not their prevalence. </w:t>
-      </w:r>
-      <w:r>
-        <w:rPr>
-          <w:b w:val="0"/>
-          <w:i w:val="0"/>
-          <w:highlight w:val="yellow"/>
-        </w:rPr>
-        <w:t>[Add, if applicable: grey literature not searched.]</w:t>
+        <w:t>. Two Danish reports and two Chinese reports appear to share samples. In addition, the review was limited to 2019–2026, date limits were applied inconsistently across database interfaces and enforced at screening, designs and measures were heterogeneous, and other studies may also share samples. Consistent with scoping methodology, study quality was not appraised, and counts reflect how often outcomes were studied, not their prevalence. Grey literature was not searched, and many included studies had small, single-center samples, which limits generalizability.</w:t>
       </w:r>
     </w:p>
     <w:p>

</xml_diff>

<commit_message>
Abstract (poster and manuscript) aligned with poster results and conclusion
Co-Authored-By: Claude Opus 5.5 <noreply@anthropic.com>
Claude-Session: https://claude.ai/code/session_01N468nYR7vy45HpujgUezn5
</commit_message>
<xml_diff>
--- a/manuscript/MRKH_Scoping_Review_Manuscript.docx
+++ b/manuscript/MRKH_Scoping_Review_Manuscript.docx
@@ -277,7 +277,7 @@
           <w:b w:val="0"/>
           <w:i w:val="0"/>
         </w:rPr>
-        <w:t xml:space="preserve"> Of 516 records identified (324 after deduplication), 35 studies were included. Psychosexual and relational challenges were the most frequently reported outcomes (n = 24; 69%), followed by reduced quality of life, body image, and self-esteem (n = 19; 54%), broader psychological distress (n = 20; 57%), and depression and anxiety (n = 14; 40%). Coping mechanisms were documented in 15 studies, mostly peer support and self-management, and healthcare system gaps in 10. Studies came mainly from Europe (n = 14) and Asia (n = 14).</w:t>
+        <w:t xml:space="preserve"> Of 516 records identified (324 after deduplication), 35 studies were included. Psychosexual and relational challenges were the most frequently reported outcomes (n = 24; 69%), followed by reduced quality of life, body image, and self-esteem (n = 19; 54%), broader psychological distress (n = 20; 57%), and depression and anxiety (n = 14; 40%). Coping mechanisms were documented in 15 studies, most often peer support (7) and avoidance or concealment (6), and healthcare system gaps in 10. Studies came mainly from Europe (n = 14) and Asia (n = 14).</w:t>
       </w:r>
     </w:p>
     <w:p>
@@ -293,7 +293,7 @@
           <w:b w:val="0"/>
           <w:i w:val="0"/>
         </w:rPr>
-        <w:t xml:space="preserve"> MRKH-related psychosocial burden is substantial yet under-integrated into care models. Multidisciplinary, mental health–inclusive care and greater research investment, particularly in underrepresented and low-resource settings, are urgently needed.</w:t>
+        <w:t xml:space="preserve"> MRKH affects far more than reproductive anatomy, yet its psychosocial burden remains under-integrated into care. Mental health screening, psychosexual counseling, and peer support should become standard in multidisciplinary MRKH care, and research must reach underrepresented and low-resource settings.</w:t>
       </w:r>
     </w:p>
     <w:p>

</xml_diff>

<commit_message>
Final check: add not-reported design to poster Results; resolve manuscript placeholders that need no author input
Co-Authored-By: Claude Opus 5.5 <noreply@anthropic.com>
Claude-Session: https://claude.ai/code/session_01N468nYR7vy45HpujgUezn5
</commit_message>
<xml_diff>
--- a/manuscript/MRKH_Scoping_Review_Manuscript.docx
+++ b/manuscript/MRKH_Scoping_Review_Manuscript.docx
@@ -142,7 +142,7 @@
           <w:b w:val="0"/>
           <w:i w:val="0"/>
         </w:rPr>
-        <w:t xml:space="preserve"> 2,575   </w:t>
+        <w:t xml:space="preserve"> 2,554   </w:t>
       </w:r>
       <w:r>
         <w:rPr>
@@ -812,22 +812,7 @@
           <w:b w:val="0"/>
           <w:i w:val="0"/>
         </w:rPr>
-        <w:t xml:space="preserve">. Records that could not be classified from the exported title and abstract were assessed for eligibility using the published abstract; studies with mixed samples were included only if results were reported separately for participants with MRKH or at least 80% of participants had MRKH. Full texts were then obtained for 30 of the 35 included studies and checked against the same criteria; at this stage one study of adults with differences of sex development was excluded because only 2 of its 15 participants had MRKH and their findings were not analyzed separately. </w:t>
-      </w:r>
-      <w:r>
-        <w:rPr>
-          <w:b w:val="0"/>
-          <w:i w:val="0"/>
-          <w:highlight w:val="yellow"/>
-        </w:rPr>
-        <w:t>[The full texts of the remaining 5 studies could not be obtained; their inclusion rests on the published abstract or title.]</w:t>
-      </w:r>
-      <w:r>
-        <w:rPr>
-          <w:b w:val="0"/>
-          <w:i w:val="0"/>
-        </w:rPr>
-        <w:t xml:space="preserve"> The screening workbook, with a decision and reason for every record, is available as supplementary material.</w:t>
+        <w:t>. Records that could not be classified from the exported title and abstract were assessed for eligibility using the published abstract; studies with mixed samples were included only if results were reported separately for participants with MRKH or at least 80% of participants had MRKH. Full texts were then obtained for 30 of the 35 included studies and checked against the same criteria; at this stage one study of adults with differences of sex development was excluded because only 2 of its 15 participants had MRKH and their findings were not analyzed separately. The full texts of the remaining 5 studies could not be obtained; their inclusion rests on the published abstract or title. The screening workbook, with a decision and reason for every record, is available as supplementary material.</w:t>
       </w:r>
     </w:p>
     <w:p>
@@ -851,22 +836,7 @@
           <w:b w:val="0"/>
           <w:i w:val="0"/>
         </w:rPr>
-        <w:t xml:space="preserve">For each included study, data were charted on author, year, country, study design, sample size, reported mental health and psychosocial outcomes, coping mechanisms, and healthcare system gaps. Charted items were checked against the full text for 30 of 35 studies; the remaining 5 were charted from the title and abstract </w:t>
-      </w:r>
-      <w:r>
-        <w:rPr>
-          <w:b w:val="0"/>
-          <w:i w:val="0"/>
-          <w:highlight w:val="yellow"/>
-        </w:rPr>
-        <w:t>[and should be checked when their full texts are obtained]</w:t>
-      </w:r>
-      <w:r>
-        <w:rPr>
-          <w:b w:val="0"/>
-          <w:i w:val="0"/>
-        </w:rPr>
-        <w:t>. Outcomes were coded into four domains—depression and anxiety; quality of life, body image, and self-esteem; psychosexual and relational challenges; and broader psychological distress—and coping mechanisms into seven categories.</w:t>
+        <w:t>For each included study, data were charted on author, year, country, study design, sample size, reported mental health and psychosocial outcomes, coping mechanisms, and healthcare system gaps. Charted items were checked against the full text for 30 of 35 studies; the remaining 5 were charted from the title and abstract. Outcomes were coded into four domains—depression and anxiety; quality of life, body image, and self-esteem; psychosexual and relational challenges; and broader psychological distress—and coping mechanisms into seven categories.</w:t>
       </w:r>
     </w:p>
     <w:p>
@@ -4053,22 +4023,7 @@
           <w:b w:val="0"/>
           <w:i w:val="0"/>
         </w:rPr>
-        <w:t xml:space="preserve">Strengths include an established methodological framework, PRISMA-ScR reporting, a search of biomedical, nursing, psychological, and women's studies databases, and inclusion of quantitative, qualitative, and mixed-methods evidence. The most important limitation is that the original screening records were lost and selection was repeated from the original exports with AI-assisted screening and charting. Charting was checked against the full text for 30 of the 35 included studies, but the remaining 5 rest on abstracts or titles, and </w:t>
-      </w:r>
-      <w:r>
-        <w:rPr>
-          <w:b w:val="0"/>
-          <w:i w:val="0"/>
-          <w:highlight w:val="yellow"/>
-        </w:rPr>
-        <w:t>[reviewer verification of all decisions is still required]</w:t>
-      </w:r>
-      <w:r>
-        <w:rPr>
-          <w:b w:val="0"/>
-          <w:i w:val="0"/>
-        </w:rPr>
-        <w:t>. Two Danish reports and two Chinese reports appear to share samples. In addition, the review was limited to 2019–2026, date limits were applied inconsistently across database interfaces and enforced at screening, designs and measures were heterogeneous, and other studies may also share samples. Consistent with scoping methodology, study quality was not appraised, and counts reflect how often outcomes were studied, not their prevalence. Grey literature was not searched, and many included studies had small, single-center samples, which limits generalizability.</w:t>
+        <w:t>Strengths include an established methodological framework, PRISMA-ScR reporting, a search of biomedical, nursing, psychological, and women's studies databases, and inclusion of quantitative, qualitative, and mixed-methods evidence. The most important limitation is that the original screening records were lost and selection was repeated from the original exports with AI-assisted screening and charting. Charting was checked against the full text for 30 of the 35 included studies, but the remaining 5 rest on abstracts or titles. Two Danish reports and two Chinese reports appear to share samples. In addition, the review was limited to 2019–2026, date limits were applied inconsistently across database interfaces and enforced at screening, designs and measures were heterogeneous, and other studies may also share samples. Consistent with scoping methodology, study quality was not appraised, and counts reflect how often outcomes were studied, not their prevalence. Grey literature was not searched, and many included studies had small, single-center samples, which limits generalizability.</w:t>
       </w:r>
     </w:p>
     <w:p>
@@ -11234,16 +11189,7 @@
                 <w:i w:val="0"/>
                 <w:sz w:val="20"/>
               </w:rPr>
-              <w:t xml:space="preserve">Methods: Study Design </w:t>
-            </w:r>
-            <w:r>
-              <w:rPr>
-                <w:b w:val="0"/>
-                <w:i w:val="0"/>
-                <w:sz w:val="20"/>
-                <w:highlight w:val="yellow"/>
-              </w:rPr>
-              <w:t>[complete]</w:t>
+              <w:t>Methods: Study Design (protocol not registered)</w:t>
             </w:r>
           </w:p>
         </w:tc>
@@ -11420,16 +11366,7 @@
                 <w:i w:val="0"/>
                 <w:sz w:val="20"/>
               </w:rPr>
-              <w:t xml:space="preserve">Appendix A </w:t>
-            </w:r>
-            <w:r>
-              <w:rPr>
-                <w:b w:val="0"/>
-                <w:i w:val="0"/>
-                <w:sz w:val="20"/>
-                <w:highlight w:val="yellow"/>
-              </w:rPr>
-              <w:t>[complete]</w:t>
+              <w:t>Methods: Information Sources; Appendix A</w:t>
             </w:r>
           </w:p>
         </w:tc>

</xml_diff>